<commit_message>
Added role based auth
</commit_message>
<xml_diff>
--- a/SpringBoot Journal Application.docx
+++ b/SpringBoot Journal Application.docx
@@ -36798,7 +36798,6 @@
           <w:color w:val="000000"/>
           <w:sz w:val="20"/>
           <w:szCs w:val="20"/>
-          <w:bdr w:val="none" w:color="auto" w:sz="0" w:space="0"/>
           <w:shd w:val="clear" w:fill="FFFFFF"/>
         </w:rPr>
       </w:pPr>
@@ -36810,7 +36809,6 @@
           <w:color w:val="7F0055"/>
           <w:sz w:val="20"/>
           <w:szCs w:val="20"/>
-          <w:bdr w:val="none" w:color="auto" w:sz="0" w:space="0"/>
           <w:shd w:val="clear" w:fill="FFFFFF"/>
         </w:rPr>
         <w:t>public</w:t>
@@ -36821,7 +36819,6 @@
           <w:color w:val="000000"/>
           <w:sz w:val="20"/>
           <w:szCs w:val="20"/>
-          <w:bdr w:val="none" w:color="auto" w:sz="0" w:space="0"/>
           <w:shd w:val="clear" w:fill="FFFFFF"/>
         </w:rPr>
         <w:t xml:space="preserve"> Optional&lt;JournalEntry&gt; findById(ObjectId </w:t>
@@ -36832,7 +36829,6 @@
           <w:color w:val="6A3E3E"/>
           <w:sz w:val="20"/>
           <w:szCs w:val="20"/>
-          <w:bdr w:val="none" w:color="auto" w:sz="0" w:space="0"/>
           <w:shd w:val="clear" w:fill="FFFFFF"/>
         </w:rPr>
         <w:t>id</w:t>
@@ -36843,7 +36839,6 @@
           <w:color w:val="000000"/>
           <w:sz w:val="20"/>
           <w:szCs w:val="20"/>
-          <w:bdr w:val="none" w:color="auto" w:sz="0" w:space="0"/>
           <w:shd w:val="clear" w:fill="FFFFFF"/>
         </w:rPr>
         <w:t xml:space="preserve">, String </w:t>
@@ -36854,7 +36849,6 @@
           <w:color w:val="6A3E3E"/>
           <w:sz w:val="20"/>
           <w:szCs w:val="20"/>
-          <w:bdr w:val="none" w:color="auto" w:sz="0" w:space="0"/>
           <w:shd w:val="clear" w:fill="FFFFFF"/>
         </w:rPr>
         <w:t>username</w:t>
@@ -36865,7 +36859,6 @@
           <w:color w:val="000000"/>
           <w:sz w:val="20"/>
           <w:szCs w:val="20"/>
-          <w:bdr w:val="none" w:color="auto" w:sz="0" w:space="0"/>
           <w:shd w:val="clear" w:fill="FFFFFF"/>
         </w:rPr>
         <w:t>) {</w:t>
@@ -42713,8 +42706,6 @@
         <w:spacing w:before="0" w:beforeAutospacing="0" w:after="0" w:afterAutospacing="0"/>
         <w:ind w:left="0" w:right="0" w:firstLine="200" w:firstLineChars="100"/>
       </w:pPr>
-      <w:bookmarkStart w:id="0" w:name="_GoBack"/>
-      <w:bookmarkEnd w:id="0"/>
       <w:r>
         <w:rPr>
           <w:rFonts w:hint="default" w:ascii="Consolas" w:hAnsi="Consolas" w:eastAsia="Consolas" w:cs="Consolas"/>
@@ -42787,13 +42778,28 @@
         <w:jc w:val="left"/>
         <w:rPr>
           <w:rFonts w:hint="default" w:ascii="Consolas" w:hAnsi="Consolas" w:eastAsia="Consolas" w:cs="Consolas"/>
-          <w:color w:val="000000"/>
-          <w:sz w:val="20"/>
-          <w:szCs w:val="20"/>
-          <w:shd w:val="clear" w:fill="FFFFFF"/>
-          <w:lang w:val="en-US"/>
-        </w:rPr>
-      </w:pPr>
+          <w:b/>
+          <w:bCs/>
+          <w:color w:val="1F4E79" w:themeColor="accent1" w:themeShade="80"/>
+          <w:sz w:val="40"/>
+          <w:szCs w:val="40"/>
+          <w:shd w:val="clear" w:fill="FFFFFF"/>
+          <w:lang w:val="en-IN"/>
+        </w:rPr>
+      </w:pPr>
+      <w:r>
+        <w:rPr>
+          <w:rFonts w:hint="default" w:ascii="Consolas" w:hAnsi="Consolas" w:eastAsia="Consolas" w:cs="Consolas"/>
+          <w:b/>
+          <w:bCs/>
+          <w:color w:val="1F4E79" w:themeColor="accent1" w:themeShade="80"/>
+          <w:sz w:val="40"/>
+          <w:szCs w:val="40"/>
+          <w:shd w:val="clear" w:fill="FFFFFF"/>
+          <w:lang w:val="en-IN"/>
+        </w:rPr>
+        <w:t>Adding ADMIN ACCESS</w:t>
+      </w:r>
     </w:p>
     <w:p>
       <w:pPr>
@@ -42815,7 +42821,2606 @@
           <w:sz w:val="20"/>
           <w:szCs w:val="20"/>
           <w:shd w:val="clear" w:fill="FFFFFF"/>
-          <w:lang w:val="en-US"/>
+          <w:lang w:val="en-IN"/>
+        </w:rPr>
+      </w:pPr>
+      <w:r>
+        <w:rPr>
+          <w:rFonts w:hint="default" w:ascii="Consolas" w:hAnsi="Consolas" w:eastAsia="Consolas" w:cs="Consolas"/>
+          <w:color w:val="000000"/>
+          <w:sz w:val="20"/>
+          <w:szCs w:val="20"/>
+          <w:shd w:val="clear" w:fill="FFFFFF"/>
+          <w:lang w:val="en-IN"/>
+        </w:rPr>
+        <w:t xml:space="preserve">Adding admin access is nothing but the play of API, Service and Controller. Some service like find all users are easy to implement like </w:t>
+      </w:r>
+    </w:p>
+    <w:p>
+      <w:pPr>
+        <w:pStyle w:val="5"/>
+        <w:keepNext w:val="0"/>
+        <w:keepLines w:val="0"/>
+        <w:widowControl/>
+        <w:suppressLineNumbers w:val="0"/>
+        <w:spacing w:before="0" w:beforeAutospacing="0" w:after="0" w:afterAutospacing="0"/>
+        <w:ind w:left="0" w:right="0"/>
+        <w:rPr>
+          <w:rFonts w:ascii="Consolas" w:hAnsi="Consolas" w:eastAsia="Consolas" w:cs="Consolas"/>
+          <w:b/>
+          <w:bCs/>
+          <w:color w:val="7F0055"/>
+          <w:sz w:val="20"/>
+          <w:szCs w:val="20"/>
+          <w:shd w:val="clear" w:fill="FFFFFF"/>
+        </w:rPr>
+      </w:pPr>
+    </w:p>
+    <w:p>
+      <w:pPr>
+        <w:pStyle w:val="5"/>
+        <w:keepNext w:val="0"/>
+        <w:keepLines w:val="0"/>
+        <w:widowControl/>
+        <w:suppressLineNumbers w:val="0"/>
+        <w:spacing w:before="0" w:beforeAutospacing="0" w:after="0" w:afterAutospacing="0"/>
+        <w:ind w:left="0" w:right="0"/>
+      </w:pPr>
+      <w:r>
+        <w:rPr>
+          <w:rFonts w:ascii="Consolas" w:hAnsi="Consolas" w:eastAsia="Consolas" w:cs="Consolas"/>
+          <w:b/>
+          <w:bCs/>
+          <w:color w:val="7F0055"/>
+          <w:sz w:val="20"/>
+          <w:szCs w:val="20"/>
+          <w:shd w:val="clear" w:fill="FFFFFF"/>
+        </w:rPr>
+        <w:t>public</w:t>
+      </w:r>
+      <w:r>
+        <w:rPr>
+          <w:rFonts w:hint="default" w:ascii="Consolas" w:hAnsi="Consolas" w:eastAsia="Consolas" w:cs="Consolas"/>
+          <w:color w:val="000000"/>
+          <w:sz w:val="20"/>
+          <w:szCs w:val="20"/>
+          <w:shd w:val="clear" w:fill="FFFFFF"/>
+        </w:rPr>
+        <w:t xml:space="preserve"> </w:t>
+      </w:r>
+      <w:r>
+        <w:rPr>
+          <w:rFonts w:hint="default" w:ascii="Consolas" w:hAnsi="Consolas" w:eastAsia="Consolas" w:cs="Consolas"/>
+          <w:color w:val="000000"/>
+          <w:sz w:val="20"/>
+          <w:szCs w:val="20"/>
+          <w:shd w:val="clear" w:fill="D4D4D4"/>
+        </w:rPr>
+        <w:t>List&lt;User&gt;</w:t>
+      </w:r>
+      <w:r>
+        <w:rPr>
+          <w:rFonts w:hint="default" w:ascii="Consolas" w:hAnsi="Consolas" w:eastAsia="Consolas" w:cs="Consolas"/>
+          <w:color w:val="000000"/>
+          <w:sz w:val="20"/>
+          <w:szCs w:val="20"/>
+          <w:shd w:val="clear" w:fill="FFFFFF"/>
+        </w:rPr>
+        <w:t xml:space="preserve"> findUsers() {</w:t>
+      </w:r>
+    </w:p>
+    <w:p>
+      <w:pPr>
+        <w:pStyle w:val="5"/>
+        <w:keepNext w:val="0"/>
+        <w:keepLines w:val="0"/>
+        <w:widowControl/>
+        <w:suppressLineNumbers w:val="0"/>
+        <w:spacing w:before="0" w:beforeAutospacing="0" w:after="0" w:afterAutospacing="0"/>
+        <w:ind w:left="0" w:right="0" w:firstLine="400" w:firstLineChars="200"/>
+      </w:pPr>
+      <w:r>
+        <w:rPr>
+          <w:rFonts w:hint="default" w:ascii="Consolas" w:hAnsi="Consolas" w:eastAsia="Consolas" w:cs="Consolas"/>
+          <w:b/>
+          <w:bCs/>
+          <w:color w:val="7F0055"/>
+          <w:sz w:val="20"/>
+          <w:szCs w:val="20"/>
+          <w:shd w:val="clear" w:fill="D4D4D4"/>
+        </w:rPr>
+        <w:t>return</w:t>
+      </w:r>
+      <w:r>
+        <w:rPr>
+          <w:rFonts w:hint="default" w:ascii="Consolas" w:hAnsi="Consolas" w:eastAsia="Consolas" w:cs="Consolas"/>
+          <w:color w:val="000000"/>
+          <w:sz w:val="20"/>
+          <w:szCs w:val="20"/>
+          <w:shd w:val="clear" w:fill="D4D4D4"/>
+        </w:rPr>
+        <w:t xml:space="preserve"> </w:t>
+      </w:r>
+      <w:r>
+        <w:rPr>
+          <w:rFonts w:hint="default" w:ascii="Consolas" w:hAnsi="Consolas" w:eastAsia="Consolas" w:cs="Consolas"/>
+          <w:color w:val="0000C0"/>
+          <w:sz w:val="20"/>
+          <w:szCs w:val="20"/>
+          <w:shd w:val="clear" w:fill="D4D4D4"/>
+        </w:rPr>
+        <w:t>userRepository</w:t>
+      </w:r>
+      <w:r>
+        <w:rPr>
+          <w:rFonts w:hint="default" w:ascii="Consolas" w:hAnsi="Consolas" w:eastAsia="Consolas" w:cs="Consolas"/>
+          <w:color w:val="000000"/>
+          <w:sz w:val="20"/>
+          <w:szCs w:val="20"/>
+          <w:shd w:val="clear" w:fill="D4D4D4"/>
+        </w:rPr>
+        <w:t>.findAll();</w:t>
+      </w:r>
+    </w:p>
+    <w:p>
+      <w:pPr>
+        <w:pStyle w:val="5"/>
+        <w:keepNext w:val="0"/>
+        <w:keepLines w:val="0"/>
+        <w:widowControl/>
+        <w:suppressLineNumbers w:val="0"/>
+        <w:spacing w:before="0" w:beforeAutospacing="0" w:after="0" w:afterAutospacing="0"/>
+        <w:ind w:left="0" w:right="0"/>
+        <w:rPr>
+          <w:rFonts w:hint="default" w:ascii="Consolas" w:hAnsi="Consolas" w:eastAsia="Consolas" w:cs="Consolas"/>
+          <w:color w:val="000000"/>
+          <w:sz w:val="20"/>
+          <w:szCs w:val="20"/>
+          <w:shd w:val="clear" w:fill="FFFFFF"/>
+        </w:rPr>
+      </w:pPr>
+      <w:r>
+        <w:rPr>
+          <w:rFonts w:hint="default" w:ascii="Consolas" w:hAnsi="Consolas" w:eastAsia="Consolas" w:cs="Consolas"/>
+          <w:color w:val="000000"/>
+          <w:sz w:val="20"/>
+          <w:szCs w:val="20"/>
+          <w:shd w:val="clear" w:fill="FFFFFF"/>
+        </w:rPr>
+        <w:t>}</w:t>
+      </w:r>
+    </w:p>
+    <w:p>
+      <w:pPr>
+        <w:pStyle w:val="5"/>
+        <w:keepNext w:val="0"/>
+        <w:keepLines w:val="0"/>
+        <w:widowControl/>
+        <w:suppressLineNumbers w:val="0"/>
+        <w:spacing w:before="0" w:beforeAutospacing="0" w:after="0" w:afterAutospacing="0"/>
+        <w:ind w:left="0" w:right="0"/>
+        <w:rPr>
+          <w:rFonts w:hint="default" w:ascii="Consolas" w:hAnsi="Consolas" w:eastAsia="Consolas" w:cs="Consolas"/>
+          <w:color w:val="000000"/>
+          <w:sz w:val="20"/>
+          <w:szCs w:val="20"/>
+          <w:shd w:val="clear" w:fill="FFFFFF"/>
+        </w:rPr>
+      </w:pPr>
+    </w:p>
+    <w:p>
+      <w:pPr>
+        <w:pStyle w:val="5"/>
+        <w:keepNext w:val="0"/>
+        <w:keepLines w:val="0"/>
+        <w:widowControl/>
+        <w:suppressLineNumbers w:val="0"/>
+        <w:spacing w:before="0" w:beforeAutospacing="0" w:after="0" w:afterAutospacing="0"/>
+        <w:ind w:left="0" w:right="0"/>
+        <w:rPr>
+          <w:rFonts w:hint="default" w:ascii="Consolas" w:hAnsi="Consolas" w:eastAsia="Consolas" w:cs="Consolas"/>
+          <w:color w:val="000000"/>
+          <w:sz w:val="20"/>
+          <w:szCs w:val="20"/>
+          <w:shd w:val="clear" w:fill="FFFFFF"/>
+          <w:lang w:val="en-IN"/>
+        </w:rPr>
+      </w:pPr>
+      <w:r>
+        <w:rPr>
+          <w:rFonts w:hint="default" w:ascii="Consolas" w:hAnsi="Consolas" w:eastAsia="Consolas" w:cs="Consolas"/>
+          <w:color w:val="000000"/>
+          <w:sz w:val="20"/>
+          <w:szCs w:val="20"/>
+          <w:shd w:val="clear" w:fill="FFFFFF"/>
+          <w:lang w:val="en-IN"/>
+        </w:rPr>
+        <w:t>We can also create a service for admin creation where ADMIN role should be mentioned like :</w:t>
+      </w:r>
+    </w:p>
+    <w:p>
+      <w:pPr>
+        <w:pStyle w:val="5"/>
+        <w:keepNext w:val="0"/>
+        <w:keepLines w:val="0"/>
+        <w:widowControl/>
+        <w:suppressLineNumbers w:val="0"/>
+        <w:spacing w:before="0" w:beforeAutospacing="0" w:after="0" w:afterAutospacing="0"/>
+        <w:ind w:left="0" w:right="0"/>
+      </w:pPr>
+      <w:r>
+        <w:rPr>
+          <w:rFonts w:ascii="Consolas" w:hAnsi="Consolas" w:eastAsia="Consolas" w:cs="Consolas"/>
+          <w:b/>
+          <w:bCs/>
+          <w:color w:val="7F0055"/>
+          <w:sz w:val="20"/>
+          <w:szCs w:val="20"/>
+          <w:shd w:val="clear" w:fill="FFFFFF"/>
+        </w:rPr>
+        <w:t>public</w:t>
+      </w:r>
+      <w:r>
+        <w:rPr>
+          <w:rFonts w:hint="default" w:ascii="Consolas" w:hAnsi="Consolas" w:eastAsia="Consolas" w:cs="Consolas"/>
+          <w:color w:val="000000"/>
+          <w:sz w:val="20"/>
+          <w:szCs w:val="20"/>
+          <w:shd w:val="clear" w:fill="FFFFFF"/>
+        </w:rPr>
+        <w:t xml:space="preserve"> </w:t>
+      </w:r>
+      <w:r>
+        <w:rPr>
+          <w:rFonts w:hint="default" w:ascii="Consolas" w:hAnsi="Consolas" w:eastAsia="Consolas" w:cs="Consolas"/>
+          <w:b/>
+          <w:bCs/>
+          <w:color w:val="7F0055"/>
+          <w:sz w:val="20"/>
+          <w:szCs w:val="20"/>
+          <w:shd w:val="clear" w:fill="FFFFFF"/>
+        </w:rPr>
+        <w:t>void</w:t>
+      </w:r>
+      <w:r>
+        <w:rPr>
+          <w:rFonts w:hint="default" w:ascii="Consolas" w:hAnsi="Consolas" w:eastAsia="Consolas" w:cs="Consolas"/>
+          <w:color w:val="000000"/>
+          <w:sz w:val="20"/>
+          <w:szCs w:val="20"/>
+          <w:shd w:val="clear" w:fill="FFFFFF"/>
+        </w:rPr>
+        <w:t xml:space="preserve"> saveAdminUser(User </w:t>
+      </w:r>
+      <w:r>
+        <w:rPr>
+          <w:rFonts w:hint="default" w:ascii="Consolas" w:hAnsi="Consolas" w:eastAsia="Consolas" w:cs="Consolas"/>
+          <w:color w:val="6A3E3E"/>
+          <w:sz w:val="20"/>
+          <w:szCs w:val="20"/>
+          <w:shd w:val="clear" w:fill="FFFFFF"/>
+        </w:rPr>
+        <w:t>user</w:t>
+      </w:r>
+      <w:r>
+        <w:rPr>
+          <w:rFonts w:hint="default" w:ascii="Consolas" w:hAnsi="Consolas" w:eastAsia="Consolas" w:cs="Consolas"/>
+          <w:color w:val="000000"/>
+          <w:sz w:val="20"/>
+          <w:szCs w:val="20"/>
+          <w:shd w:val="clear" w:fill="FFFFFF"/>
+        </w:rPr>
+        <w:t>) {</w:t>
+      </w:r>
+    </w:p>
+    <w:p>
+      <w:pPr>
+        <w:pStyle w:val="5"/>
+        <w:keepNext w:val="0"/>
+        <w:keepLines w:val="0"/>
+        <w:widowControl/>
+        <w:suppressLineNumbers w:val="0"/>
+        <w:spacing w:before="0" w:beforeAutospacing="0" w:after="0" w:afterAutospacing="0"/>
+        <w:ind w:left="0" w:right="0" w:firstLine="300" w:firstLineChars="150"/>
+      </w:pPr>
+      <w:r>
+        <w:rPr>
+          <w:rFonts w:hint="default" w:ascii="Consolas" w:hAnsi="Consolas" w:eastAsia="Consolas" w:cs="Consolas"/>
+          <w:color w:val="6A3E3E"/>
+          <w:sz w:val="20"/>
+          <w:szCs w:val="20"/>
+          <w:shd w:val="clear" w:fill="FFFFFF"/>
+        </w:rPr>
+        <w:t>user</w:t>
+      </w:r>
+      <w:r>
+        <w:rPr>
+          <w:rFonts w:hint="default" w:ascii="Consolas" w:hAnsi="Consolas" w:eastAsia="Consolas" w:cs="Consolas"/>
+          <w:color w:val="000000"/>
+          <w:sz w:val="20"/>
+          <w:szCs w:val="20"/>
+          <w:shd w:val="clear" w:fill="FFFFFF"/>
+        </w:rPr>
+        <w:t>.setPassword(</w:t>
+      </w:r>
+      <w:r>
+        <w:rPr>
+          <w:rFonts w:hint="default" w:ascii="Consolas" w:hAnsi="Consolas" w:eastAsia="Consolas" w:cs="Consolas"/>
+          <w:b/>
+          <w:bCs/>
+          <w:i/>
+          <w:iCs/>
+          <w:color w:val="0000C0"/>
+          <w:sz w:val="20"/>
+          <w:szCs w:val="20"/>
+          <w:shd w:val="clear" w:fill="FFFFFF"/>
+        </w:rPr>
+        <w:t>passwordEncoder</w:t>
+      </w:r>
+      <w:r>
+        <w:rPr>
+          <w:rFonts w:hint="default" w:ascii="Consolas" w:hAnsi="Consolas" w:eastAsia="Consolas" w:cs="Consolas"/>
+          <w:color w:val="000000"/>
+          <w:sz w:val="20"/>
+          <w:szCs w:val="20"/>
+          <w:shd w:val="clear" w:fill="FFFFFF"/>
+        </w:rPr>
+        <w:t>.encode(</w:t>
+      </w:r>
+      <w:r>
+        <w:rPr>
+          <w:rFonts w:hint="default" w:ascii="Consolas" w:hAnsi="Consolas" w:eastAsia="Consolas" w:cs="Consolas"/>
+          <w:color w:val="6A3E3E"/>
+          <w:sz w:val="20"/>
+          <w:szCs w:val="20"/>
+          <w:shd w:val="clear" w:fill="FFFFFF"/>
+        </w:rPr>
+        <w:t>user</w:t>
+      </w:r>
+      <w:r>
+        <w:rPr>
+          <w:rFonts w:hint="default" w:ascii="Consolas" w:hAnsi="Consolas" w:eastAsia="Consolas" w:cs="Consolas"/>
+          <w:color w:val="000000"/>
+          <w:sz w:val="20"/>
+          <w:szCs w:val="20"/>
+          <w:shd w:val="clear" w:fill="FFFFFF"/>
+        </w:rPr>
+        <w:t>.getPassword()));</w:t>
+      </w:r>
+    </w:p>
+    <w:p>
+      <w:pPr>
+        <w:pStyle w:val="5"/>
+        <w:keepNext w:val="0"/>
+        <w:keepLines w:val="0"/>
+        <w:widowControl/>
+        <w:suppressLineNumbers w:val="0"/>
+        <w:spacing w:before="0" w:beforeAutospacing="0" w:after="0" w:afterAutospacing="0"/>
+        <w:ind w:left="0" w:right="0" w:firstLine="300" w:firstLineChars="150"/>
+      </w:pPr>
+      <w:r>
+        <w:rPr>
+          <w:rFonts w:hint="default" w:ascii="Consolas" w:hAnsi="Consolas" w:eastAsia="Consolas" w:cs="Consolas"/>
+          <w:color w:val="6A3E3E"/>
+          <w:sz w:val="20"/>
+          <w:szCs w:val="20"/>
+          <w:shd w:val="clear" w:fill="FFFFFF"/>
+        </w:rPr>
+        <w:t>user</w:t>
+      </w:r>
+      <w:r>
+        <w:rPr>
+          <w:rFonts w:hint="default" w:ascii="Consolas" w:hAnsi="Consolas" w:eastAsia="Consolas" w:cs="Consolas"/>
+          <w:color w:val="000000"/>
+          <w:sz w:val="20"/>
+          <w:szCs w:val="20"/>
+          <w:shd w:val="clear" w:fill="FFFFFF"/>
+        </w:rPr>
+        <w:t>.setRoles(Arrays.</w:t>
+      </w:r>
+      <w:r>
+        <w:rPr>
+          <w:rFonts w:hint="default" w:ascii="Consolas" w:hAnsi="Consolas" w:eastAsia="Consolas" w:cs="Consolas"/>
+          <w:i/>
+          <w:iCs/>
+          <w:color w:val="000000"/>
+          <w:sz w:val="20"/>
+          <w:szCs w:val="20"/>
+          <w:shd w:val="clear" w:fill="FFFFFF"/>
+        </w:rPr>
+        <w:t>asList</w:t>
+      </w:r>
+      <w:r>
+        <w:rPr>
+          <w:rFonts w:hint="default" w:ascii="Consolas" w:hAnsi="Consolas" w:eastAsia="Consolas" w:cs="Consolas"/>
+          <w:color w:val="000000"/>
+          <w:sz w:val="20"/>
+          <w:szCs w:val="20"/>
+          <w:shd w:val="clear" w:fill="FFFFFF"/>
+        </w:rPr>
+        <w:t>(</w:t>
+      </w:r>
+      <w:r>
+        <w:rPr>
+          <w:rFonts w:hint="default" w:ascii="Consolas" w:hAnsi="Consolas" w:eastAsia="Consolas" w:cs="Consolas"/>
+          <w:color w:val="2A00FF"/>
+          <w:sz w:val="20"/>
+          <w:szCs w:val="20"/>
+          <w:shd w:val="clear" w:fill="FFFFFF"/>
+        </w:rPr>
+        <w:t>"USER"</w:t>
+      </w:r>
+      <w:r>
+        <w:rPr>
+          <w:rFonts w:hint="default" w:ascii="Consolas" w:hAnsi="Consolas" w:eastAsia="Consolas" w:cs="Consolas"/>
+          <w:color w:val="000000"/>
+          <w:sz w:val="20"/>
+          <w:szCs w:val="20"/>
+          <w:shd w:val="clear" w:fill="FFFFFF"/>
+        </w:rPr>
+        <w:t>,</w:t>
+      </w:r>
+      <w:r>
+        <w:rPr>
+          <w:rFonts w:hint="default" w:ascii="Consolas" w:hAnsi="Consolas" w:eastAsia="Consolas" w:cs="Consolas"/>
+          <w:color w:val="2A00FF"/>
+          <w:sz w:val="20"/>
+          <w:szCs w:val="20"/>
+          <w:shd w:val="clear" w:fill="FFFFFF"/>
+        </w:rPr>
+        <w:t>"ADMIN"</w:t>
+      </w:r>
+      <w:r>
+        <w:rPr>
+          <w:rFonts w:hint="default" w:ascii="Consolas" w:hAnsi="Consolas" w:eastAsia="Consolas" w:cs="Consolas"/>
+          <w:color w:val="000000"/>
+          <w:sz w:val="20"/>
+          <w:szCs w:val="20"/>
+          <w:shd w:val="clear" w:fill="FFFFFF"/>
+        </w:rPr>
+        <w:t>));</w:t>
+      </w:r>
+    </w:p>
+    <w:p>
+      <w:pPr>
+        <w:pStyle w:val="5"/>
+        <w:keepNext w:val="0"/>
+        <w:keepLines w:val="0"/>
+        <w:widowControl/>
+        <w:suppressLineNumbers w:val="0"/>
+        <w:spacing w:before="0" w:beforeAutospacing="0" w:after="0" w:afterAutospacing="0"/>
+        <w:ind w:left="0" w:right="0" w:firstLine="300" w:firstLineChars="150"/>
+      </w:pPr>
+      <w:r>
+        <w:rPr>
+          <w:rFonts w:hint="default" w:ascii="Consolas" w:hAnsi="Consolas" w:eastAsia="Consolas" w:cs="Consolas"/>
+          <w:color w:val="0000C0"/>
+          <w:sz w:val="20"/>
+          <w:szCs w:val="20"/>
+          <w:shd w:val="clear" w:fill="FFFFFF"/>
+        </w:rPr>
+        <w:t>userRepository</w:t>
+      </w:r>
+      <w:r>
+        <w:rPr>
+          <w:rFonts w:hint="default" w:ascii="Consolas" w:hAnsi="Consolas" w:eastAsia="Consolas" w:cs="Consolas"/>
+          <w:color w:val="000000"/>
+          <w:sz w:val="20"/>
+          <w:szCs w:val="20"/>
+          <w:shd w:val="clear" w:fill="FFFFFF"/>
+        </w:rPr>
+        <w:t>.save(</w:t>
+      </w:r>
+      <w:r>
+        <w:rPr>
+          <w:rFonts w:hint="default" w:ascii="Consolas" w:hAnsi="Consolas" w:eastAsia="Consolas" w:cs="Consolas"/>
+          <w:color w:val="6A3E3E"/>
+          <w:sz w:val="20"/>
+          <w:szCs w:val="20"/>
+          <w:shd w:val="clear" w:fill="FFFFFF"/>
+        </w:rPr>
+        <w:t>user</w:t>
+      </w:r>
+      <w:r>
+        <w:rPr>
+          <w:rFonts w:hint="default" w:ascii="Consolas" w:hAnsi="Consolas" w:eastAsia="Consolas" w:cs="Consolas"/>
+          <w:color w:val="000000"/>
+          <w:sz w:val="20"/>
+          <w:szCs w:val="20"/>
+          <w:shd w:val="clear" w:fill="FFFFFF"/>
+        </w:rPr>
+        <w:t xml:space="preserve">); </w:t>
+      </w:r>
+    </w:p>
+    <w:p>
+      <w:pPr>
+        <w:pStyle w:val="5"/>
+        <w:keepNext w:val="0"/>
+        <w:keepLines w:val="0"/>
+        <w:widowControl/>
+        <w:suppressLineNumbers w:val="0"/>
+        <w:spacing w:before="0" w:beforeAutospacing="0" w:after="0" w:afterAutospacing="0"/>
+        <w:ind w:left="0" w:right="0"/>
+      </w:pPr>
+      <w:r>
+        <w:rPr>
+          <w:rFonts w:hint="default" w:ascii="Consolas" w:hAnsi="Consolas" w:eastAsia="Consolas" w:cs="Consolas"/>
+          <w:color w:val="000000"/>
+          <w:sz w:val="20"/>
+          <w:szCs w:val="20"/>
+          <w:shd w:val="clear" w:fill="FFFFFF"/>
+        </w:rPr>
+        <w:t>}</w:t>
+      </w:r>
+    </w:p>
+    <w:p>
+      <w:pPr>
+        <w:pStyle w:val="5"/>
+        <w:keepNext w:val="0"/>
+        <w:keepLines w:val="0"/>
+        <w:widowControl/>
+        <w:suppressLineNumbers w:val="0"/>
+        <w:spacing w:before="0" w:beforeAutospacing="0" w:after="0" w:afterAutospacing="0"/>
+        <w:ind w:left="0" w:right="0"/>
+        <w:rPr>
+          <w:rFonts w:hint="default" w:ascii="Consolas" w:hAnsi="Consolas" w:eastAsia="Consolas" w:cs="Consolas"/>
+          <w:color w:val="000000"/>
+          <w:sz w:val="20"/>
+          <w:szCs w:val="20"/>
+          <w:shd w:val="clear" w:fill="FFFFFF"/>
+          <w:lang w:val="en-IN"/>
+        </w:rPr>
+      </w:pPr>
+      <w:r>
+        <w:rPr>
+          <w:rFonts w:hint="default" w:ascii="Consolas" w:hAnsi="Consolas" w:eastAsia="Consolas" w:cs="Consolas"/>
+          <w:color w:val="000000"/>
+          <w:sz w:val="20"/>
+          <w:szCs w:val="20"/>
+          <w:shd w:val="clear" w:fill="FFFFFF"/>
+          <w:lang w:val="en-IN"/>
+        </w:rPr>
+        <w:t xml:space="preserve">Only thing left is use controller to call these services </w:t>
+      </w:r>
+    </w:p>
+    <w:p>
+      <w:pPr>
+        <w:pStyle w:val="5"/>
+        <w:keepNext w:val="0"/>
+        <w:keepLines w:val="0"/>
+        <w:widowControl/>
+        <w:suppressLineNumbers w:val="0"/>
+        <w:spacing w:before="0" w:beforeAutospacing="0" w:after="0" w:afterAutospacing="0"/>
+        <w:ind w:left="0" w:right="0"/>
+        <w:rPr>
+          <w:rFonts w:hint="default" w:ascii="Consolas" w:hAnsi="Consolas" w:eastAsia="Consolas" w:cs="Consolas"/>
+          <w:color w:val="000000"/>
+          <w:sz w:val="20"/>
+          <w:szCs w:val="20"/>
+          <w:shd w:val="clear" w:fill="FFFFFF"/>
+          <w:lang w:val="en-IN"/>
+        </w:rPr>
+      </w:pPr>
+    </w:p>
+    <w:p>
+      <w:pPr>
+        <w:pStyle w:val="5"/>
+        <w:keepNext w:val="0"/>
+        <w:keepLines w:val="0"/>
+        <w:widowControl/>
+        <w:suppressLineNumbers w:val="0"/>
+        <w:spacing w:before="0" w:beforeAutospacing="0" w:after="0" w:afterAutospacing="0"/>
+        <w:ind w:left="0" w:right="0"/>
+      </w:pPr>
+      <w:r>
+        <w:rPr>
+          <w:rFonts w:ascii="Consolas" w:hAnsi="Consolas" w:eastAsia="Consolas" w:cs="Consolas"/>
+          <w:color w:val="646464"/>
+          <w:sz w:val="20"/>
+          <w:szCs w:val="20"/>
+          <w:shd w:val="clear" w:fill="FFFFFF"/>
+        </w:rPr>
+        <w:t>@RestController</w:t>
+      </w:r>
+    </w:p>
+    <w:p>
+      <w:pPr>
+        <w:pStyle w:val="5"/>
+        <w:keepNext w:val="0"/>
+        <w:keepLines w:val="0"/>
+        <w:widowControl/>
+        <w:suppressLineNumbers w:val="0"/>
+        <w:spacing w:before="0" w:beforeAutospacing="0" w:after="0" w:afterAutospacing="0"/>
+        <w:ind w:left="0" w:right="0"/>
+      </w:pPr>
+      <w:r>
+        <w:rPr>
+          <w:rFonts w:hint="default" w:ascii="Consolas" w:hAnsi="Consolas" w:eastAsia="Consolas" w:cs="Consolas"/>
+          <w:color w:val="646464"/>
+          <w:sz w:val="20"/>
+          <w:szCs w:val="20"/>
+          <w:shd w:val="clear" w:fill="FFFFFF"/>
+        </w:rPr>
+        <w:t>@RequestMapping</w:t>
+      </w:r>
+      <w:r>
+        <w:rPr>
+          <w:rFonts w:hint="default" w:ascii="Consolas" w:hAnsi="Consolas" w:eastAsia="Consolas" w:cs="Consolas"/>
+          <w:color w:val="000000"/>
+          <w:sz w:val="20"/>
+          <w:szCs w:val="20"/>
+          <w:shd w:val="clear" w:fill="FFFFFF"/>
+        </w:rPr>
+        <w:t>(</w:t>
+      </w:r>
+      <w:r>
+        <w:rPr>
+          <w:rFonts w:hint="default" w:ascii="Consolas" w:hAnsi="Consolas" w:eastAsia="Consolas" w:cs="Consolas"/>
+          <w:color w:val="2A00FF"/>
+          <w:sz w:val="20"/>
+          <w:szCs w:val="20"/>
+          <w:shd w:val="clear" w:fill="FFFFFF"/>
+        </w:rPr>
+        <w:t>"admin"</w:t>
+      </w:r>
+      <w:r>
+        <w:rPr>
+          <w:rFonts w:hint="default" w:ascii="Consolas" w:hAnsi="Consolas" w:eastAsia="Consolas" w:cs="Consolas"/>
+          <w:color w:val="000000"/>
+          <w:sz w:val="20"/>
+          <w:szCs w:val="20"/>
+          <w:shd w:val="clear" w:fill="FFFFFF"/>
+        </w:rPr>
+        <w:t>)</w:t>
+      </w:r>
+    </w:p>
+    <w:p>
+      <w:pPr>
+        <w:pStyle w:val="5"/>
+        <w:keepNext w:val="0"/>
+        <w:keepLines w:val="0"/>
+        <w:widowControl/>
+        <w:suppressLineNumbers w:val="0"/>
+        <w:spacing w:before="0" w:beforeAutospacing="0" w:after="0" w:afterAutospacing="0"/>
+        <w:ind w:left="0" w:right="0"/>
+      </w:pPr>
+      <w:r>
+        <w:rPr>
+          <w:rFonts w:hint="default" w:ascii="Consolas" w:hAnsi="Consolas" w:eastAsia="Consolas" w:cs="Consolas"/>
+          <w:color w:val="646464"/>
+          <w:sz w:val="20"/>
+          <w:szCs w:val="20"/>
+          <w:shd w:val="clear" w:fill="FFFFFF"/>
+        </w:rPr>
+        <w:t>@AllArgsConstructor</w:t>
+      </w:r>
+    </w:p>
+    <w:p>
+      <w:pPr>
+        <w:pStyle w:val="5"/>
+        <w:keepNext w:val="0"/>
+        <w:keepLines w:val="0"/>
+        <w:widowControl/>
+        <w:suppressLineNumbers w:val="0"/>
+        <w:spacing w:before="0" w:beforeAutospacing="0" w:after="0" w:afterAutospacing="0"/>
+        <w:ind w:left="0" w:right="0"/>
+      </w:pPr>
+      <w:r>
+        <w:rPr>
+          <w:rFonts w:hint="default" w:ascii="Consolas" w:hAnsi="Consolas" w:eastAsia="Consolas" w:cs="Consolas"/>
+          <w:b/>
+          <w:bCs/>
+          <w:color w:val="7F0055"/>
+          <w:sz w:val="20"/>
+          <w:szCs w:val="20"/>
+          <w:shd w:val="clear" w:fill="FFFFFF"/>
+        </w:rPr>
+        <w:t>public</w:t>
+      </w:r>
+      <w:r>
+        <w:rPr>
+          <w:rFonts w:hint="default" w:ascii="Consolas" w:hAnsi="Consolas" w:eastAsia="Consolas" w:cs="Consolas"/>
+          <w:color w:val="000000"/>
+          <w:sz w:val="20"/>
+          <w:szCs w:val="20"/>
+          <w:shd w:val="clear" w:fill="FFFFFF"/>
+        </w:rPr>
+        <w:t xml:space="preserve"> </w:t>
+      </w:r>
+      <w:r>
+        <w:rPr>
+          <w:rFonts w:hint="default" w:ascii="Consolas" w:hAnsi="Consolas" w:eastAsia="Consolas" w:cs="Consolas"/>
+          <w:b/>
+          <w:bCs/>
+          <w:color w:val="7F0055"/>
+          <w:sz w:val="20"/>
+          <w:szCs w:val="20"/>
+          <w:shd w:val="clear" w:fill="FFFFFF"/>
+        </w:rPr>
+        <w:t>class</w:t>
+      </w:r>
+      <w:r>
+        <w:rPr>
+          <w:rFonts w:hint="default" w:ascii="Consolas" w:hAnsi="Consolas" w:eastAsia="Consolas" w:cs="Consolas"/>
+          <w:color w:val="000000"/>
+          <w:sz w:val="20"/>
+          <w:szCs w:val="20"/>
+          <w:shd w:val="clear" w:fill="FFFFFF"/>
+        </w:rPr>
+        <w:t xml:space="preserve"> AdminController {</w:t>
+      </w:r>
+    </w:p>
+    <w:p>
+      <w:pPr>
+        <w:pStyle w:val="5"/>
+        <w:keepNext w:val="0"/>
+        <w:keepLines w:val="0"/>
+        <w:widowControl/>
+        <w:suppressLineNumbers w:val="0"/>
+        <w:spacing w:before="0" w:beforeAutospacing="0" w:after="0" w:afterAutospacing="0"/>
+        <w:ind w:left="0" w:right="0"/>
+      </w:pPr>
+    </w:p>
+    <w:p>
+      <w:pPr>
+        <w:pStyle w:val="5"/>
+        <w:keepNext w:val="0"/>
+        <w:keepLines w:val="0"/>
+        <w:widowControl/>
+        <w:suppressLineNumbers w:val="0"/>
+        <w:spacing w:before="0" w:beforeAutospacing="0" w:after="0" w:afterAutospacing="0"/>
+        <w:ind w:left="0" w:right="0"/>
+      </w:pPr>
+      <w:r>
+        <w:rPr>
+          <w:rFonts w:hint="default" w:ascii="Consolas" w:hAnsi="Consolas" w:eastAsia="Consolas" w:cs="Consolas"/>
+          <w:b/>
+          <w:bCs/>
+          <w:color w:val="7F0055"/>
+          <w:sz w:val="20"/>
+          <w:szCs w:val="20"/>
+          <w:shd w:val="clear" w:fill="FFFFFF"/>
+        </w:rPr>
+        <w:t>private</w:t>
+      </w:r>
+      <w:r>
+        <w:rPr>
+          <w:rFonts w:hint="default" w:ascii="Consolas" w:hAnsi="Consolas" w:eastAsia="Consolas" w:cs="Consolas"/>
+          <w:color w:val="000000"/>
+          <w:sz w:val="20"/>
+          <w:szCs w:val="20"/>
+          <w:shd w:val="clear" w:fill="FFFFFF"/>
+        </w:rPr>
+        <w:t xml:space="preserve"> UserService </w:t>
+      </w:r>
+      <w:r>
+        <w:rPr>
+          <w:rFonts w:hint="default" w:ascii="Consolas" w:hAnsi="Consolas" w:eastAsia="Consolas" w:cs="Consolas"/>
+          <w:color w:val="0000C0"/>
+          <w:sz w:val="20"/>
+          <w:szCs w:val="20"/>
+          <w:shd w:val="clear" w:fill="FFFFFF"/>
+        </w:rPr>
+        <w:t>userService</w:t>
+      </w:r>
+      <w:r>
+        <w:rPr>
+          <w:rFonts w:hint="default" w:ascii="Consolas" w:hAnsi="Consolas" w:eastAsia="Consolas" w:cs="Consolas"/>
+          <w:color w:val="000000"/>
+          <w:sz w:val="20"/>
+          <w:szCs w:val="20"/>
+          <w:shd w:val="clear" w:fill="FFFFFF"/>
+        </w:rPr>
+        <w:t>;</w:t>
+      </w:r>
+    </w:p>
+    <w:p>
+      <w:pPr>
+        <w:pStyle w:val="5"/>
+        <w:keepNext w:val="0"/>
+        <w:keepLines w:val="0"/>
+        <w:widowControl/>
+        <w:suppressLineNumbers w:val="0"/>
+        <w:spacing w:before="0" w:beforeAutospacing="0" w:after="0" w:afterAutospacing="0"/>
+        <w:ind w:left="0" w:right="0"/>
+      </w:pPr>
+    </w:p>
+    <w:p>
+      <w:pPr>
+        <w:pStyle w:val="5"/>
+        <w:keepNext w:val="0"/>
+        <w:keepLines w:val="0"/>
+        <w:widowControl/>
+        <w:suppressLineNumbers w:val="0"/>
+        <w:spacing w:before="0" w:beforeAutospacing="0" w:after="0" w:afterAutospacing="0"/>
+        <w:ind w:left="0" w:right="0"/>
+      </w:pPr>
+      <w:r>
+        <w:rPr>
+          <w:rFonts w:hint="default" w:ascii="Consolas" w:hAnsi="Consolas" w:eastAsia="Consolas" w:cs="Consolas"/>
+          <w:color w:val="646464"/>
+          <w:sz w:val="20"/>
+          <w:szCs w:val="20"/>
+          <w:shd w:val="clear" w:fill="FFFFFF"/>
+        </w:rPr>
+        <w:t>@PostMapping</w:t>
+      </w:r>
+      <w:r>
+        <w:rPr>
+          <w:rFonts w:hint="default" w:ascii="Consolas" w:hAnsi="Consolas" w:eastAsia="Consolas" w:cs="Consolas"/>
+          <w:color w:val="000000"/>
+          <w:sz w:val="20"/>
+          <w:szCs w:val="20"/>
+          <w:shd w:val="clear" w:fill="FFFFFF"/>
+        </w:rPr>
+        <w:t>(</w:t>
+      </w:r>
+      <w:r>
+        <w:rPr>
+          <w:rFonts w:hint="default" w:ascii="Consolas" w:hAnsi="Consolas" w:eastAsia="Consolas" w:cs="Consolas"/>
+          <w:color w:val="2A00FF"/>
+          <w:sz w:val="20"/>
+          <w:szCs w:val="20"/>
+          <w:shd w:val="clear" w:fill="FFFFFF"/>
+        </w:rPr>
+        <w:t>"/create-admin-user"</w:t>
+      </w:r>
+      <w:r>
+        <w:rPr>
+          <w:rFonts w:hint="default" w:ascii="Consolas" w:hAnsi="Consolas" w:eastAsia="Consolas" w:cs="Consolas"/>
+          <w:color w:val="000000"/>
+          <w:sz w:val="20"/>
+          <w:szCs w:val="20"/>
+          <w:shd w:val="clear" w:fill="FFFFFF"/>
+        </w:rPr>
+        <w:t>)</w:t>
+      </w:r>
+    </w:p>
+    <w:p>
+      <w:pPr>
+        <w:pStyle w:val="5"/>
+        <w:keepNext w:val="0"/>
+        <w:keepLines w:val="0"/>
+        <w:widowControl/>
+        <w:suppressLineNumbers w:val="0"/>
+        <w:spacing w:before="0" w:beforeAutospacing="0" w:after="0" w:afterAutospacing="0"/>
+        <w:ind w:left="0" w:right="0"/>
+      </w:pPr>
+      <w:r>
+        <w:rPr>
+          <w:rFonts w:hint="default" w:ascii="Consolas" w:hAnsi="Consolas" w:eastAsia="Consolas" w:cs="Consolas"/>
+          <w:b/>
+          <w:bCs/>
+          <w:color w:val="7F0055"/>
+          <w:sz w:val="20"/>
+          <w:szCs w:val="20"/>
+          <w:shd w:val="clear" w:fill="FFFFFF"/>
+        </w:rPr>
+        <w:t>public</w:t>
+      </w:r>
+      <w:r>
+        <w:rPr>
+          <w:rFonts w:hint="default" w:ascii="Consolas" w:hAnsi="Consolas" w:eastAsia="Consolas" w:cs="Consolas"/>
+          <w:color w:val="000000"/>
+          <w:sz w:val="20"/>
+          <w:szCs w:val="20"/>
+          <w:shd w:val="clear" w:fill="FFFFFF"/>
+        </w:rPr>
+        <w:t xml:space="preserve"> ResponseEntity&lt;?&gt; createAdmin(</w:t>
+      </w:r>
+      <w:r>
+        <w:rPr>
+          <w:rFonts w:hint="default" w:ascii="Consolas" w:hAnsi="Consolas" w:eastAsia="Consolas" w:cs="Consolas"/>
+          <w:color w:val="646464"/>
+          <w:sz w:val="20"/>
+          <w:szCs w:val="20"/>
+          <w:shd w:val="clear" w:fill="FFFFFF"/>
+        </w:rPr>
+        <w:t>@RequestBody</w:t>
+      </w:r>
+      <w:r>
+        <w:rPr>
+          <w:rFonts w:hint="default" w:ascii="Consolas" w:hAnsi="Consolas" w:eastAsia="Consolas" w:cs="Consolas"/>
+          <w:color w:val="000000"/>
+          <w:sz w:val="20"/>
+          <w:szCs w:val="20"/>
+          <w:shd w:val="clear" w:fill="FFFFFF"/>
+        </w:rPr>
+        <w:t xml:space="preserve"> User </w:t>
+      </w:r>
+      <w:r>
+        <w:rPr>
+          <w:rFonts w:hint="default" w:ascii="Consolas" w:hAnsi="Consolas" w:eastAsia="Consolas" w:cs="Consolas"/>
+          <w:color w:val="6A3E3E"/>
+          <w:sz w:val="20"/>
+          <w:szCs w:val="20"/>
+          <w:shd w:val="clear" w:fill="FFFFFF"/>
+        </w:rPr>
+        <w:t>user</w:t>
+      </w:r>
+      <w:r>
+        <w:rPr>
+          <w:rFonts w:hint="default" w:ascii="Consolas" w:hAnsi="Consolas" w:eastAsia="Consolas" w:cs="Consolas"/>
+          <w:color w:val="000000"/>
+          <w:sz w:val="20"/>
+          <w:szCs w:val="20"/>
+          <w:shd w:val="clear" w:fill="FFFFFF"/>
+        </w:rPr>
+        <w:t>) {</w:t>
+      </w:r>
+    </w:p>
+    <w:p>
+      <w:pPr>
+        <w:pStyle w:val="5"/>
+        <w:keepNext w:val="0"/>
+        <w:keepLines w:val="0"/>
+        <w:widowControl/>
+        <w:suppressLineNumbers w:val="0"/>
+        <w:spacing w:before="0" w:beforeAutospacing="0" w:after="0" w:afterAutospacing="0"/>
+        <w:ind w:left="0" w:right="0" w:firstLine="300" w:firstLineChars="150"/>
+      </w:pPr>
+      <w:r>
+        <w:rPr>
+          <w:rFonts w:hint="default" w:ascii="Consolas" w:hAnsi="Consolas" w:eastAsia="Consolas" w:cs="Consolas"/>
+          <w:b/>
+          <w:bCs/>
+          <w:color w:val="7F0055"/>
+          <w:sz w:val="20"/>
+          <w:szCs w:val="20"/>
+          <w:shd w:val="clear" w:fill="FFFFFF"/>
+        </w:rPr>
+        <w:t>try</w:t>
+      </w:r>
+      <w:r>
+        <w:rPr>
+          <w:rFonts w:hint="default" w:ascii="Consolas" w:hAnsi="Consolas" w:eastAsia="Consolas" w:cs="Consolas"/>
+          <w:color w:val="000000"/>
+          <w:sz w:val="20"/>
+          <w:szCs w:val="20"/>
+          <w:shd w:val="clear" w:fill="FFFFFF"/>
+        </w:rPr>
+        <w:t xml:space="preserve"> {</w:t>
+      </w:r>
+    </w:p>
+    <w:p>
+      <w:pPr>
+        <w:pStyle w:val="5"/>
+        <w:keepNext w:val="0"/>
+        <w:keepLines w:val="0"/>
+        <w:widowControl/>
+        <w:suppressLineNumbers w:val="0"/>
+        <w:spacing w:before="0" w:beforeAutospacing="0" w:after="0" w:afterAutospacing="0"/>
+        <w:ind w:left="0" w:right="0" w:firstLine="600" w:firstLineChars="300"/>
+      </w:pPr>
+      <w:r>
+        <w:rPr>
+          <w:rFonts w:hint="default" w:ascii="Consolas" w:hAnsi="Consolas" w:eastAsia="Consolas" w:cs="Consolas"/>
+          <w:color w:val="0000C0"/>
+          <w:sz w:val="20"/>
+          <w:szCs w:val="20"/>
+          <w:shd w:val="clear" w:fill="FFFFFF"/>
+        </w:rPr>
+        <w:t>userService</w:t>
+      </w:r>
+      <w:r>
+        <w:rPr>
+          <w:rFonts w:hint="default" w:ascii="Consolas" w:hAnsi="Consolas" w:eastAsia="Consolas" w:cs="Consolas"/>
+          <w:color w:val="000000"/>
+          <w:sz w:val="20"/>
+          <w:szCs w:val="20"/>
+          <w:shd w:val="clear" w:fill="FFFFFF"/>
+        </w:rPr>
+        <w:t>.saveAdminUser(</w:t>
+      </w:r>
+      <w:r>
+        <w:rPr>
+          <w:rFonts w:hint="default" w:ascii="Consolas" w:hAnsi="Consolas" w:eastAsia="Consolas" w:cs="Consolas"/>
+          <w:color w:val="6A3E3E"/>
+          <w:sz w:val="20"/>
+          <w:szCs w:val="20"/>
+          <w:shd w:val="clear" w:fill="FFFFFF"/>
+        </w:rPr>
+        <w:t>user</w:t>
+      </w:r>
+      <w:r>
+        <w:rPr>
+          <w:rFonts w:hint="default" w:ascii="Consolas" w:hAnsi="Consolas" w:eastAsia="Consolas" w:cs="Consolas"/>
+          <w:color w:val="000000"/>
+          <w:sz w:val="20"/>
+          <w:szCs w:val="20"/>
+          <w:shd w:val="clear" w:fill="FFFFFF"/>
+        </w:rPr>
+        <w:t>);</w:t>
+      </w:r>
+    </w:p>
+    <w:p>
+      <w:pPr>
+        <w:pStyle w:val="5"/>
+        <w:keepNext w:val="0"/>
+        <w:keepLines w:val="0"/>
+        <w:widowControl/>
+        <w:suppressLineNumbers w:val="0"/>
+        <w:spacing w:before="0" w:beforeAutospacing="0" w:after="0" w:afterAutospacing="0"/>
+        <w:ind w:left="0" w:right="0" w:firstLine="600" w:firstLineChars="300"/>
+      </w:pPr>
+      <w:r>
+        <w:rPr>
+          <w:rFonts w:hint="default" w:ascii="Consolas" w:hAnsi="Consolas" w:eastAsia="Consolas" w:cs="Consolas"/>
+          <w:b/>
+          <w:bCs/>
+          <w:color w:val="7F0055"/>
+          <w:sz w:val="20"/>
+          <w:szCs w:val="20"/>
+          <w:shd w:val="clear" w:fill="FFFFFF"/>
+        </w:rPr>
+        <w:t>return</w:t>
+      </w:r>
+      <w:r>
+        <w:rPr>
+          <w:rFonts w:hint="default" w:ascii="Consolas" w:hAnsi="Consolas" w:eastAsia="Consolas" w:cs="Consolas"/>
+          <w:color w:val="000000"/>
+          <w:sz w:val="20"/>
+          <w:szCs w:val="20"/>
+          <w:shd w:val="clear" w:fill="FFFFFF"/>
+        </w:rPr>
+        <w:t xml:space="preserve"> </w:t>
+      </w:r>
+      <w:r>
+        <w:rPr>
+          <w:rFonts w:hint="default" w:ascii="Consolas" w:hAnsi="Consolas" w:eastAsia="Consolas" w:cs="Consolas"/>
+          <w:b/>
+          <w:bCs/>
+          <w:color w:val="7F0055"/>
+          <w:sz w:val="20"/>
+          <w:szCs w:val="20"/>
+          <w:shd w:val="clear" w:fill="FFFFFF"/>
+        </w:rPr>
+        <w:t>new</w:t>
+      </w:r>
+      <w:r>
+        <w:rPr>
+          <w:rFonts w:hint="default" w:ascii="Consolas" w:hAnsi="Consolas" w:eastAsia="Consolas" w:cs="Consolas"/>
+          <w:color w:val="000000"/>
+          <w:sz w:val="20"/>
+          <w:szCs w:val="20"/>
+          <w:shd w:val="clear" w:fill="FFFFFF"/>
+        </w:rPr>
+        <w:t xml:space="preserve"> ResponseEntity&lt;&gt;(HttpStatus.</w:t>
+      </w:r>
+      <w:r>
+        <w:rPr>
+          <w:rFonts w:hint="default" w:ascii="Consolas" w:hAnsi="Consolas" w:eastAsia="Consolas" w:cs="Consolas"/>
+          <w:b/>
+          <w:bCs/>
+          <w:i/>
+          <w:iCs/>
+          <w:color w:val="0000C0"/>
+          <w:sz w:val="20"/>
+          <w:szCs w:val="20"/>
+          <w:shd w:val="clear" w:fill="FFFFFF"/>
+        </w:rPr>
+        <w:t>CREATED</w:t>
+      </w:r>
+      <w:r>
+        <w:rPr>
+          <w:rFonts w:hint="default" w:ascii="Consolas" w:hAnsi="Consolas" w:eastAsia="Consolas" w:cs="Consolas"/>
+          <w:color w:val="000000"/>
+          <w:sz w:val="20"/>
+          <w:szCs w:val="20"/>
+          <w:shd w:val="clear" w:fill="FFFFFF"/>
+        </w:rPr>
+        <w:t>);</w:t>
+      </w:r>
+    </w:p>
+    <w:p>
+      <w:pPr>
+        <w:pStyle w:val="5"/>
+        <w:keepNext w:val="0"/>
+        <w:keepLines w:val="0"/>
+        <w:widowControl/>
+        <w:suppressLineNumbers w:val="0"/>
+        <w:spacing w:before="0" w:beforeAutospacing="0" w:after="0" w:afterAutospacing="0"/>
+        <w:ind w:left="0" w:right="0" w:firstLine="300" w:firstLineChars="150"/>
+        <w:rPr>
+          <w:rFonts w:hint="default" w:ascii="Consolas" w:hAnsi="Consolas" w:eastAsia="Consolas" w:cs="Consolas"/>
+          <w:color w:val="000000"/>
+          <w:sz w:val="20"/>
+          <w:szCs w:val="20"/>
+          <w:shd w:val="clear" w:fill="FFFFFF"/>
+        </w:rPr>
+      </w:pPr>
+      <w:r>
+        <w:rPr>
+          <w:rFonts w:hint="default" w:ascii="Consolas" w:hAnsi="Consolas" w:eastAsia="Consolas" w:cs="Consolas"/>
+          <w:color w:val="000000"/>
+          <w:sz w:val="20"/>
+          <w:szCs w:val="20"/>
+          <w:shd w:val="clear" w:fill="FFFFFF"/>
+        </w:rPr>
+        <w:t xml:space="preserve">} </w:t>
+      </w:r>
+    </w:p>
+    <w:p>
+      <w:pPr>
+        <w:pStyle w:val="5"/>
+        <w:keepNext w:val="0"/>
+        <w:keepLines w:val="0"/>
+        <w:widowControl/>
+        <w:suppressLineNumbers w:val="0"/>
+        <w:spacing w:before="0" w:beforeAutospacing="0" w:after="0" w:afterAutospacing="0"/>
+        <w:ind w:left="0" w:right="0" w:firstLine="300" w:firstLineChars="150"/>
+      </w:pPr>
+      <w:r>
+        <w:rPr>
+          <w:rFonts w:hint="default" w:ascii="Consolas" w:hAnsi="Consolas" w:eastAsia="Consolas" w:cs="Consolas"/>
+          <w:b/>
+          <w:bCs/>
+          <w:color w:val="7F0055"/>
+          <w:sz w:val="20"/>
+          <w:szCs w:val="20"/>
+          <w:shd w:val="clear" w:fill="FFFFFF"/>
+        </w:rPr>
+        <w:t>catch</w:t>
+      </w:r>
+      <w:r>
+        <w:rPr>
+          <w:rFonts w:hint="default" w:ascii="Consolas" w:hAnsi="Consolas" w:eastAsia="Consolas" w:cs="Consolas"/>
+          <w:color w:val="000000"/>
+          <w:sz w:val="20"/>
+          <w:szCs w:val="20"/>
+          <w:shd w:val="clear" w:fill="FFFFFF"/>
+        </w:rPr>
+        <w:t xml:space="preserve"> (Exception </w:t>
+      </w:r>
+      <w:r>
+        <w:rPr>
+          <w:rFonts w:hint="default" w:ascii="Consolas" w:hAnsi="Consolas" w:eastAsia="Consolas" w:cs="Consolas"/>
+          <w:color w:val="6A3E3E"/>
+          <w:sz w:val="20"/>
+          <w:szCs w:val="20"/>
+          <w:shd w:val="clear" w:fill="FFFFFF"/>
+        </w:rPr>
+        <w:t>e</w:t>
+      </w:r>
+      <w:r>
+        <w:rPr>
+          <w:rFonts w:hint="default" w:ascii="Consolas" w:hAnsi="Consolas" w:eastAsia="Consolas" w:cs="Consolas"/>
+          <w:color w:val="000000"/>
+          <w:sz w:val="20"/>
+          <w:szCs w:val="20"/>
+          <w:shd w:val="clear" w:fill="FFFFFF"/>
+        </w:rPr>
+        <w:t>) {</w:t>
+      </w:r>
+    </w:p>
+    <w:p>
+      <w:pPr>
+        <w:pStyle w:val="5"/>
+        <w:keepNext w:val="0"/>
+        <w:keepLines w:val="0"/>
+        <w:widowControl/>
+        <w:suppressLineNumbers w:val="0"/>
+        <w:spacing w:before="0" w:beforeAutospacing="0" w:after="0" w:afterAutospacing="0"/>
+        <w:ind w:left="0" w:right="0" w:firstLine="500" w:firstLineChars="250"/>
+      </w:pPr>
+      <w:r>
+        <w:rPr>
+          <w:rFonts w:hint="default" w:ascii="Consolas" w:hAnsi="Consolas" w:eastAsia="Consolas" w:cs="Consolas"/>
+          <w:b/>
+          <w:bCs/>
+          <w:color w:val="7F0055"/>
+          <w:sz w:val="20"/>
+          <w:szCs w:val="20"/>
+          <w:shd w:val="clear" w:fill="FFFFFF"/>
+        </w:rPr>
+        <w:t>return</w:t>
+      </w:r>
+      <w:r>
+        <w:rPr>
+          <w:rFonts w:hint="default" w:ascii="Consolas" w:hAnsi="Consolas" w:eastAsia="Consolas" w:cs="Consolas"/>
+          <w:color w:val="000000"/>
+          <w:sz w:val="20"/>
+          <w:szCs w:val="20"/>
+          <w:shd w:val="clear" w:fill="FFFFFF"/>
+        </w:rPr>
+        <w:t xml:space="preserve"> </w:t>
+      </w:r>
+      <w:r>
+        <w:rPr>
+          <w:rFonts w:hint="default" w:ascii="Consolas" w:hAnsi="Consolas" w:eastAsia="Consolas" w:cs="Consolas"/>
+          <w:b/>
+          <w:bCs/>
+          <w:color w:val="7F0055"/>
+          <w:sz w:val="20"/>
+          <w:szCs w:val="20"/>
+          <w:shd w:val="clear" w:fill="FFFFFF"/>
+        </w:rPr>
+        <w:t>new</w:t>
+      </w:r>
+      <w:r>
+        <w:rPr>
+          <w:rFonts w:hint="default" w:ascii="Consolas" w:hAnsi="Consolas" w:eastAsia="Consolas" w:cs="Consolas"/>
+          <w:color w:val="000000"/>
+          <w:sz w:val="20"/>
+          <w:szCs w:val="20"/>
+          <w:shd w:val="clear" w:fill="FFFFFF"/>
+        </w:rPr>
+        <w:t xml:space="preserve"> ResponseEntity&lt;&gt;(HttpStatus.</w:t>
+      </w:r>
+      <w:r>
+        <w:rPr>
+          <w:rFonts w:hint="default" w:ascii="Consolas" w:hAnsi="Consolas" w:eastAsia="Consolas" w:cs="Consolas"/>
+          <w:b/>
+          <w:bCs/>
+          <w:i/>
+          <w:iCs/>
+          <w:color w:val="0000C0"/>
+          <w:sz w:val="20"/>
+          <w:szCs w:val="20"/>
+          <w:shd w:val="clear" w:fill="FFFFFF"/>
+        </w:rPr>
+        <w:t>FORBIDDEN</w:t>
+      </w:r>
+      <w:r>
+        <w:rPr>
+          <w:rFonts w:hint="default" w:ascii="Consolas" w:hAnsi="Consolas" w:eastAsia="Consolas" w:cs="Consolas"/>
+          <w:color w:val="000000"/>
+          <w:sz w:val="20"/>
+          <w:szCs w:val="20"/>
+          <w:shd w:val="clear" w:fill="FFFFFF"/>
+        </w:rPr>
+        <w:t>);</w:t>
+      </w:r>
+    </w:p>
+    <w:p>
+      <w:pPr>
+        <w:pStyle w:val="5"/>
+        <w:keepNext w:val="0"/>
+        <w:keepLines w:val="0"/>
+        <w:widowControl/>
+        <w:suppressLineNumbers w:val="0"/>
+        <w:spacing w:before="0" w:beforeAutospacing="0" w:after="0" w:afterAutospacing="0"/>
+        <w:ind w:left="0" w:right="0" w:firstLine="300" w:firstLineChars="150"/>
+      </w:pPr>
+      <w:r>
+        <w:rPr>
+          <w:rFonts w:hint="default" w:ascii="Consolas" w:hAnsi="Consolas" w:eastAsia="Consolas" w:cs="Consolas"/>
+          <w:color w:val="000000"/>
+          <w:sz w:val="20"/>
+          <w:szCs w:val="20"/>
+          <w:shd w:val="clear" w:fill="FFFFFF"/>
+        </w:rPr>
+        <w:t>}</w:t>
+      </w:r>
+    </w:p>
+    <w:p>
+      <w:pPr>
+        <w:pStyle w:val="5"/>
+        <w:keepNext w:val="0"/>
+        <w:keepLines w:val="0"/>
+        <w:widowControl/>
+        <w:suppressLineNumbers w:val="0"/>
+        <w:spacing w:before="0" w:beforeAutospacing="0" w:after="0" w:afterAutospacing="0"/>
+        <w:ind w:left="0" w:right="0"/>
+      </w:pPr>
+      <w:r>
+        <w:rPr>
+          <w:rFonts w:hint="default" w:ascii="Consolas" w:hAnsi="Consolas" w:eastAsia="Consolas" w:cs="Consolas"/>
+          <w:color w:val="000000"/>
+          <w:sz w:val="20"/>
+          <w:szCs w:val="20"/>
+          <w:shd w:val="clear" w:fill="FFFFFF"/>
+        </w:rPr>
+        <w:t>}</w:t>
+      </w:r>
+    </w:p>
+    <w:p>
+      <w:pPr>
+        <w:pStyle w:val="5"/>
+        <w:keepNext w:val="0"/>
+        <w:keepLines w:val="0"/>
+        <w:widowControl/>
+        <w:suppressLineNumbers w:val="0"/>
+        <w:spacing w:before="0" w:beforeAutospacing="0" w:after="0" w:afterAutospacing="0"/>
+        <w:ind w:left="0" w:right="0"/>
+      </w:pPr>
+    </w:p>
+    <w:p>
+      <w:pPr>
+        <w:pStyle w:val="5"/>
+        <w:keepNext w:val="0"/>
+        <w:keepLines w:val="0"/>
+        <w:widowControl/>
+        <w:suppressLineNumbers w:val="0"/>
+        <w:spacing w:before="0" w:beforeAutospacing="0" w:after="0" w:afterAutospacing="0"/>
+        <w:ind w:left="0" w:right="0"/>
+      </w:pPr>
+      <w:r>
+        <w:rPr>
+          <w:rFonts w:hint="default" w:ascii="Consolas" w:hAnsi="Consolas" w:eastAsia="Consolas" w:cs="Consolas"/>
+          <w:color w:val="646464"/>
+          <w:sz w:val="20"/>
+          <w:szCs w:val="20"/>
+          <w:shd w:val="clear" w:fill="FFFFFF"/>
+        </w:rPr>
+        <w:t>@GetMapping</w:t>
+      </w:r>
+      <w:r>
+        <w:rPr>
+          <w:rFonts w:hint="default" w:ascii="Consolas" w:hAnsi="Consolas" w:eastAsia="Consolas" w:cs="Consolas"/>
+          <w:color w:val="000000"/>
+          <w:sz w:val="20"/>
+          <w:szCs w:val="20"/>
+          <w:shd w:val="clear" w:fill="FFFFFF"/>
+        </w:rPr>
+        <w:t>(</w:t>
+      </w:r>
+      <w:r>
+        <w:rPr>
+          <w:rFonts w:hint="default" w:ascii="Consolas" w:hAnsi="Consolas" w:eastAsia="Consolas" w:cs="Consolas"/>
+          <w:color w:val="2A00FF"/>
+          <w:sz w:val="20"/>
+          <w:szCs w:val="20"/>
+          <w:shd w:val="clear" w:fill="FFFFFF"/>
+        </w:rPr>
+        <w:t>"/all-users"</w:t>
+      </w:r>
+      <w:r>
+        <w:rPr>
+          <w:rFonts w:hint="default" w:ascii="Consolas" w:hAnsi="Consolas" w:eastAsia="Consolas" w:cs="Consolas"/>
+          <w:color w:val="000000"/>
+          <w:sz w:val="20"/>
+          <w:szCs w:val="20"/>
+          <w:shd w:val="clear" w:fill="FFFFFF"/>
+        </w:rPr>
+        <w:t>)</w:t>
+      </w:r>
+    </w:p>
+    <w:p>
+      <w:pPr>
+        <w:pStyle w:val="5"/>
+        <w:keepNext w:val="0"/>
+        <w:keepLines w:val="0"/>
+        <w:widowControl/>
+        <w:suppressLineNumbers w:val="0"/>
+        <w:spacing w:before="0" w:beforeAutospacing="0" w:after="0" w:afterAutospacing="0"/>
+        <w:ind w:left="0" w:right="0"/>
+      </w:pPr>
+      <w:r>
+        <w:rPr>
+          <w:rFonts w:hint="default" w:ascii="Consolas" w:hAnsi="Consolas" w:eastAsia="Consolas" w:cs="Consolas"/>
+          <w:b/>
+          <w:bCs/>
+          <w:color w:val="7F0055"/>
+          <w:sz w:val="20"/>
+          <w:szCs w:val="20"/>
+          <w:shd w:val="clear" w:fill="FFFFFF"/>
+        </w:rPr>
+        <w:t>public</w:t>
+      </w:r>
+      <w:r>
+        <w:rPr>
+          <w:rFonts w:hint="default" w:ascii="Consolas" w:hAnsi="Consolas" w:eastAsia="Consolas" w:cs="Consolas"/>
+          <w:color w:val="000000"/>
+          <w:sz w:val="20"/>
+          <w:szCs w:val="20"/>
+          <w:shd w:val="clear" w:fill="FFFFFF"/>
+        </w:rPr>
+        <w:t xml:space="preserve"> ResponseEntity&lt;?&gt; getAllUsers() {</w:t>
+      </w:r>
+    </w:p>
+    <w:p>
+      <w:pPr>
+        <w:pStyle w:val="5"/>
+        <w:keepNext w:val="0"/>
+        <w:keepLines w:val="0"/>
+        <w:widowControl/>
+        <w:suppressLineNumbers w:val="0"/>
+        <w:spacing w:before="0" w:beforeAutospacing="0" w:after="0" w:afterAutospacing="0"/>
+        <w:ind w:left="0" w:right="0"/>
+      </w:pPr>
+    </w:p>
+    <w:p>
+      <w:pPr>
+        <w:pStyle w:val="5"/>
+        <w:keepNext w:val="0"/>
+        <w:keepLines w:val="0"/>
+        <w:widowControl/>
+        <w:suppressLineNumbers w:val="0"/>
+        <w:spacing w:before="0" w:beforeAutospacing="0" w:after="0" w:afterAutospacing="0"/>
+        <w:ind w:left="0" w:right="0" w:firstLine="300" w:firstLineChars="150"/>
+      </w:pPr>
+      <w:r>
+        <w:rPr>
+          <w:rFonts w:hint="default" w:ascii="Consolas" w:hAnsi="Consolas" w:eastAsia="Consolas" w:cs="Consolas"/>
+          <w:color w:val="000000"/>
+          <w:sz w:val="20"/>
+          <w:szCs w:val="20"/>
+          <w:shd w:val="clear" w:fill="FFFFFF"/>
+        </w:rPr>
+        <w:t xml:space="preserve">List&lt;User&gt; </w:t>
+      </w:r>
+      <w:r>
+        <w:rPr>
+          <w:rFonts w:hint="default" w:ascii="Consolas" w:hAnsi="Consolas" w:eastAsia="Consolas" w:cs="Consolas"/>
+          <w:color w:val="6A3E3E"/>
+          <w:sz w:val="20"/>
+          <w:szCs w:val="20"/>
+          <w:shd w:val="clear" w:fill="FFFFFF"/>
+        </w:rPr>
+        <w:t>users</w:t>
+      </w:r>
+      <w:r>
+        <w:rPr>
+          <w:rFonts w:hint="default" w:ascii="Consolas" w:hAnsi="Consolas" w:eastAsia="Consolas" w:cs="Consolas"/>
+          <w:color w:val="000000"/>
+          <w:sz w:val="20"/>
+          <w:szCs w:val="20"/>
+          <w:shd w:val="clear" w:fill="FFFFFF"/>
+        </w:rPr>
+        <w:t xml:space="preserve"> = </w:t>
+      </w:r>
+      <w:r>
+        <w:rPr>
+          <w:rFonts w:hint="default" w:ascii="Consolas" w:hAnsi="Consolas" w:eastAsia="Consolas" w:cs="Consolas"/>
+          <w:color w:val="0000C0"/>
+          <w:sz w:val="20"/>
+          <w:szCs w:val="20"/>
+          <w:shd w:val="clear" w:fill="FFFFFF"/>
+        </w:rPr>
+        <w:t>userService</w:t>
+      </w:r>
+      <w:r>
+        <w:rPr>
+          <w:rFonts w:hint="default" w:ascii="Consolas" w:hAnsi="Consolas" w:eastAsia="Consolas" w:cs="Consolas"/>
+          <w:color w:val="000000"/>
+          <w:sz w:val="20"/>
+          <w:szCs w:val="20"/>
+          <w:shd w:val="clear" w:fill="FFFFFF"/>
+        </w:rPr>
+        <w:t>.</w:t>
+      </w:r>
+      <w:r>
+        <w:rPr>
+          <w:rFonts w:hint="default" w:ascii="Consolas" w:hAnsi="Consolas" w:eastAsia="Consolas" w:cs="Consolas"/>
+          <w:color w:val="000000"/>
+          <w:sz w:val="20"/>
+          <w:szCs w:val="20"/>
+          <w:shd w:val="clear" w:fill="D4D4D4"/>
+        </w:rPr>
+        <w:t>findUsers</w:t>
+      </w:r>
+      <w:r>
+        <w:rPr>
+          <w:rFonts w:hint="default" w:ascii="Consolas" w:hAnsi="Consolas" w:eastAsia="Consolas" w:cs="Consolas"/>
+          <w:color w:val="000000"/>
+          <w:sz w:val="20"/>
+          <w:szCs w:val="20"/>
+          <w:shd w:val="clear" w:fill="FFFFFF"/>
+        </w:rPr>
+        <w:t>();</w:t>
+      </w:r>
+    </w:p>
+    <w:p>
+      <w:pPr>
+        <w:pStyle w:val="5"/>
+        <w:keepNext w:val="0"/>
+        <w:keepLines w:val="0"/>
+        <w:widowControl/>
+        <w:suppressLineNumbers w:val="0"/>
+        <w:spacing w:before="0" w:beforeAutospacing="0" w:after="0" w:afterAutospacing="0"/>
+        <w:ind w:left="0" w:right="0" w:firstLine="300" w:firstLineChars="150"/>
+      </w:pPr>
+      <w:r>
+        <w:rPr>
+          <w:rFonts w:hint="default" w:ascii="Consolas" w:hAnsi="Consolas" w:eastAsia="Consolas" w:cs="Consolas"/>
+          <w:b/>
+          <w:bCs/>
+          <w:color w:val="7F0055"/>
+          <w:sz w:val="20"/>
+          <w:szCs w:val="20"/>
+          <w:shd w:val="clear" w:fill="FFFFFF"/>
+        </w:rPr>
+        <w:t>if</w:t>
+      </w:r>
+      <w:r>
+        <w:rPr>
+          <w:rFonts w:hint="default" w:ascii="Consolas" w:hAnsi="Consolas" w:eastAsia="Consolas" w:cs="Consolas"/>
+          <w:color w:val="000000"/>
+          <w:sz w:val="20"/>
+          <w:szCs w:val="20"/>
+          <w:shd w:val="clear" w:fill="FFFFFF"/>
+        </w:rPr>
+        <w:t xml:space="preserve"> (</w:t>
+      </w:r>
+      <w:r>
+        <w:rPr>
+          <w:rFonts w:hint="default" w:ascii="Consolas" w:hAnsi="Consolas" w:eastAsia="Consolas" w:cs="Consolas"/>
+          <w:color w:val="6A3E3E"/>
+          <w:sz w:val="20"/>
+          <w:szCs w:val="20"/>
+          <w:shd w:val="clear" w:fill="FFFFFF"/>
+        </w:rPr>
+        <w:t>users</w:t>
+      </w:r>
+      <w:r>
+        <w:rPr>
+          <w:rFonts w:hint="default" w:ascii="Consolas" w:hAnsi="Consolas" w:eastAsia="Consolas" w:cs="Consolas"/>
+          <w:color w:val="000000"/>
+          <w:sz w:val="20"/>
+          <w:szCs w:val="20"/>
+          <w:shd w:val="clear" w:fill="FFFFFF"/>
+        </w:rPr>
+        <w:t xml:space="preserve"> != </w:t>
+      </w:r>
+      <w:r>
+        <w:rPr>
+          <w:rFonts w:hint="default" w:ascii="Consolas" w:hAnsi="Consolas" w:eastAsia="Consolas" w:cs="Consolas"/>
+          <w:b/>
+          <w:bCs/>
+          <w:color w:val="7F0055"/>
+          <w:sz w:val="20"/>
+          <w:szCs w:val="20"/>
+          <w:shd w:val="clear" w:fill="FFFFFF"/>
+        </w:rPr>
+        <w:t>null</w:t>
+      </w:r>
+      <w:r>
+        <w:rPr>
+          <w:rFonts w:hint="default" w:ascii="Consolas" w:hAnsi="Consolas" w:eastAsia="Consolas" w:cs="Consolas"/>
+          <w:color w:val="000000"/>
+          <w:sz w:val="20"/>
+          <w:szCs w:val="20"/>
+          <w:shd w:val="clear" w:fill="FFFFFF"/>
+        </w:rPr>
+        <w:t xml:space="preserve"> &amp;&amp; !</w:t>
+      </w:r>
+      <w:r>
+        <w:rPr>
+          <w:rFonts w:hint="default" w:ascii="Consolas" w:hAnsi="Consolas" w:eastAsia="Consolas" w:cs="Consolas"/>
+          <w:color w:val="6A3E3E"/>
+          <w:sz w:val="20"/>
+          <w:szCs w:val="20"/>
+          <w:shd w:val="clear" w:fill="FFFFFF"/>
+        </w:rPr>
+        <w:t>users</w:t>
+      </w:r>
+      <w:r>
+        <w:rPr>
+          <w:rFonts w:hint="default" w:ascii="Consolas" w:hAnsi="Consolas" w:eastAsia="Consolas" w:cs="Consolas"/>
+          <w:color w:val="000000"/>
+          <w:sz w:val="20"/>
+          <w:szCs w:val="20"/>
+          <w:shd w:val="clear" w:fill="FFFFFF"/>
+        </w:rPr>
+        <w:t>.isEmpty()) {</w:t>
+      </w:r>
+    </w:p>
+    <w:p>
+      <w:pPr>
+        <w:pStyle w:val="5"/>
+        <w:keepNext w:val="0"/>
+        <w:keepLines w:val="0"/>
+        <w:widowControl/>
+        <w:suppressLineNumbers w:val="0"/>
+        <w:spacing w:before="0" w:beforeAutospacing="0" w:after="0" w:afterAutospacing="0"/>
+        <w:ind w:left="0" w:right="0" w:firstLine="600" w:firstLineChars="300"/>
+      </w:pPr>
+      <w:r>
+        <w:rPr>
+          <w:rFonts w:hint="default" w:ascii="Consolas" w:hAnsi="Consolas" w:eastAsia="Consolas" w:cs="Consolas"/>
+          <w:b/>
+          <w:bCs/>
+          <w:color w:val="7F0055"/>
+          <w:sz w:val="20"/>
+          <w:szCs w:val="20"/>
+          <w:shd w:val="clear" w:fill="FFFFFF"/>
+        </w:rPr>
+        <w:t>return</w:t>
+      </w:r>
+      <w:r>
+        <w:rPr>
+          <w:rFonts w:hint="default" w:ascii="Consolas" w:hAnsi="Consolas" w:eastAsia="Consolas" w:cs="Consolas"/>
+          <w:color w:val="000000"/>
+          <w:sz w:val="20"/>
+          <w:szCs w:val="20"/>
+          <w:shd w:val="clear" w:fill="FFFFFF"/>
+        </w:rPr>
+        <w:t xml:space="preserve"> </w:t>
+      </w:r>
+      <w:r>
+        <w:rPr>
+          <w:rFonts w:hint="default" w:ascii="Consolas" w:hAnsi="Consolas" w:eastAsia="Consolas" w:cs="Consolas"/>
+          <w:b/>
+          <w:bCs/>
+          <w:color w:val="7F0055"/>
+          <w:sz w:val="20"/>
+          <w:szCs w:val="20"/>
+          <w:shd w:val="clear" w:fill="FFFFFF"/>
+        </w:rPr>
+        <w:t>new</w:t>
+      </w:r>
+      <w:r>
+        <w:rPr>
+          <w:rFonts w:hint="default" w:ascii="Consolas" w:hAnsi="Consolas" w:eastAsia="Consolas" w:cs="Consolas"/>
+          <w:color w:val="000000"/>
+          <w:sz w:val="20"/>
+          <w:szCs w:val="20"/>
+          <w:shd w:val="clear" w:fill="FFFFFF"/>
+        </w:rPr>
+        <w:t xml:space="preserve"> ResponseEntity&lt;&gt;(</w:t>
+      </w:r>
+      <w:r>
+        <w:rPr>
+          <w:rFonts w:hint="default" w:ascii="Consolas" w:hAnsi="Consolas" w:eastAsia="Consolas" w:cs="Consolas"/>
+          <w:color w:val="6A3E3E"/>
+          <w:sz w:val="20"/>
+          <w:szCs w:val="20"/>
+          <w:shd w:val="clear" w:fill="FFFFFF"/>
+        </w:rPr>
+        <w:t>users</w:t>
+      </w:r>
+      <w:r>
+        <w:rPr>
+          <w:rFonts w:hint="default" w:ascii="Consolas" w:hAnsi="Consolas" w:eastAsia="Consolas" w:cs="Consolas"/>
+          <w:color w:val="000000"/>
+          <w:sz w:val="20"/>
+          <w:szCs w:val="20"/>
+          <w:shd w:val="clear" w:fill="FFFFFF"/>
+        </w:rPr>
+        <w:t>, HttpStatus.</w:t>
+      </w:r>
+      <w:r>
+        <w:rPr>
+          <w:rFonts w:hint="default" w:ascii="Consolas" w:hAnsi="Consolas" w:eastAsia="Consolas" w:cs="Consolas"/>
+          <w:b/>
+          <w:bCs/>
+          <w:i/>
+          <w:iCs/>
+          <w:color w:val="0000C0"/>
+          <w:sz w:val="20"/>
+          <w:szCs w:val="20"/>
+          <w:shd w:val="clear" w:fill="FFFFFF"/>
+        </w:rPr>
+        <w:t>OK</w:t>
+      </w:r>
+      <w:r>
+        <w:rPr>
+          <w:rFonts w:hint="default" w:ascii="Consolas" w:hAnsi="Consolas" w:eastAsia="Consolas" w:cs="Consolas"/>
+          <w:color w:val="000000"/>
+          <w:sz w:val="20"/>
+          <w:szCs w:val="20"/>
+          <w:shd w:val="clear" w:fill="FFFFFF"/>
+        </w:rPr>
+        <w:t>);</w:t>
+      </w:r>
+    </w:p>
+    <w:p>
+      <w:pPr>
+        <w:pStyle w:val="5"/>
+        <w:keepNext w:val="0"/>
+        <w:keepLines w:val="0"/>
+        <w:widowControl/>
+        <w:suppressLineNumbers w:val="0"/>
+        <w:spacing w:before="0" w:beforeAutospacing="0" w:after="0" w:afterAutospacing="0"/>
+        <w:ind w:left="0" w:right="0" w:firstLine="300" w:firstLineChars="150"/>
+      </w:pPr>
+      <w:r>
+        <w:rPr>
+          <w:rFonts w:hint="default" w:ascii="Consolas" w:hAnsi="Consolas" w:eastAsia="Consolas" w:cs="Consolas"/>
+          <w:color w:val="000000"/>
+          <w:sz w:val="20"/>
+          <w:szCs w:val="20"/>
+          <w:shd w:val="clear" w:fill="FFFFFF"/>
+        </w:rPr>
+        <w:t>}</w:t>
+      </w:r>
+    </w:p>
+    <w:p>
+      <w:pPr>
+        <w:pStyle w:val="5"/>
+        <w:keepNext w:val="0"/>
+        <w:keepLines w:val="0"/>
+        <w:widowControl/>
+        <w:suppressLineNumbers w:val="0"/>
+        <w:spacing w:before="0" w:beforeAutospacing="0" w:after="0" w:afterAutospacing="0"/>
+        <w:ind w:left="0" w:right="0"/>
+      </w:pPr>
+    </w:p>
+    <w:p>
+      <w:pPr>
+        <w:pStyle w:val="5"/>
+        <w:keepNext w:val="0"/>
+        <w:keepLines w:val="0"/>
+        <w:widowControl/>
+        <w:suppressLineNumbers w:val="0"/>
+        <w:spacing w:before="0" w:beforeAutospacing="0" w:after="0" w:afterAutospacing="0"/>
+        <w:ind w:left="0" w:right="0" w:firstLine="300" w:firstLineChars="150"/>
+      </w:pPr>
+      <w:r>
+        <w:rPr>
+          <w:rFonts w:hint="default" w:ascii="Consolas" w:hAnsi="Consolas" w:eastAsia="Consolas" w:cs="Consolas"/>
+          <w:b/>
+          <w:bCs/>
+          <w:color w:val="7F0055"/>
+          <w:sz w:val="20"/>
+          <w:szCs w:val="20"/>
+          <w:shd w:val="clear" w:fill="FFFFFF"/>
+        </w:rPr>
+        <w:t>return</w:t>
+      </w:r>
+      <w:r>
+        <w:rPr>
+          <w:rFonts w:hint="default" w:ascii="Consolas" w:hAnsi="Consolas" w:eastAsia="Consolas" w:cs="Consolas"/>
+          <w:color w:val="000000"/>
+          <w:sz w:val="20"/>
+          <w:szCs w:val="20"/>
+          <w:shd w:val="clear" w:fill="FFFFFF"/>
+        </w:rPr>
+        <w:t xml:space="preserve"> </w:t>
+      </w:r>
+      <w:r>
+        <w:rPr>
+          <w:rFonts w:hint="default" w:ascii="Consolas" w:hAnsi="Consolas" w:eastAsia="Consolas" w:cs="Consolas"/>
+          <w:b/>
+          <w:bCs/>
+          <w:color w:val="7F0055"/>
+          <w:sz w:val="20"/>
+          <w:szCs w:val="20"/>
+          <w:shd w:val="clear" w:fill="FFFFFF"/>
+        </w:rPr>
+        <w:t>new</w:t>
+      </w:r>
+      <w:r>
+        <w:rPr>
+          <w:rFonts w:hint="default" w:ascii="Consolas" w:hAnsi="Consolas" w:eastAsia="Consolas" w:cs="Consolas"/>
+          <w:color w:val="000000"/>
+          <w:sz w:val="20"/>
+          <w:szCs w:val="20"/>
+          <w:shd w:val="clear" w:fill="FFFFFF"/>
+        </w:rPr>
+        <w:t xml:space="preserve"> ResponseEntity&lt;&gt;(HttpStatus.</w:t>
+      </w:r>
+      <w:r>
+        <w:rPr>
+          <w:rFonts w:hint="default" w:ascii="Consolas" w:hAnsi="Consolas" w:eastAsia="Consolas" w:cs="Consolas"/>
+          <w:b/>
+          <w:bCs/>
+          <w:i/>
+          <w:iCs/>
+          <w:color w:val="0000C0"/>
+          <w:sz w:val="20"/>
+          <w:szCs w:val="20"/>
+          <w:shd w:val="clear" w:fill="FFFFFF"/>
+        </w:rPr>
+        <w:t>NOT_FOUND</w:t>
+      </w:r>
+      <w:r>
+        <w:rPr>
+          <w:rFonts w:hint="default" w:ascii="Consolas" w:hAnsi="Consolas" w:eastAsia="Consolas" w:cs="Consolas"/>
+          <w:color w:val="000000"/>
+          <w:sz w:val="20"/>
+          <w:szCs w:val="20"/>
+          <w:shd w:val="clear" w:fill="FFFFFF"/>
+        </w:rPr>
+        <w:t>);</w:t>
+      </w:r>
+    </w:p>
+    <w:p>
+      <w:pPr>
+        <w:pStyle w:val="5"/>
+        <w:keepNext w:val="0"/>
+        <w:keepLines w:val="0"/>
+        <w:widowControl/>
+        <w:suppressLineNumbers w:val="0"/>
+        <w:spacing w:before="0" w:beforeAutospacing="0" w:after="0" w:afterAutospacing="0"/>
+        <w:ind w:left="0" w:right="0"/>
+        <w:rPr>
+          <w:rFonts w:hint="default" w:ascii="Consolas" w:hAnsi="Consolas" w:eastAsia="Consolas" w:cs="Consolas"/>
+          <w:color w:val="000000"/>
+          <w:sz w:val="20"/>
+          <w:szCs w:val="20"/>
+          <w:shd w:val="clear" w:fill="FFFFFF"/>
+        </w:rPr>
+      </w:pPr>
+      <w:r>
+        <w:rPr>
+          <w:rFonts w:hint="default" w:ascii="Consolas" w:hAnsi="Consolas" w:eastAsia="Consolas" w:cs="Consolas"/>
+          <w:color w:val="000000"/>
+          <w:sz w:val="20"/>
+          <w:szCs w:val="20"/>
+          <w:shd w:val="clear" w:fill="FFFFFF"/>
+        </w:rPr>
+        <w:t>}</w:t>
+      </w:r>
+    </w:p>
+    <w:p>
+      <w:pPr>
+        <w:pStyle w:val="5"/>
+        <w:keepNext w:val="0"/>
+        <w:keepLines w:val="0"/>
+        <w:widowControl/>
+        <w:suppressLineNumbers w:val="0"/>
+        <w:spacing w:before="0" w:beforeAutospacing="0" w:after="0" w:afterAutospacing="0"/>
+        <w:ind w:left="0" w:right="0"/>
+        <w:rPr>
+          <w:rFonts w:hint="default" w:ascii="Consolas" w:hAnsi="Consolas" w:eastAsia="Consolas" w:cs="Consolas"/>
+          <w:color w:val="000000"/>
+          <w:sz w:val="20"/>
+          <w:szCs w:val="20"/>
+          <w:shd w:val="clear" w:fill="FFFFFF"/>
+        </w:rPr>
+      </w:pPr>
+    </w:p>
+    <w:p>
+      <w:pPr>
+        <w:pStyle w:val="5"/>
+        <w:keepNext w:val="0"/>
+        <w:keepLines w:val="0"/>
+        <w:widowControl/>
+        <w:suppressLineNumbers w:val="0"/>
+        <w:spacing w:before="0" w:beforeAutospacing="0" w:after="0" w:afterAutospacing="0"/>
+        <w:ind w:left="0" w:right="0"/>
+      </w:pPr>
+      <w:r>
+        <w:rPr>
+          <w:rFonts w:hint="default" w:ascii="Consolas" w:hAnsi="Consolas" w:eastAsia="Consolas" w:cs="Consolas"/>
+          <w:color w:val="646464"/>
+          <w:sz w:val="20"/>
+          <w:szCs w:val="20"/>
+          <w:shd w:val="clear" w:fill="FFFFFF"/>
+        </w:rPr>
+        <w:t>@Transactional</w:t>
+      </w:r>
+    </w:p>
+    <w:p>
+      <w:pPr>
+        <w:pStyle w:val="5"/>
+        <w:keepNext w:val="0"/>
+        <w:keepLines w:val="0"/>
+        <w:widowControl/>
+        <w:suppressLineNumbers w:val="0"/>
+        <w:spacing w:before="0" w:beforeAutospacing="0" w:after="0" w:afterAutospacing="0"/>
+        <w:ind w:left="0" w:right="0"/>
+      </w:pPr>
+      <w:r>
+        <w:rPr>
+          <w:rFonts w:hint="default" w:ascii="Consolas" w:hAnsi="Consolas" w:eastAsia="Consolas" w:cs="Consolas"/>
+          <w:color w:val="646464"/>
+          <w:sz w:val="20"/>
+          <w:szCs w:val="20"/>
+          <w:shd w:val="clear" w:fill="FFFFFF"/>
+        </w:rPr>
+        <w:t>@DeleteMapping</w:t>
+      </w:r>
+      <w:r>
+        <w:rPr>
+          <w:rFonts w:hint="default" w:ascii="Consolas" w:hAnsi="Consolas" w:eastAsia="Consolas" w:cs="Consolas"/>
+          <w:color w:val="000000"/>
+          <w:sz w:val="20"/>
+          <w:szCs w:val="20"/>
+          <w:shd w:val="clear" w:fill="FFFFFF"/>
+        </w:rPr>
+        <w:t>(</w:t>
+      </w:r>
+      <w:r>
+        <w:rPr>
+          <w:rFonts w:hint="default" w:ascii="Consolas" w:hAnsi="Consolas" w:eastAsia="Consolas" w:cs="Consolas"/>
+          <w:color w:val="2A00FF"/>
+          <w:sz w:val="20"/>
+          <w:szCs w:val="20"/>
+          <w:shd w:val="clear" w:fill="FFFFFF"/>
+        </w:rPr>
+        <w:t>"/all-users"</w:t>
+      </w:r>
+      <w:r>
+        <w:rPr>
+          <w:rFonts w:hint="default" w:ascii="Consolas" w:hAnsi="Consolas" w:eastAsia="Consolas" w:cs="Consolas"/>
+          <w:color w:val="000000"/>
+          <w:sz w:val="20"/>
+          <w:szCs w:val="20"/>
+          <w:shd w:val="clear" w:fill="FFFFFF"/>
+        </w:rPr>
+        <w:t>)</w:t>
+      </w:r>
+    </w:p>
+    <w:p>
+      <w:pPr>
+        <w:pStyle w:val="5"/>
+        <w:keepNext w:val="0"/>
+        <w:keepLines w:val="0"/>
+        <w:widowControl/>
+        <w:suppressLineNumbers w:val="0"/>
+        <w:spacing w:before="0" w:beforeAutospacing="0" w:after="0" w:afterAutospacing="0"/>
+        <w:ind w:left="0" w:right="0"/>
+      </w:pPr>
+      <w:r>
+        <w:rPr>
+          <w:rFonts w:hint="default" w:ascii="Consolas" w:hAnsi="Consolas" w:eastAsia="Consolas" w:cs="Consolas"/>
+          <w:b/>
+          <w:bCs/>
+          <w:color w:val="7F0055"/>
+          <w:sz w:val="20"/>
+          <w:szCs w:val="20"/>
+          <w:shd w:val="clear" w:fill="FFFFFF"/>
+        </w:rPr>
+        <w:t>public</w:t>
+      </w:r>
+      <w:r>
+        <w:rPr>
+          <w:rFonts w:hint="default" w:ascii="Consolas" w:hAnsi="Consolas" w:eastAsia="Consolas" w:cs="Consolas"/>
+          <w:color w:val="000000"/>
+          <w:sz w:val="20"/>
+          <w:szCs w:val="20"/>
+          <w:shd w:val="clear" w:fill="FFFFFF"/>
+        </w:rPr>
+        <w:t xml:space="preserve"> ResponseEntity&lt;?&gt; deleteAllUsers() {</w:t>
+      </w:r>
+    </w:p>
+    <w:p>
+      <w:pPr>
+        <w:pStyle w:val="5"/>
+        <w:keepNext w:val="0"/>
+        <w:keepLines w:val="0"/>
+        <w:widowControl/>
+        <w:suppressLineNumbers w:val="0"/>
+        <w:spacing w:before="0" w:beforeAutospacing="0" w:after="0" w:afterAutospacing="0"/>
+        <w:ind w:left="0" w:right="0"/>
+      </w:pPr>
+    </w:p>
+    <w:p>
+      <w:pPr>
+        <w:pStyle w:val="5"/>
+        <w:keepNext w:val="0"/>
+        <w:keepLines w:val="0"/>
+        <w:widowControl/>
+        <w:suppressLineNumbers w:val="0"/>
+        <w:spacing w:before="0" w:beforeAutospacing="0" w:after="0" w:afterAutospacing="0"/>
+        <w:ind w:left="0" w:right="0" w:firstLine="300" w:firstLineChars="150"/>
+      </w:pPr>
+      <w:r>
+        <w:rPr>
+          <w:rFonts w:hint="default" w:ascii="Consolas" w:hAnsi="Consolas" w:eastAsia="Consolas" w:cs="Consolas"/>
+          <w:color w:val="000000"/>
+          <w:sz w:val="20"/>
+          <w:szCs w:val="20"/>
+          <w:shd w:val="clear" w:fill="FFFFFF"/>
+        </w:rPr>
+        <w:t xml:space="preserve">List&lt;User&gt; </w:t>
+      </w:r>
+      <w:r>
+        <w:rPr>
+          <w:rFonts w:hint="default" w:ascii="Consolas" w:hAnsi="Consolas" w:eastAsia="Consolas" w:cs="Consolas"/>
+          <w:color w:val="6A3E3E"/>
+          <w:sz w:val="20"/>
+          <w:szCs w:val="20"/>
+          <w:shd w:val="clear" w:fill="FFFFFF"/>
+        </w:rPr>
+        <w:t>users</w:t>
+      </w:r>
+      <w:r>
+        <w:rPr>
+          <w:rFonts w:hint="default" w:ascii="Consolas" w:hAnsi="Consolas" w:eastAsia="Consolas" w:cs="Consolas"/>
+          <w:color w:val="000000"/>
+          <w:sz w:val="20"/>
+          <w:szCs w:val="20"/>
+          <w:shd w:val="clear" w:fill="FFFFFF"/>
+        </w:rPr>
+        <w:t xml:space="preserve"> = </w:t>
+      </w:r>
+      <w:r>
+        <w:rPr>
+          <w:rFonts w:hint="default" w:ascii="Consolas" w:hAnsi="Consolas" w:eastAsia="Consolas" w:cs="Consolas"/>
+          <w:color w:val="0000C0"/>
+          <w:sz w:val="20"/>
+          <w:szCs w:val="20"/>
+          <w:shd w:val="clear" w:fill="FFFFFF"/>
+        </w:rPr>
+        <w:t>userService</w:t>
+      </w:r>
+      <w:r>
+        <w:rPr>
+          <w:rFonts w:hint="default" w:ascii="Consolas" w:hAnsi="Consolas" w:eastAsia="Consolas" w:cs="Consolas"/>
+          <w:color w:val="000000"/>
+          <w:sz w:val="20"/>
+          <w:szCs w:val="20"/>
+          <w:shd w:val="clear" w:fill="FFFFFF"/>
+        </w:rPr>
+        <w:t>.</w:t>
+      </w:r>
+      <w:r>
+        <w:rPr>
+          <w:rFonts w:hint="default" w:ascii="Consolas" w:hAnsi="Consolas" w:eastAsia="Consolas" w:cs="Consolas"/>
+          <w:color w:val="000000"/>
+          <w:sz w:val="20"/>
+          <w:szCs w:val="20"/>
+          <w:shd w:val="clear" w:fill="D4D4D4"/>
+        </w:rPr>
+        <w:t>findUsers</w:t>
+      </w:r>
+      <w:r>
+        <w:rPr>
+          <w:rFonts w:hint="default" w:ascii="Consolas" w:hAnsi="Consolas" w:eastAsia="Consolas" w:cs="Consolas"/>
+          <w:color w:val="000000"/>
+          <w:sz w:val="20"/>
+          <w:szCs w:val="20"/>
+          <w:shd w:val="clear" w:fill="FFFFFF"/>
+        </w:rPr>
+        <w:t>();</w:t>
+      </w:r>
+    </w:p>
+    <w:p>
+      <w:pPr>
+        <w:pStyle w:val="5"/>
+        <w:keepNext w:val="0"/>
+        <w:keepLines w:val="0"/>
+        <w:widowControl/>
+        <w:suppressLineNumbers w:val="0"/>
+        <w:spacing w:before="0" w:beforeAutospacing="0" w:after="0" w:afterAutospacing="0"/>
+        <w:ind w:left="0" w:right="0" w:firstLine="300" w:firstLineChars="150"/>
+      </w:pPr>
+      <w:r>
+        <w:rPr>
+          <w:rFonts w:hint="default" w:ascii="Consolas" w:hAnsi="Consolas" w:eastAsia="Consolas" w:cs="Consolas"/>
+          <w:b/>
+          <w:bCs/>
+          <w:color w:val="7F0055"/>
+          <w:sz w:val="20"/>
+          <w:szCs w:val="20"/>
+          <w:shd w:val="clear" w:fill="FFFFFF"/>
+        </w:rPr>
+        <w:t>if</w:t>
+      </w:r>
+      <w:r>
+        <w:rPr>
+          <w:rFonts w:hint="default" w:ascii="Consolas" w:hAnsi="Consolas" w:eastAsia="Consolas" w:cs="Consolas"/>
+          <w:color w:val="000000"/>
+          <w:sz w:val="20"/>
+          <w:szCs w:val="20"/>
+          <w:shd w:val="clear" w:fill="FFFFFF"/>
+        </w:rPr>
+        <w:t xml:space="preserve"> (</w:t>
+      </w:r>
+      <w:r>
+        <w:rPr>
+          <w:rFonts w:hint="default" w:ascii="Consolas" w:hAnsi="Consolas" w:eastAsia="Consolas" w:cs="Consolas"/>
+          <w:color w:val="6A3E3E"/>
+          <w:sz w:val="20"/>
+          <w:szCs w:val="20"/>
+          <w:shd w:val="clear" w:fill="FFFFFF"/>
+        </w:rPr>
+        <w:t>users</w:t>
+      </w:r>
+      <w:r>
+        <w:rPr>
+          <w:rFonts w:hint="default" w:ascii="Consolas" w:hAnsi="Consolas" w:eastAsia="Consolas" w:cs="Consolas"/>
+          <w:color w:val="000000"/>
+          <w:sz w:val="20"/>
+          <w:szCs w:val="20"/>
+          <w:shd w:val="clear" w:fill="FFFFFF"/>
+        </w:rPr>
+        <w:t xml:space="preserve"> != </w:t>
+      </w:r>
+      <w:r>
+        <w:rPr>
+          <w:rFonts w:hint="default" w:ascii="Consolas" w:hAnsi="Consolas" w:eastAsia="Consolas" w:cs="Consolas"/>
+          <w:b/>
+          <w:bCs/>
+          <w:color w:val="7F0055"/>
+          <w:sz w:val="20"/>
+          <w:szCs w:val="20"/>
+          <w:shd w:val="clear" w:fill="FFFFFF"/>
+        </w:rPr>
+        <w:t>null</w:t>
+      </w:r>
+      <w:r>
+        <w:rPr>
+          <w:rFonts w:hint="default" w:ascii="Consolas" w:hAnsi="Consolas" w:eastAsia="Consolas" w:cs="Consolas"/>
+          <w:color w:val="000000"/>
+          <w:sz w:val="20"/>
+          <w:szCs w:val="20"/>
+          <w:shd w:val="clear" w:fill="FFFFFF"/>
+        </w:rPr>
+        <w:t xml:space="preserve"> &amp;&amp; !</w:t>
+      </w:r>
+      <w:r>
+        <w:rPr>
+          <w:rFonts w:hint="default" w:ascii="Consolas" w:hAnsi="Consolas" w:eastAsia="Consolas" w:cs="Consolas"/>
+          <w:color w:val="6A3E3E"/>
+          <w:sz w:val="20"/>
+          <w:szCs w:val="20"/>
+          <w:shd w:val="clear" w:fill="FFFFFF"/>
+        </w:rPr>
+        <w:t>users</w:t>
+      </w:r>
+      <w:r>
+        <w:rPr>
+          <w:rFonts w:hint="default" w:ascii="Consolas" w:hAnsi="Consolas" w:eastAsia="Consolas" w:cs="Consolas"/>
+          <w:color w:val="000000"/>
+          <w:sz w:val="20"/>
+          <w:szCs w:val="20"/>
+          <w:shd w:val="clear" w:fill="FFFFFF"/>
+        </w:rPr>
+        <w:t>.isEmpty()) {</w:t>
+      </w:r>
+    </w:p>
+    <w:p>
+      <w:pPr>
+        <w:pStyle w:val="5"/>
+        <w:keepNext w:val="0"/>
+        <w:keepLines w:val="0"/>
+        <w:widowControl/>
+        <w:suppressLineNumbers w:val="0"/>
+        <w:spacing w:before="0" w:beforeAutospacing="0" w:after="0" w:afterAutospacing="0"/>
+        <w:ind w:left="0" w:right="0" w:firstLine="600" w:firstLineChars="300"/>
+      </w:pPr>
+      <w:r>
+        <w:rPr>
+          <w:rFonts w:hint="default" w:ascii="Consolas" w:hAnsi="Consolas" w:eastAsia="Consolas" w:cs="Consolas"/>
+          <w:b/>
+          <w:bCs/>
+          <w:color w:val="7F0055"/>
+          <w:sz w:val="20"/>
+          <w:szCs w:val="20"/>
+          <w:shd w:val="clear" w:fill="FFFFFF"/>
+        </w:rPr>
+        <w:t>for</w:t>
+      </w:r>
+      <w:r>
+        <w:rPr>
+          <w:rFonts w:hint="default" w:ascii="Consolas" w:hAnsi="Consolas" w:eastAsia="Consolas" w:cs="Consolas"/>
+          <w:color w:val="000000"/>
+          <w:sz w:val="20"/>
+          <w:szCs w:val="20"/>
+          <w:shd w:val="clear" w:fill="FFFFFF"/>
+        </w:rPr>
+        <w:t xml:space="preserve">(User </w:t>
+      </w:r>
+      <w:r>
+        <w:rPr>
+          <w:rFonts w:hint="default" w:ascii="Consolas" w:hAnsi="Consolas" w:eastAsia="Consolas" w:cs="Consolas"/>
+          <w:color w:val="6A3E3E"/>
+          <w:sz w:val="20"/>
+          <w:szCs w:val="20"/>
+          <w:shd w:val="clear" w:fill="FFFFFF"/>
+        </w:rPr>
+        <w:t>user</w:t>
+      </w:r>
+      <w:r>
+        <w:rPr>
+          <w:rFonts w:hint="default" w:ascii="Consolas" w:hAnsi="Consolas" w:eastAsia="Consolas" w:cs="Consolas"/>
+          <w:color w:val="000000"/>
+          <w:sz w:val="20"/>
+          <w:szCs w:val="20"/>
+          <w:shd w:val="clear" w:fill="FFFFFF"/>
+        </w:rPr>
+        <w:t>:</w:t>
+      </w:r>
+      <w:r>
+        <w:rPr>
+          <w:rFonts w:hint="default" w:ascii="Consolas" w:hAnsi="Consolas" w:eastAsia="Consolas" w:cs="Consolas"/>
+          <w:color w:val="6A3E3E"/>
+          <w:sz w:val="20"/>
+          <w:szCs w:val="20"/>
+          <w:shd w:val="clear" w:fill="FFFFFF"/>
+        </w:rPr>
+        <w:t>users</w:t>
+      </w:r>
+      <w:r>
+        <w:rPr>
+          <w:rFonts w:hint="default" w:ascii="Consolas" w:hAnsi="Consolas" w:eastAsia="Consolas" w:cs="Consolas"/>
+          <w:color w:val="000000"/>
+          <w:sz w:val="20"/>
+          <w:szCs w:val="20"/>
+          <w:shd w:val="clear" w:fill="FFFFFF"/>
+        </w:rPr>
+        <w:t>) {</w:t>
+      </w:r>
+    </w:p>
+    <w:p>
+      <w:pPr>
+        <w:pStyle w:val="5"/>
+        <w:keepNext w:val="0"/>
+        <w:keepLines w:val="0"/>
+        <w:widowControl/>
+        <w:suppressLineNumbers w:val="0"/>
+        <w:spacing w:before="0" w:beforeAutospacing="0" w:after="0" w:afterAutospacing="0"/>
+        <w:ind w:left="0" w:right="0" w:firstLine="900" w:firstLineChars="450"/>
+      </w:pPr>
+      <w:r>
+        <w:rPr>
+          <w:rFonts w:hint="default" w:ascii="Consolas" w:hAnsi="Consolas" w:eastAsia="Consolas" w:cs="Consolas"/>
+          <w:color w:val="0000C0"/>
+          <w:sz w:val="20"/>
+          <w:szCs w:val="20"/>
+          <w:shd w:val="clear" w:fill="FFFFFF"/>
+        </w:rPr>
+        <w:t>userService</w:t>
+      </w:r>
+      <w:r>
+        <w:rPr>
+          <w:rFonts w:hint="default" w:ascii="Consolas" w:hAnsi="Consolas" w:eastAsia="Consolas" w:cs="Consolas"/>
+          <w:color w:val="000000"/>
+          <w:sz w:val="20"/>
+          <w:szCs w:val="20"/>
+          <w:shd w:val="clear" w:fill="FFFFFF"/>
+        </w:rPr>
+        <w:t>.deleteByUsername(</w:t>
+      </w:r>
+      <w:r>
+        <w:rPr>
+          <w:rFonts w:hint="default" w:ascii="Consolas" w:hAnsi="Consolas" w:eastAsia="Consolas" w:cs="Consolas"/>
+          <w:color w:val="6A3E3E"/>
+          <w:sz w:val="20"/>
+          <w:szCs w:val="20"/>
+          <w:shd w:val="clear" w:fill="FFFFFF"/>
+        </w:rPr>
+        <w:t>user</w:t>
+      </w:r>
+      <w:r>
+        <w:rPr>
+          <w:rFonts w:hint="default" w:ascii="Consolas" w:hAnsi="Consolas" w:eastAsia="Consolas" w:cs="Consolas"/>
+          <w:color w:val="000000"/>
+          <w:sz w:val="20"/>
+          <w:szCs w:val="20"/>
+          <w:shd w:val="clear" w:fill="FFFFFF"/>
+        </w:rPr>
+        <w:t>.getUsername());</w:t>
+      </w:r>
+    </w:p>
+    <w:p>
+      <w:pPr>
+        <w:pStyle w:val="5"/>
+        <w:keepNext w:val="0"/>
+        <w:keepLines w:val="0"/>
+        <w:widowControl/>
+        <w:suppressLineNumbers w:val="0"/>
+        <w:spacing w:before="0" w:beforeAutospacing="0" w:after="0" w:afterAutospacing="0"/>
+        <w:ind w:left="0" w:right="0" w:firstLine="600" w:firstLineChars="300"/>
+      </w:pPr>
+      <w:r>
+        <w:rPr>
+          <w:rFonts w:hint="default" w:ascii="Consolas" w:hAnsi="Consolas" w:eastAsia="Consolas" w:cs="Consolas"/>
+          <w:color w:val="000000"/>
+          <w:sz w:val="20"/>
+          <w:szCs w:val="20"/>
+          <w:shd w:val="clear" w:fill="FFFFFF"/>
+        </w:rPr>
+        <w:t>}</w:t>
+      </w:r>
+    </w:p>
+    <w:p>
+      <w:pPr>
+        <w:pStyle w:val="5"/>
+        <w:keepNext w:val="0"/>
+        <w:keepLines w:val="0"/>
+        <w:widowControl/>
+        <w:suppressLineNumbers w:val="0"/>
+        <w:spacing w:before="0" w:beforeAutospacing="0" w:after="0" w:afterAutospacing="0"/>
+        <w:ind w:left="0" w:right="0" w:firstLine="600" w:firstLineChars="300"/>
+      </w:pPr>
+      <w:r>
+        <w:rPr>
+          <w:rFonts w:hint="default" w:ascii="Consolas" w:hAnsi="Consolas" w:eastAsia="Consolas" w:cs="Consolas"/>
+          <w:b/>
+          <w:bCs/>
+          <w:color w:val="7F0055"/>
+          <w:sz w:val="20"/>
+          <w:szCs w:val="20"/>
+          <w:shd w:val="clear" w:fill="FFFFFF"/>
+        </w:rPr>
+        <w:t>return</w:t>
+      </w:r>
+      <w:r>
+        <w:rPr>
+          <w:rFonts w:hint="default" w:ascii="Consolas" w:hAnsi="Consolas" w:eastAsia="Consolas" w:cs="Consolas"/>
+          <w:color w:val="000000"/>
+          <w:sz w:val="20"/>
+          <w:szCs w:val="20"/>
+          <w:shd w:val="clear" w:fill="FFFFFF"/>
+        </w:rPr>
+        <w:t xml:space="preserve"> </w:t>
+      </w:r>
+      <w:r>
+        <w:rPr>
+          <w:rFonts w:hint="default" w:ascii="Consolas" w:hAnsi="Consolas" w:eastAsia="Consolas" w:cs="Consolas"/>
+          <w:b/>
+          <w:bCs/>
+          <w:color w:val="7F0055"/>
+          <w:sz w:val="20"/>
+          <w:szCs w:val="20"/>
+          <w:shd w:val="clear" w:fill="FFFFFF"/>
+        </w:rPr>
+        <w:t>new</w:t>
+      </w:r>
+      <w:r>
+        <w:rPr>
+          <w:rFonts w:hint="default" w:ascii="Consolas" w:hAnsi="Consolas" w:eastAsia="Consolas" w:cs="Consolas"/>
+          <w:color w:val="000000"/>
+          <w:sz w:val="20"/>
+          <w:szCs w:val="20"/>
+          <w:shd w:val="clear" w:fill="FFFFFF"/>
+        </w:rPr>
+        <w:t xml:space="preserve"> ResponseEntity&lt;&gt;(</w:t>
+      </w:r>
+      <w:r>
+        <w:rPr>
+          <w:rFonts w:hint="default" w:ascii="Consolas" w:hAnsi="Consolas" w:eastAsia="Consolas" w:cs="Consolas"/>
+          <w:color w:val="6A3E3E"/>
+          <w:sz w:val="20"/>
+          <w:szCs w:val="20"/>
+          <w:shd w:val="clear" w:fill="FFFFFF"/>
+        </w:rPr>
+        <w:t>users</w:t>
+      </w:r>
+      <w:r>
+        <w:rPr>
+          <w:rFonts w:hint="default" w:ascii="Consolas" w:hAnsi="Consolas" w:eastAsia="Consolas" w:cs="Consolas"/>
+          <w:color w:val="000000"/>
+          <w:sz w:val="20"/>
+          <w:szCs w:val="20"/>
+          <w:shd w:val="clear" w:fill="FFFFFF"/>
+        </w:rPr>
+        <w:t>, HttpStatus.</w:t>
+      </w:r>
+      <w:r>
+        <w:rPr>
+          <w:rFonts w:hint="default" w:ascii="Consolas" w:hAnsi="Consolas" w:eastAsia="Consolas" w:cs="Consolas"/>
+          <w:b/>
+          <w:bCs/>
+          <w:i/>
+          <w:iCs/>
+          <w:color w:val="0000C0"/>
+          <w:sz w:val="20"/>
+          <w:szCs w:val="20"/>
+          <w:shd w:val="clear" w:fill="FFFFFF"/>
+        </w:rPr>
+        <w:t>NO_CONTENT</w:t>
+      </w:r>
+      <w:r>
+        <w:rPr>
+          <w:rFonts w:hint="default" w:ascii="Consolas" w:hAnsi="Consolas" w:eastAsia="Consolas" w:cs="Consolas"/>
+          <w:color w:val="000000"/>
+          <w:sz w:val="20"/>
+          <w:szCs w:val="20"/>
+          <w:shd w:val="clear" w:fill="FFFFFF"/>
+        </w:rPr>
+        <w:t>);</w:t>
+      </w:r>
+    </w:p>
+    <w:p>
+      <w:pPr>
+        <w:pStyle w:val="5"/>
+        <w:keepNext w:val="0"/>
+        <w:keepLines w:val="0"/>
+        <w:widowControl/>
+        <w:suppressLineNumbers w:val="0"/>
+        <w:spacing w:before="0" w:beforeAutospacing="0" w:after="0" w:afterAutospacing="0"/>
+        <w:ind w:left="0" w:right="0" w:firstLine="300" w:firstLineChars="150"/>
+      </w:pPr>
+      <w:r>
+        <w:rPr>
+          <w:rFonts w:hint="default" w:ascii="Consolas" w:hAnsi="Consolas" w:eastAsia="Consolas" w:cs="Consolas"/>
+          <w:color w:val="000000"/>
+          <w:sz w:val="20"/>
+          <w:szCs w:val="20"/>
+          <w:shd w:val="clear" w:fill="FFFFFF"/>
+        </w:rPr>
+        <w:t>}</w:t>
+      </w:r>
+    </w:p>
+    <w:p>
+      <w:pPr>
+        <w:pStyle w:val="5"/>
+        <w:keepNext w:val="0"/>
+        <w:keepLines w:val="0"/>
+        <w:widowControl/>
+        <w:suppressLineNumbers w:val="0"/>
+        <w:spacing w:before="0" w:beforeAutospacing="0" w:after="0" w:afterAutospacing="0"/>
+        <w:ind w:left="0" w:right="0"/>
+      </w:pPr>
+    </w:p>
+    <w:p>
+      <w:pPr>
+        <w:pStyle w:val="5"/>
+        <w:keepNext w:val="0"/>
+        <w:keepLines w:val="0"/>
+        <w:widowControl/>
+        <w:suppressLineNumbers w:val="0"/>
+        <w:spacing w:before="0" w:beforeAutospacing="0" w:after="0" w:afterAutospacing="0"/>
+        <w:ind w:left="0" w:right="0" w:firstLine="300" w:firstLineChars="150"/>
+      </w:pPr>
+      <w:r>
+        <w:rPr>
+          <w:rFonts w:hint="default" w:ascii="Consolas" w:hAnsi="Consolas" w:eastAsia="Consolas" w:cs="Consolas"/>
+          <w:b/>
+          <w:bCs/>
+          <w:color w:val="7F0055"/>
+          <w:sz w:val="20"/>
+          <w:szCs w:val="20"/>
+          <w:shd w:val="clear" w:fill="FFFFFF"/>
+        </w:rPr>
+        <w:t>return</w:t>
+      </w:r>
+      <w:r>
+        <w:rPr>
+          <w:rFonts w:hint="default" w:ascii="Consolas" w:hAnsi="Consolas" w:eastAsia="Consolas" w:cs="Consolas"/>
+          <w:color w:val="000000"/>
+          <w:sz w:val="20"/>
+          <w:szCs w:val="20"/>
+          <w:shd w:val="clear" w:fill="FFFFFF"/>
+        </w:rPr>
+        <w:t xml:space="preserve"> </w:t>
+      </w:r>
+      <w:r>
+        <w:rPr>
+          <w:rFonts w:hint="default" w:ascii="Consolas" w:hAnsi="Consolas" w:eastAsia="Consolas" w:cs="Consolas"/>
+          <w:b/>
+          <w:bCs/>
+          <w:color w:val="7F0055"/>
+          <w:sz w:val="20"/>
+          <w:szCs w:val="20"/>
+          <w:shd w:val="clear" w:fill="FFFFFF"/>
+        </w:rPr>
+        <w:t>new</w:t>
+      </w:r>
+      <w:r>
+        <w:rPr>
+          <w:rFonts w:hint="default" w:ascii="Consolas" w:hAnsi="Consolas" w:eastAsia="Consolas" w:cs="Consolas"/>
+          <w:color w:val="000000"/>
+          <w:sz w:val="20"/>
+          <w:szCs w:val="20"/>
+          <w:shd w:val="clear" w:fill="FFFFFF"/>
+        </w:rPr>
+        <w:t xml:space="preserve"> ResponseEntity&lt;&gt;(HttpStatus.</w:t>
+      </w:r>
+      <w:r>
+        <w:rPr>
+          <w:rFonts w:hint="default" w:ascii="Consolas" w:hAnsi="Consolas" w:eastAsia="Consolas" w:cs="Consolas"/>
+          <w:b/>
+          <w:bCs/>
+          <w:i/>
+          <w:iCs/>
+          <w:color w:val="0000C0"/>
+          <w:sz w:val="20"/>
+          <w:szCs w:val="20"/>
+          <w:shd w:val="clear" w:fill="FFFFFF"/>
+        </w:rPr>
+        <w:t>FORBIDDEN</w:t>
+      </w:r>
+      <w:r>
+        <w:rPr>
+          <w:rFonts w:hint="default" w:ascii="Consolas" w:hAnsi="Consolas" w:eastAsia="Consolas" w:cs="Consolas"/>
+          <w:color w:val="000000"/>
+          <w:sz w:val="20"/>
+          <w:szCs w:val="20"/>
+          <w:shd w:val="clear" w:fill="FFFFFF"/>
+        </w:rPr>
+        <w:t>);</w:t>
+      </w:r>
+    </w:p>
+    <w:p>
+      <w:pPr>
+        <w:pStyle w:val="5"/>
+        <w:keepNext w:val="0"/>
+        <w:keepLines w:val="0"/>
+        <w:widowControl/>
+        <w:suppressLineNumbers w:val="0"/>
+        <w:spacing w:before="0" w:beforeAutospacing="0" w:after="0" w:afterAutospacing="0"/>
+        <w:ind w:left="0" w:right="0" w:firstLine="300" w:firstLineChars="150"/>
+      </w:pPr>
+      <w:bookmarkStart w:id="0" w:name="_GoBack"/>
+      <w:bookmarkEnd w:id="0"/>
+      <w:r>
+        <w:rPr>
+          <w:rFonts w:hint="default" w:ascii="Consolas" w:hAnsi="Consolas" w:eastAsia="Consolas" w:cs="Consolas"/>
+          <w:color w:val="000000"/>
+          <w:sz w:val="20"/>
+          <w:szCs w:val="20"/>
+          <w:shd w:val="clear" w:fill="FFFFFF"/>
+        </w:rPr>
+        <w:t>}</w:t>
+      </w:r>
+    </w:p>
+    <w:p>
+      <w:pPr>
+        <w:pStyle w:val="5"/>
+        <w:keepNext w:val="0"/>
+        <w:keepLines w:val="0"/>
+        <w:widowControl/>
+        <w:suppressLineNumbers w:val="0"/>
+        <w:spacing w:before="0" w:beforeAutospacing="0" w:after="0" w:afterAutospacing="0"/>
+        <w:ind w:left="0" w:right="0"/>
+      </w:pPr>
+      <w:r>
+        <w:rPr>
+          <w:rFonts w:hint="default" w:ascii="Consolas" w:hAnsi="Consolas" w:eastAsia="Consolas" w:cs="Consolas"/>
+          <w:color w:val="000000"/>
+          <w:sz w:val="20"/>
+          <w:szCs w:val="20"/>
+          <w:shd w:val="clear" w:fill="FFFFFF"/>
+        </w:rPr>
+        <w:t>}</w:t>
+      </w:r>
+    </w:p>
+    <w:p>
+      <w:pPr>
+        <w:pStyle w:val="5"/>
+        <w:keepNext w:val="0"/>
+        <w:keepLines w:val="0"/>
+        <w:widowControl/>
+        <w:suppressLineNumbers w:val="0"/>
+        <w:spacing w:before="0" w:beforeAutospacing="0" w:after="0" w:afterAutospacing="0"/>
+        <w:ind w:left="0" w:right="0"/>
+        <w:rPr>
+          <w:rFonts w:hint="default" w:ascii="Consolas" w:hAnsi="Consolas" w:eastAsia="Consolas" w:cs="Consolas"/>
+          <w:color w:val="000000"/>
+          <w:sz w:val="20"/>
+          <w:szCs w:val="20"/>
+          <w:shd w:val="clear" w:fill="FFFFFF"/>
+          <w:lang w:val="en-IN"/>
+        </w:rPr>
+      </w:pPr>
+    </w:p>
+    <w:p>
+      <w:pPr>
+        <w:pStyle w:val="5"/>
+        <w:keepNext w:val="0"/>
+        <w:keepLines w:val="0"/>
+        <w:widowControl/>
+        <w:suppressLineNumbers w:val="0"/>
+        <w:spacing w:before="0" w:beforeAutospacing="0" w:after="0" w:afterAutospacing="0"/>
+        <w:ind w:left="0" w:right="0"/>
+        <w:rPr>
+          <w:rFonts w:hint="default" w:ascii="Consolas" w:hAnsi="Consolas" w:eastAsia="Consolas" w:cs="Consolas"/>
+          <w:color w:val="000000"/>
+          <w:sz w:val="20"/>
+          <w:szCs w:val="20"/>
+          <w:shd w:val="clear" w:fill="FFFFFF"/>
+          <w:lang w:val="en-IN"/>
+        </w:rPr>
+      </w:pPr>
+    </w:p>
+    <w:p>
+      <w:pPr>
+        <w:pStyle w:val="5"/>
+        <w:keepNext w:val="0"/>
+        <w:keepLines w:val="0"/>
+        <w:widowControl/>
+        <w:suppressLineNumbers w:val="0"/>
+        <w:spacing w:before="0" w:beforeAutospacing="0" w:after="0" w:afterAutospacing="0"/>
+        <w:ind w:left="0" w:right="0"/>
+        <w:rPr>
+          <w:rFonts w:hint="default" w:ascii="Consolas" w:hAnsi="Consolas" w:eastAsia="Consolas" w:cs="Consolas"/>
+          <w:color w:val="000000"/>
+          <w:sz w:val="20"/>
+          <w:szCs w:val="20"/>
+          <w:shd w:val="clear" w:fill="FFFFFF"/>
+          <w:lang w:val="en-IN"/>
+        </w:rPr>
+      </w:pPr>
+    </w:p>
+    <w:p>
+      <w:pPr>
+        <w:pStyle w:val="5"/>
+        <w:keepNext w:val="0"/>
+        <w:keepLines w:val="0"/>
+        <w:widowControl/>
+        <w:numPr>
+          <w:ilvl w:val="0"/>
+          <w:numId w:val="0"/>
+        </w:numPr>
+        <w:suppressLineNumbers w:val="0"/>
+        <w:spacing w:before="0" w:beforeAutospacing="0" w:after="0" w:afterAutospacing="0"/>
+        <w:ind w:right="0" w:rightChars="0"/>
+        <w:jc w:val="left"/>
+        <w:rPr>
+          <w:rFonts w:hint="default" w:ascii="Consolas" w:hAnsi="Consolas" w:eastAsia="Consolas" w:cs="Consolas"/>
+          <w:color w:val="000000"/>
+          <w:sz w:val="20"/>
+          <w:szCs w:val="20"/>
+          <w:shd w:val="clear" w:fill="FFFFFF"/>
+          <w:lang w:val="en-IN"/>
         </w:rPr>
       </w:pPr>
     </w:p>

</xml_diff>

<commit_message>
Details of Application Configurations
</commit_message>
<xml_diff>
--- a/SpringBoot Journal Application.docx
+++ b/SpringBoot Journal Application.docx
@@ -45309,77 +45309,235 @@
         <w:spacing w:before="0" w:beforeAutospacing="0" w:after="0" w:afterAutospacing="0"/>
         <w:ind w:left="0" w:right="0" w:firstLine="300" w:firstLineChars="150"/>
       </w:pPr>
+      <w:r>
+        <w:rPr>
+          <w:rFonts w:hint="default" w:ascii="Consolas" w:hAnsi="Consolas" w:eastAsia="Consolas" w:cs="Consolas"/>
+          <w:color w:val="000000"/>
+          <w:sz w:val="20"/>
+          <w:szCs w:val="20"/>
+          <w:shd w:val="clear" w:fill="FFFFFF"/>
+        </w:rPr>
+        <w:t>}</w:t>
+      </w:r>
+    </w:p>
+    <w:p>
+      <w:pPr>
+        <w:pStyle w:val="5"/>
+        <w:keepNext w:val="0"/>
+        <w:keepLines w:val="0"/>
+        <w:widowControl/>
+        <w:suppressLineNumbers w:val="0"/>
+        <w:spacing w:before="0" w:beforeAutospacing="0" w:after="0" w:afterAutospacing="0"/>
+        <w:ind w:left="0" w:right="0"/>
+      </w:pPr>
+      <w:r>
+        <w:rPr>
+          <w:rFonts w:hint="default" w:ascii="Consolas" w:hAnsi="Consolas" w:eastAsia="Consolas" w:cs="Consolas"/>
+          <w:color w:val="000000"/>
+          <w:sz w:val="20"/>
+          <w:szCs w:val="20"/>
+          <w:shd w:val="clear" w:fill="FFFFFF"/>
+        </w:rPr>
+        <w:t>}</w:t>
+      </w:r>
+    </w:p>
+    <w:p>
+      <w:pPr>
+        <w:pStyle w:val="5"/>
+        <w:keepNext w:val="0"/>
+        <w:keepLines w:val="0"/>
+        <w:widowControl/>
+        <w:suppressLineNumbers w:val="0"/>
+        <w:spacing w:before="0" w:beforeAutospacing="0" w:after="0" w:afterAutospacing="0"/>
+        <w:ind w:left="0" w:right="0"/>
+        <w:rPr>
+          <w:rFonts w:hint="default" w:ascii="Consolas" w:hAnsi="Consolas" w:eastAsia="Consolas" w:cs="Consolas"/>
+          <w:color w:val="000000"/>
+          <w:sz w:val="20"/>
+          <w:szCs w:val="20"/>
+          <w:shd w:val="clear" w:fill="FFFFFF"/>
+          <w:lang w:val="en-IN"/>
+        </w:rPr>
+      </w:pPr>
+    </w:p>
+    <w:p>
+      <w:pPr>
+        <w:pStyle w:val="5"/>
+        <w:keepNext w:val="0"/>
+        <w:keepLines w:val="0"/>
+        <w:widowControl/>
+        <w:suppressLineNumbers w:val="0"/>
+        <w:spacing w:before="0" w:beforeAutospacing="0" w:after="0" w:afterAutospacing="0"/>
+        <w:ind w:left="0" w:right="0"/>
+        <w:rPr>
+          <w:rFonts w:hint="default" w:ascii="Consolas" w:hAnsi="Consolas" w:eastAsia="Consolas" w:cs="Consolas"/>
+          <w:b/>
+          <w:bCs/>
+          <w:color w:val="C55A11" w:themeColor="accent2" w:themeShade="BF"/>
+          <w:sz w:val="28"/>
+          <w:szCs w:val="28"/>
+          <w:shd w:val="clear" w:fill="FFFFFF"/>
+          <w:lang w:val="en-US"/>
+        </w:rPr>
+      </w:pPr>
+      <w:r>
+        <w:rPr>
+          <w:rFonts w:hint="default" w:ascii="Consolas" w:hAnsi="Consolas" w:eastAsia="Consolas" w:cs="Consolas"/>
+          <w:b/>
+          <w:bCs/>
+          <w:color w:val="C55A11" w:themeColor="accent2" w:themeShade="BF"/>
+          <w:sz w:val="28"/>
+          <w:szCs w:val="28"/>
+          <w:shd w:val="clear" w:fill="FFFFFF"/>
+          <w:lang w:val="en-US"/>
+        </w:rPr>
+        <w:t>To use Maven Command</w:t>
+      </w:r>
+    </w:p>
+    <w:p>
+      <w:pPr>
+        <w:pStyle w:val="5"/>
+        <w:keepNext w:val="0"/>
+        <w:keepLines w:val="0"/>
+        <w:widowControl/>
+        <w:suppressLineNumbers w:val="0"/>
+        <w:spacing w:before="0" w:beforeAutospacing="0" w:after="0" w:afterAutospacing="0"/>
+        <w:ind w:left="0" w:right="0"/>
+        <w:rPr>
+          <w:rFonts w:hint="default" w:ascii="Consolas" w:hAnsi="Consolas" w:eastAsia="Consolas" w:cs="Consolas"/>
+          <w:color w:val="000000"/>
+          <w:sz w:val="20"/>
+          <w:szCs w:val="20"/>
+          <w:shd w:val="clear" w:fill="FFFFFF"/>
+          <w:lang w:val="en-US"/>
+        </w:rPr>
+      </w:pPr>
+      <w:r>
+        <w:rPr>
+          <w:rFonts w:hint="default" w:ascii="Consolas" w:hAnsi="Consolas" w:eastAsia="Consolas" w:cs="Consolas"/>
+          <w:color w:val="000000"/>
+          <w:sz w:val="20"/>
+          <w:szCs w:val="20"/>
+          <w:shd w:val="clear" w:fill="FFFFFF"/>
+          <w:lang w:val="en-US"/>
+        </w:rPr>
+        <w:t>Generally to use maven command there are multiple options as: we can run as maven build from the run option and then we can run through the command line but go to the directory mentioned like</w:t>
+      </w:r>
+    </w:p>
+    <w:p>
+      <w:pPr>
+        <w:pStyle w:val="5"/>
+        <w:keepNext w:val="0"/>
+        <w:keepLines w:val="0"/>
+        <w:widowControl/>
+        <w:suppressLineNumbers w:val="0"/>
+        <w:spacing w:before="0" w:beforeAutospacing="0" w:after="0" w:afterAutospacing="0"/>
+        <w:ind w:left="0" w:right="0"/>
+        <w:rPr>
+          <w:rFonts w:hint="default" w:ascii="Consolas" w:hAnsi="Consolas" w:eastAsia="Consolas"/>
+          <w:color w:val="000000"/>
+          <w:sz w:val="20"/>
+          <w:szCs w:val="20"/>
+          <w:shd w:val="clear" w:fill="FFFFFF"/>
+          <w:lang w:val="en-US"/>
+        </w:rPr>
+      </w:pPr>
+      <w:r>
+        <w:rPr>
+          <w:rFonts w:hint="default" w:ascii="Consolas" w:hAnsi="Consolas" w:eastAsia="Consolas"/>
+          <w:color w:val="000000"/>
+          <w:sz w:val="20"/>
+          <w:szCs w:val="20"/>
+          <w:shd w:val="clear" w:fill="FFFFFF"/>
+          <w:lang w:val="en-US"/>
+        </w:rPr>
+        <w:t>cd /d D:\SpringBoot Revision\journalApp</w:t>
+      </w:r>
+    </w:p>
+    <w:p>
+      <w:pPr>
+        <w:pStyle w:val="5"/>
+        <w:keepNext w:val="0"/>
+        <w:keepLines w:val="0"/>
+        <w:widowControl/>
+        <w:suppressLineNumbers w:val="0"/>
+        <w:spacing w:before="0" w:beforeAutospacing="0" w:after="0" w:afterAutospacing="0"/>
+        <w:ind w:left="0" w:right="0"/>
+        <w:rPr>
+          <w:rFonts w:hint="default" w:ascii="Consolas" w:hAnsi="Consolas" w:eastAsia="Consolas"/>
+          <w:color w:val="000000"/>
+          <w:sz w:val="20"/>
+          <w:szCs w:val="20"/>
+          <w:shd w:val="clear" w:fill="FFFFFF"/>
+          <w:lang w:val="en-US"/>
+        </w:rPr>
+      </w:pPr>
+      <w:r>
+        <w:rPr>
+          <w:rFonts w:hint="default" w:ascii="Consolas" w:hAnsi="Consolas" w:eastAsia="Consolas"/>
+          <w:color w:val="000000"/>
+          <w:sz w:val="20"/>
+          <w:szCs w:val="20"/>
+          <w:shd w:val="clear" w:fill="FFFFFF"/>
+          <w:lang w:val="en-US"/>
+        </w:rPr>
+        <w:t>Then use mvnw &lt;command&gt;</w:t>
+      </w:r>
       <w:bookmarkStart w:id="0" w:name="_GoBack"/>
       <w:bookmarkEnd w:id="0"/>
-      <w:r>
-        <w:rPr>
-          <w:rFonts w:hint="default" w:ascii="Consolas" w:hAnsi="Consolas" w:eastAsia="Consolas" w:cs="Consolas"/>
-          <w:color w:val="000000"/>
-          <w:sz w:val="20"/>
-          <w:szCs w:val="20"/>
-          <w:shd w:val="clear" w:fill="FFFFFF"/>
-        </w:rPr>
-        <w:t>}</w:t>
-      </w:r>
-    </w:p>
-    <w:p>
-      <w:pPr>
-        <w:pStyle w:val="5"/>
-        <w:keepNext w:val="0"/>
-        <w:keepLines w:val="0"/>
-        <w:widowControl/>
-        <w:suppressLineNumbers w:val="0"/>
-        <w:spacing w:before="0" w:beforeAutospacing="0" w:after="0" w:afterAutospacing="0"/>
-        <w:ind w:left="0" w:right="0"/>
-      </w:pPr>
-      <w:r>
-        <w:rPr>
-          <w:rFonts w:hint="default" w:ascii="Consolas" w:hAnsi="Consolas" w:eastAsia="Consolas" w:cs="Consolas"/>
-          <w:color w:val="000000"/>
-          <w:sz w:val="20"/>
-          <w:szCs w:val="20"/>
-          <w:shd w:val="clear" w:fill="FFFFFF"/>
-        </w:rPr>
-        <w:t>}</w:t>
-      </w:r>
-    </w:p>
-    <w:p>
-      <w:pPr>
-        <w:pStyle w:val="5"/>
-        <w:keepNext w:val="0"/>
-        <w:keepLines w:val="0"/>
-        <w:widowControl/>
-        <w:suppressLineNumbers w:val="0"/>
-        <w:spacing w:before="0" w:beforeAutospacing="0" w:after="0" w:afterAutospacing="0"/>
-        <w:ind w:left="0" w:right="0"/>
-        <w:rPr>
-          <w:rFonts w:hint="default" w:ascii="Consolas" w:hAnsi="Consolas" w:eastAsia="Consolas" w:cs="Consolas"/>
-          <w:color w:val="000000"/>
-          <w:sz w:val="20"/>
-          <w:szCs w:val="20"/>
-          <w:shd w:val="clear" w:fill="FFFFFF"/>
-          <w:lang w:val="en-IN"/>
-        </w:rPr>
-      </w:pPr>
-    </w:p>
-    <w:p>
-      <w:pPr>
-        <w:pStyle w:val="5"/>
-        <w:keepNext w:val="0"/>
-        <w:keepLines w:val="0"/>
-        <w:widowControl/>
-        <w:suppressLineNumbers w:val="0"/>
-        <w:spacing w:before="0" w:beforeAutospacing="0" w:after="0" w:afterAutospacing="0"/>
-        <w:ind w:left="0" w:right="0"/>
-        <w:rPr>
-          <w:rFonts w:hint="default" w:ascii="Consolas" w:hAnsi="Consolas" w:eastAsia="Consolas" w:cs="Consolas"/>
-          <w:color w:val="000000"/>
-          <w:sz w:val="20"/>
-          <w:szCs w:val="20"/>
-          <w:shd w:val="clear" w:fill="FFFFFF"/>
-          <w:lang w:val="en-IN"/>
-        </w:rPr>
-      </w:pPr>
+    </w:p>
+    <w:p>
+      <w:pPr>
+        <w:pStyle w:val="5"/>
+        <w:keepNext w:val="0"/>
+        <w:keepLines w:val="0"/>
+        <w:widowControl/>
+        <w:suppressLineNumbers w:val="0"/>
+        <w:spacing w:before="0" w:beforeAutospacing="0" w:after="0" w:afterAutospacing="0"/>
+        <w:ind w:left="0" w:right="0"/>
+        <w:rPr>
+          <w:rFonts w:hint="default" w:ascii="Consolas" w:hAnsi="Consolas" w:eastAsia="Consolas"/>
+          <w:color w:val="000000"/>
+          <w:sz w:val="20"/>
+          <w:szCs w:val="20"/>
+          <w:shd w:val="clear" w:fill="FFFFFF"/>
+          <w:lang w:val="en-US"/>
+        </w:rPr>
+      </w:pPr>
+    </w:p>
+    <w:p>
+      <w:pPr>
+        <w:pStyle w:val="5"/>
+        <w:keepNext w:val="0"/>
+        <w:keepLines w:val="0"/>
+        <w:widowControl/>
+        <w:suppressLineNumbers w:val="0"/>
+        <w:spacing w:before="0" w:beforeAutospacing="0" w:after="0" w:afterAutospacing="0"/>
+        <w:ind w:left="0" w:right="0"/>
+        <w:rPr>
+          <w:rFonts w:hint="default" w:ascii="Consolas" w:hAnsi="Consolas" w:eastAsia="Consolas"/>
+          <w:b/>
+          <w:bCs/>
+          <w:color w:val="2F5597" w:themeColor="accent5" w:themeShade="BF"/>
+          <w:sz w:val="36"/>
+          <w:szCs w:val="36"/>
+          <w:shd w:val="clear" w:fill="FFFFFF"/>
+          <w:lang w:val="en-US"/>
+        </w:rPr>
+      </w:pPr>
+      <w:r>
+        <w:rPr>
+          <w:rFonts w:hint="default" w:ascii="Consolas" w:hAnsi="Consolas" w:eastAsia="Consolas"/>
+          <w:b/>
+          <w:bCs/>
+          <w:color w:val="2F5597" w:themeColor="accent5" w:themeShade="BF"/>
+          <w:sz w:val="36"/>
+          <w:szCs w:val="36"/>
+          <w:shd w:val="clear" w:fill="FFFFFF"/>
+          <w:lang w:val="en-US"/>
+        </w:rPr>
+        <w:t>Application Configurations</w:t>
+      </w:r>
     </w:p>
     <w:p>
       <w:pPr>
@@ -45420,9 +45578,709 @@
           <w:sz w:val="20"/>
           <w:szCs w:val="20"/>
           <w:shd w:val="clear" w:fill="FFFFFF"/>
-          <w:lang w:val="en-IN"/>
-        </w:rPr>
-      </w:pPr>
+          <w:lang w:val="en-US"/>
+        </w:rPr>
+      </w:pPr>
+      <w:r>
+        <w:rPr>
+          <w:rFonts w:hint="default" w:ascii="Consolas" w:hAnsi="Consolas" w:eastAsia="Consolas" w:cs="Consolas"/>
+          <w:color w:val="000000"/>
+          <w:sz w:val="20"/>
+          <w:szCs w:val="20"/>
+          <w:shd w:val="clear" w:fill="FFFFFF"/>
+          <w:lang w:val="en-US"/>
+        </w:rPr>
+        <w:t>There are multiple ways to configure applications such as:</w:t>
+      </w:r>
+    </w:p>
+    <w:p>
+      <w:pPr>
+        <w:pStyle w:val="5"/>
+        <w:keepNext w:val="0"/>
+        <w:keepLines w:val="0"/>
+        <w:widowControl/>
+        <w:numPr>
+          <w:ilvl w:val="0"/>
+          <w:numId w:val="7"/>
+        </w:numPr>
+        <w:suppressLineNumbers w:val="0"/>
+        <w:spacing w:before="0" w:beforeAutospacing="0" w:after="0" w:afterAutospacing="0"/>
+        <w:ind w:left="420" w:leftChars="0" w:right="0" w:rightChars="0"/>
+        <w:jc w:val="left"/>
+        <w:rPr>
+          <w:rFonts w:hint="default" w:ascii="Consolas" w:hAnsi="Consolas" w:eastAsia="Consolas" w:cs="Consolas"/>
+          <w:color w:val="000000"/>
+          <w:sz w:val="20"/>
+          <w:szCs w:val="20"/>
+          <w:shd w:val="clear" w:fill="FFFFFF"/>
+          <w:lang w:val="en-US"/>
+        </w:rPr>
+      </w:pPr>
+      <w:r>
+        <w:rPr>
+          <w:rFonts w:hint="default" w:ascii="Consolas" w:hAnsi="Consolas" w:eastAsia="Consolas" w:cs="Consolas"/>
+          <w:color w:val="000000"/>
+          <w:sz w:val="20"/>
+          <w:szCs w:val="20"/>
+          <w:shd w:val="clear" w:fill="FFFFFF"/>
+          <w:lang w:val="en-US"/>
+        </w:rPr>
+        <w:t>application.properties</w:t>
+      </w:r>
+    </w:p>
+    <w:p>
+      <w:pPr>
+        <w:pStyle w:val="5"/>
+        <w:keepNext w:val="0"/>
+        <w:keepLines w:val="0"/>
+        <w:widowControl/>
+        <w:numPr>
+          <w:numId w:val="0"/>
+        </w:numPr>
+        <w:suppressLineNumbers w:val="0"/>
+        <w:spacing w:before="0" w:beforeAutospacing="0" w:after="0" w:afterAutospacing="0"/>
+        <w:ind w:right="0" w:rightChars="0"/>
+        <w:jc w:val="left"/>
+        <w:rPr>
+          <w:rFonts w:hint="default" w:ascii="Consolas" w:hAnsi="Consolas" w:eastAsia="Consolas" w:cs="Consolas"/>
+          <w:color w:val="000000"/>
+          <w:sz w:val="20"/>
+          <w:szCs w:val="20"/>
+          <w:shd w:val="clear" w:fill="FFFFFF"/>
+          <w:lang w:val="en-US"/>
+        </w:rPr>
+      </w:pPr>
+      <w:r>
+        <w:rPr>
+          <w:rFonts w:hint="default" w:ascii="Consolas" w:hAnsi="Consolas" w:eastAsia="Consolas" w:cs="Consolas"/>
+          <w:color w:val="000000"/>
+          <w:sz w:val="20"/>
+          <w:szCs w:val="20"/>
+          <w:shd w:val="clear" w:fill="FFFFFF"/>
+          <w:lang w:val="en-US"/>
+        </w:rPr>
+        <w:t xml:space="preserve">     -&gt;Uses the dot notations to use the exact class and field property method.</w:t>
+      </w:r>
+    </w:p>
+    <w:p>
+      <w:pPr>
+        <w:pStyle w:val="5"/>
+        <w:keepNext w:val="0"/>
+        <w:keepLines w:val="0"/>
+        <w:widowControl/>
+        <w:numPr>
+          <w:numId w:val="0"/>
+        </w:numPr>
+        <w:suppressLineNumbers w:val="0"/>
+        <w:spacing w:before="0" w:beforeAutospacing="0" w:after="0" w:afterAutospacing="0"/>
+        <w:ind w:right="0" w:rightChars="0" w:firstLine="538" w:firstLineChars="269"/>
+        <w:jc w:val="left"/>
+        <w:rPr>
+          <w:rFonts w:hint="default" w:ascii="Consolas" w:hAnsi="Consolas" w:eastAsia="Consolas" w:cs="Consolas"/>
+          <w:color w:val="000000"/>
+          <w:sz w:val="20"/>
+          <w:szCs w:val="20"/>
+          <w:shd w:val="clear" w:fill="FFFFFF"/>
+          <w:lang w:val="en-US"/>
+        </w:rPr>
+      </w:pPr>
+      <w:r>
+        <w:rPr>
+          <w:rFonts w:hint="default" w:ascii="Consolas" w:hAnsi="Consolas" w:eastAsia="Consolas" w:cs="Consolas"/>
+          <w:color w:val="000000"/>
+          <w:sz w:val="20"/>
+          <w:szCs w:val="20"/>
+          <w:shd w:val="clear" w:fill="FFFFFF"/>
+          <w:lang w:val="en-US"/>
+        </w:rPr>
+        <w:t>-&gt;Example : spring.data.moongodb.auto-index-creation=true</w:t>
+      </w:r>
+    </w:p>
+    <w:p>
+      <w:pPr>
+        <w:pStyle w:val="5"/>
+        <w:keepNext w:val="0"/>
+        <w:keepLines w:val="0"/>
+        <w:widowControl/>
+        <w:numPr>
+          <w:numId w:val="0"/>
+        </w:numPr>
+        <w:suppressLineNumbers w:val="0"/>
+        <w:spacing w:before="0" w:beforeAutospacing="0" w:after="0" w:afterAutospacing="0"/>
+        <w:ind w:right="0" w:rightChars="0" w:firstLine="439"/>
+        <w:jc w:val="left"/>
+        <w:rPr>
+          <w:rFonts w:hint="default" w:ascii="Consolas" w:hAnsi="Consolas" w:eastAsia="Consolas" w:cs="Consolas"/>
+          <w:color w:val="000000"/>
+          <w:sz w:val="20"/>
+          <w:szCs w:val="20"/>
+          <w:shd w:val="clear" w:fill="FFFFFF"/>
+          <w:lang w:val="en-US"/>
+        </w:rPr>
+      </w:pPr>
+    </w:p>
+    <w:p>
+      <w:pPr>
+        <w:pStyle w:val="5"/>
+        <w:keepNext w:val="0"/>
+        <w:keepLines w:val="0"/>
+        <w:widowControl/>
+        <w:numPr>
+          <w:ilvl w:val="0"/>
+          <w:numId w:val="7"/>
+        </w:numPr>
+        <w:suppressLineNumbers w:val="0"/>
+        <w:spacing w:before="0" w:beforeAutospacing="0" w:after="0" w:afterAutospacing="0"/>
+        <w:ind w:left="420" w:leftChars="0" w:right="0" w:rightChars="0"/>
+        <w:jc w:val="left"/>
+        <w:rPr>
+          <w:rFonts w:hint="default" w:ascii="Consolas" w:hAnsi="Consolas" w:eastAsia="Consolas" w:cs="Consolas"/>
+          <w:color w:val="000000"/>
+          <w:sz w:val="20"/>
+          <w:szCs w:val="20"/>
+          <w:shd w:val="clear" w:fill="FFFFFF"/>
+          <w:lang w:val="en-US"/>
+        </w:rPr>
+      </w:pPr>
+      <w:r>
+        <w:rPr>
+          <w:rFonts w:hint="default" w:ascii="Consolas" w:hAnsi="Consolas" w:eastAsia="Consolas" w:cs="Consolas"/>
+          <w:color w:val="000000"/>
+          <w:sz w:val="20"/>
+          <w:szCs w:val="20"/>
+          <w:shd w:val="clear" w:fill="FFFFFF"/>
+          <w:lang w:val="en-US"/>
+        </w:rPr>
+        <w:t>application.yml</w:t>
+      </w:r>
+    </w:p>
+    <w:p>
+      <w:pPr>
+        <w:pStyle w:val="5"/>
+        <w:keepNext w:val="0"/>
+        <w:keepLines w:val="0"/>
+        <w:widowControl/>
+        <w:numPr>
+          <w:ilvl w:val="0"/>
+          <w:numId w:val="0"/>
+        </w:numPr>
+        <w:suppressLineNumbers w:val="0"/>
+        <w:spacing w:before="0" w:beforeAutospacing="0" w:after="0" w:afterAutospacing="0"/>
+        <w:ind w:right="0" w:rightChars="0"/>
+        <w:jc w:val="left"/>
+        <w:rPr>
+          <w:rFonts w:hint="default" w:ascii="Consolas" w:hAnsi="Consolas" w:eastAsia="Consolas" w:cs="Consolas"/>
+          <w:color w:val="000000"/>
+          <w:sz w:val="20"/>
+          <w:szCs w:val="20"/>
+          <w:shd w:val="clear" w:fill="FFFFFF"/>
+          <w:lang w:val="en-US"/>
+        </w:rPr>
+      </w:pPr>
+      <w:r>
+        <w:rPr>
+          <w:rFonts w:hint="default" w:ascii="Consolas" w:hAnsi="Consolas" w:eastAsia="Consolas" w:cs="Consolas"/>
+          <w:color w:val="000000"/>
+          <w:sz w:val="20"/>
+          <w:szCs w:val="20"/>
+          <w:shd w:val="clear" w:fill="FFFFFF"/>
+          <w:lang w:val="en-US"/>
+        </w:rPr>
+        <w:t xml:space="preserve">     -&gt;Uses the colon and indentations to show the class and field property method.</w:t>
+      </w:r>
+    </w:p>
+    <w:p>
+      <w:pPr>
+        <w:pStyle w:val="5"/>
+        <w:keepNext w:val="0"/>
+        <w:keepLines w:val="0"/>
+        <w:widowControl/>
+        <w:numPr>
+          <w:ilvl w:val="0"/>
+          <w:numId w:val="0"/>
+        </w:numPr>
+        <w:suppressLineNumbers w:val="0"/>
+        <w:spacing w:before="0" w:beforeAutospacing="0" w:after="0" w:afterAutospacing="0"/>
+        <w:ind w:right="0" w:rightChars="0" w:firstLine="538" w:firstLineChars="269"/>
+        <w:jc w:val="left"/>
+        <w:rPr>
+          <w:rFonts w:hint="default" w:ascii="Consolas" w:hAnsi="Consolas" w:eastAsia="Consolas" w:cs="Consolas"/>
+          <w:color w:val="000000"/>
+          <w:sz w:val="20"/>
+          <w:szCs w:val="20"/>
+          <w:shd w:val="clear" w:fill="FFFFFF"/>
+          <w:lang w:val="en-US"/>
+        </w:rPr>
+      </w:pPr>
+      <w:r>
+        <w:rPr>
+          <w:rFonts w:hint="default" w:ascii="Consolas" w:hAnsi="Consolas" w:eastAsia="Consolas" w:cs="Consolas"/>
+          <w:color w:val="000000"/>
+          <w:sz w:val="20"/>
+          <w:szCs w:val="20"/>
+          <w:shd w:val="clear" w:fill="FFFFFF"/>
+          <w:lang w:val="en-US"/>
+        </w:rPr>
+        <w:t>-&gt;Example : spring:</w:t>
+      </w:r>
+    </w:p>
+    <w:p>
+      <w:pPr>
+        <w:pStyle w:val="5"/>
+        <w:keepNext w:val="0"/>
+        <w:keepLines w:val="0"/>
+        <w:widowControl/>
+        <w:numPr>
+          <w:ilvl w:val="0"/>
+          <w:numId w:val="0"/>
+        </w:numPr>
+        <w:suppressLineNumbers w:val="0"/>
+        <w:spacing w:before="0" w:beforeAutospacing="0" w:after="0" w:afterAutospacing="0"/>
+        <w:ind w:right="0" w:rightChars="0" w:firstLine="538" w:firstLineChars="269"/>
+        <w:jc w:val="left"/>
+        <w:rPr>
+          <w:rFonts w:hint="default" w:ascii="Consolas" w:hAnsi="Consolas" w:eastAsia="Consolas" w:cs="Consolas"/>
+          <w:color w:val="000000"/>
+          <w:sz w:val="20"/>
+          <w:szCs w:val="20"/>
+          <w:shd w:val="clear" w:fill="FFFFFF"/>
+          <w:lang w:val="en-US"/>
+        </w:rPr>
+      </w:pPr>
+      <w:r>
+        <w:rPr>
+          <w:rFonts w:hint="default" w:ascii="Consolas" w:hAnsi="Consolas" w:eastAsia="Consolas" w:cs="Consolas"/>
+          <w:color w:val="000000"/>
+          <w:sz w:val="20"/>
+          <w:szCs w:val="20"/>
+          <w:shd w:val="clear" w:fill="FFFFFF"/>
+          <w:lang w:val="en-US"/>
+        </w:rPr>
+        <w:t xml:space="preserve">              data:</w:t>
+      </w:r>
+    </w:p>
+    <w:p>
+      <w:pPr>
+        <w:pStyle w:val="5"/>
+        <w:keepNext w:val="0"/>
+        <w:keepLines w:val="0"/>
+        <w:widowControl/>
+        <w:numPr>
+          <w:ilvl w:val="0"/>
+          <w:numId w:val="0"/>
+        </w:numPr>
+        <w:suppressLineNumbers w:val="0"/>
+        <w:spacing w:before="0" w:beforeAutospacing="0" w:after="0" w:afterAutospacing="0"/>
+        <w:ind w:right="0" w:rightChars="0" w:firstLine="538" w:firstLineChars="269"/>
+        <w:jc w:val="left"/>
+        <w:rPr>
+          <w:rFonts w:hint="default" w:ascii="Consolas" w:hAnsi="Consolas" w:eastAsia="Consolas" w:cs="Consolas"/>
+          <w:color w:val="000000"/>
+          <w:sz w:val="20"/>
+          <w:szCs w:val="20"/>
+          <w:shd w:val="clear" w:fill="FFFFFF"/>
+          <w:lang w:val="en-US"/>
+        </w:rPr>
+      </w:pPr>
+      <w:r>
+        <w:rPr>
+          <w:rFonts w:hint="default" w:ascii="Consolas" w:hAnsi="Consolas" w:eastAsia="Consolas" w:cs="Consolas"/>
+          <w:color w:val="000000"/>
+          <w:sz w:val="20"/>
+          <w:szCs w:val="20"/>
+          <w:shd w:val="clear" w:fill="FFFFFF"/>
+          <w:lang w:val="en-US"/>
+        </w:rPr>
+        <w:t xml:space="preserve">                mongodb:</w:t>
+      </w:r>
+    </w:p>
+    <w:p>
+      <w:pPr>
+        <w:pStyle w:val="5"/>
+        <w:keepNext w:val="0"/>
+        <w:keepLines w:val="0"/>
+        <w:widowControl/>
+        <w:numPr>
+          <w:ilvl w:val="0"/>
+          <w:numId w:val="0"/>
+        </w:numPr>
+        <w:suppressLineNumbers w:val="0"/>
+        <w:spacing w:before="0" w:beforeAutospacing="0" w:after="0" w:afterAutospacing="0"/>
+        <w:ind w:right="0" w:rightChars="0" w:firstLine="538" w:firstLineChars="269"/>
+        <w:jc w:val="left"/>
+        <w:rPr>
+          <w:rFonts w:hint="default" w:ascii="Consolas" w:hAnsi="Consolas" w:eastAsia="Consolas" w:cs="Consolas"/>
+          <w:color w:val="000000"/>
+          <w:sz w:val="20"/>
+          <w:szCs w:val="20"/>
+          <w:shd w:val="clear" w:fill="FFFFFF"/>
+          <w:lang w:val="en-US"/>
+        </w:rPr>
+      </w:pPr>
+      <w:r>
+        <w:rPr>
+          <w:rFonts w:hint="default" w:ascii="Consolas" w:hAnsi="Consolas" w:eastAsia="Consolas" w:cs="Consolas"/>
+          <w:color w:val="000000"/>
+          <w:sz w:val="20"/>
+          <w:szCs w:val="20"/>
+          <w:shd w:val="clear" w:fill="FFFFFF"/>
+          <w:lang w:val="en-US"/>
+        </w:rPr>
+        <w:t xml:space="preserve">                  auto-index-creation: true</w:t>
+      </w:r>
+    </w:p>
+    <w:p>
+      <w:pPr>
+        <w:pStyle w:val="5"/>
+        <w:keepNext w:val="0"/>
+        <w:keepLines w:val="0"/>
+        <w:widowControl/>
+        <w:numPr>
+          <w:numId w:val="0"/>
+        </w:numPr>
+        <w:suppressLineNumbers w:val="0"/>
+        <w:spacing w:before="0" w:beforeAutospacing="0" w:after="0" w:afterAutospacing="0"/>
+        <w:ind w:right="0" w:rightChars="0"/>
+        <w:jc w:val="left"/>
+        <w:rPr>
+          <w:rFonts w:hint="default" w:ascii="Consolas" w:hAnsi="Consolas" w:eastAsia="Consolas" w:cs="Consolas"/>
+          <w:color w:val="000000"/>
+          <w:sz w:val="20"/>
+          <w:szCs w:val="20"/>
+          <w:shd w:val="clear" w:fill="FFFFFF"/>
+          <w:lang w:val="en-US"/>
+        </w:rPr>
+      </w:pPr>
+      <w:r>
+        <w:rPr>
+          <w:rFonts w:hint="default" w:ascii="Consolas" w:hAnsi="Consolas" w:eastAsia="Consolas" w:cs="Consolas"/>
+          <w:color w:val="000000"/>
+          <w:sz w:val="20"/>
+          <w:szCs w:val="20"/>
+          <w:shd w:val="clear" w:fill="FFFFFF"/>
+          <w:lang w:val="en-US"/>
+        </w:rPr>
+        <w:t xml:space="preserve">     -&gt;Remember,it uses 2 spaces before and after :, there should be a space </w:t>
+      </w:r>
+    </w:p>
+    <w:p>
+      <w:pPr>
+        <w:pStyle w:val="5"/>
+        <w:keepNext w:val="0"/>
+        <w:keepLines w:val="0"/>
+        <w:widowControl/>
+        <w:numPr>
+          <w:numId w:val="0"/>
+        </w:numPr>
+        <w:suppressLineNumbers w:val="0"/>
+        <w:spacing w:before="0" w:beforeAutospacing="0" w:after="0" w:afterAutospacing="0"/>
+        <w:ind w:right="0" w:rightChars="0"/>
+        <w:jc w:val="left"/>
+        <w:rPr>
+          <w:rFonts w:hint="default" w:ascii="Consolas" w:hAnsi="Consolas" w:eastAsia="Consolas" w:cs="Consolas"/>
+          <w:color w:val="000000"/>
+          <w:sz w:val="20"/>
+          <w:szCs w:val="20"/>
+          <w:shd w:val="clear" w:fill="FFFFFF"/>
+          <w:lang w:val="en-US"/>
+        </w:rPr>
+      </w:pPr>
+    </w:p>
+    <w:p>
+      <w:pPr>
+        <w:pStyle w:val="5"/>
+        <w:keepNext w:val="0"/>
+        <w:keepLines w:val="0"/>
+        <w:widowControl/>
+        <w:numPr>
+          <w:ilvl w:val="0"/>
+          <w:numId w:val="7"/>
+        </w:numPr>
+        <w:suppressLineNumbers w:val="0"/>
+        <w:spacing w:before="0" w:beforeAutospacing="0" w:after="0" w:afterAutospacing="0"/>
+        <w:ind w:left="420" w:leftChars="0" w:right="0" w:rightChars="0"/>
+        <w:jc w:val="left"/>
+        <w:rPr>
+          <w:rFonts w:hint="default" w:ascii="Consolas" w:hAnsi="Consolas" w:eastAsia="Consolas" w:cs="Consolas"/>
+          <w:color w:val="000000"/>
+          <w:sz w:val="20"/>
+          <w:szCs w:val="20"/>
+          <w:shd w:val="clear" w:fill="FFFFFF"/>
+          <w:lang w:val="en-US"/>
+        </w:rPr>
+      </w:pPr>
+      <w:r>
+        <w:rPr>
+          <w:rFonts w:hint="default" w:ascii="Consolas" w:hAnsi="Consolas" w:eastAsia="Consolas" w:cs="Consolas"/>
+          <w:color w:val="000000"/>
+          <w:sz w:val="20"/>
+          <w:szCs w:val="20"/>
+          <w:shd w:val="clear" w:fill="FFFFFF"/>
+          <w:lang w:val="en-US"/>
+        </w:rPr>
+        <w:t>Command line argument</w:t>
+      </w:r>
+    </w:p>
+    <w:p>
+      <w:pPr>
+        <w:pStyle w:val="5"/>
+        <w:keepNext w:val="0"/>
+        <w:keepLines w:val="0"/>
+        <w:widowControl/>
+        <w:numPr>
+          <w:ilvl w:val="0"/>
+          <w:numId w:val="0"/>
+        </w:numPr>
+        <w:suppressLineNumbers w:val="0"/>
+        <w:spacing w:before="0" w:beforeAutospacing="0" w:after="0" w:afterAutospacing="0"/>
+        <w:ind w:right="0" w:rightChars="0"/>
+        <w:jc w:val="left"/>
+        <w:rPr>
+          <w:rFonts w:hint="default" w:ascii="Consolas" w:hAnsi="Consolas" w:eastAsia="Consolas" w:cs="Consolas"/>
+          <w:color w:val="000000"/>
+          <w:sz w:val="20"/>
+          <w:szCs w:val="20"/>
+          <w:shd w:val="clear" w:fill="FFFFFF"/>
+          <w:lang w:val="en-US"/>
+        </w:rPr>
+      </w:pPr>
+      <w:r>
+        <w:rPr>
+          <w:rFonts w:hint="default" w:ascii="Consolas" w:hAnsi="Consolas" w:eastAsia="Consolas" w:cs="Consolas"/>
+          <w:color w:val="000000"/>
+          <w:sz w:val="20"/>
+          <w:szCs w:val="20"/>
+          <w:shd w:val="clear" w:fill="FFFFFF"/>
+          <w:lang w:val="en-US"/>
+        </w:rPr>
+        <w:t xml:space="preserve">     -&gt;It is used to pass the properties at runtime.</w:t>
+      </w:r>
+    </w:p>
+    <w:p>
+      <w:pPr>
+        <w:pStyle w:val="5"/>
+        <w:keepNext w:val="0"/>
+        <w:keepLines w:val="0"/>
+        <w:widowControl/>
+        <w:numPr>
+          <w:ilvl w:val="0"/>
+          <w:numId w:val="0"/>
+        </w:numPr>
+        <w:suppressLineNumbers w:val="0"/>
+        <w:spacing w:before="0" w:beforeAutospacing="0" w:after="0" w:afterAutospacing="0"/>
+        <w:ind w:right="0" w:rightChars="0" w:firstLine="538" w:firstLineChars="269"/>
+        <w:jc w:val="left"/>
+        <w:rPr>
+          <w:rFonts w:hint="default" w:ascii="Consolas" w:hAnsi="Consolas" w:eastAsia="Consolas" w:cs="Consolas"/>
+          <w:color w:val="000000"/>
+          <w:sz w:val="20"/>
+          <w:szCs w:val="20"/>
+          <w:shd w:val="clear" w:fill="FFFFFF"/>
+          <w:lang w:val="en-US"/>
+        </w:rPr>
+      </w:pPr>
+      <w:r>
+        <w:rPr>
+          <w:rFonts w:hint="default" w:ascii="Consolas" w:hAnsi="Consolas" w:eastAsia="Consolas" w:cs="Consolas"/>
+          <w:color w:val="000000"/>
+          <w:sz w:val="20"/>
+          <w:szCs w:val="20"/>
+          <w:shd w:val="clear" w:fill="FFFFFF"/>
+          <w:lang w:val="en-US"/>
+        </w:rPr>
+        <w:t>-&gt;Example : java --jar ./___Build File Name____.jar</w:t>
+      </w:r>
+    </w:p>
+    <w:p>
+      <w:pPr>
+        <w:pStyle w:val="5"/>
+        <w:keepNext w:val="0"/>
+        <w:keepLines w:val="0"/>
+        <w:widowControl/>
+        <w:numPr>
+          <w:numId w:val="0"/>
+        </w:numPr>
+        <w:suppressLineNumbers w:val="0"/>
+        <w:spacing w:before="0" w:beforeAutospacing="0" w:after="0" w:afterAutospacing="0"/>
+        <w:ind w:right="0" w:rightChars="0"/>
+        <w:jc w:val="left"/>
+        <w:rPr>
+          <w:rFonts w:hint="default" w:ascii="Consolas" w:hAnsi="Consolas" w:eastAsia="Consolas" w:cs="Consolas"/>
+          <w:color w:val="000000"/>
+          <w:sz w:val="20"/>
+          <w:szCs w:val="20"/>
+          <w:shd w:val="clear" w:fill="FFFFFF"/>
+          <w:lang w:val="en-US"/>
+        </w:rPr>
+      </w:pPr>
+    </w:p>
+    <w:p>
+      <w:pPr>
+        <w:pStyle w:val="5"/>
+        <w:keepNext w:val="0"/>
+        <w:keepLines w:val="0"/>
+        <w:widowControl/>
+        <w:numPr>
+          <w:ilvl w:val="0"/>
+          <w:numId w:val="7"/>
+        </w:numPr>
+        <w:suppressLineNumbers w:val="0"/>
+        <w:spacing w:before="0" w:beforeAutospacing="0" w:after="0" w:afterAutospacing="0"/>
+        <w:ind w:left="420" w:leftChars="0" w:right="0" w:rightChars="0"/>
+        <w:jc w:val="left"/>
+        <w:rPr>
+          <w:rFonts w:hint="default" w:ascii="Consolas" w:hAnsi="Consolas" w:eastAsia="Consolas" w:cs="Consolas"/>
+          <w:color w:val="000000"/>
+          <w:sz w:val="20"/>
+          <w:szCs w:val="20"/>
+          <w:shd w:val="clear" w:fill="FFFFFF"/>
+          <w:lang w:val="en-US"/>
+        </w:rPr>
+      </w:pPr>
+      <w:r>
+        <w:rPr>
+          <w:rFonts w:hint="default" w:ascii="Consolas" w:hAnsi="Consolas" w:eastAsia="Consolas" w:cs="Consolas"/>
+          <w:color w:val="000000"/>
+          <w:sz w:val="20"/>
+          <w:szCs w:val="20"/>
+          <w:shd w:val="clear" w:fill="FFFFFF"/>
+          <w:lang w:val="en-US"/>
+        </w:rPr>
+        <w:t>Run configurations</w:t>
+      </w:r>
+    </w:p>
+    <w:p>
+      <w:pPr>
+        <w:pStyle w:val="5"/>
+        <w:keepNext w:val="0"/>
+        <w:keepLines w:val="0"/>
+        <w:widowControl/>
+        <w:numPr>
+          <w:numId w:val="0"/>
+        </w:numPr>
+        <w:suppressLineNumbers w:val="0"/>
+        <w:spacing w:before="0" w:beforeAutospacing="0" w:after="0" w:afterAutospacing="0"/>
+        <w:ind w:right="0" w:rightChars="0"/>
+        <w:jc w:val="left"/>
+        <w:rPr>
+          <w:rFonts w:hint="default" w:ascii="Consolas" w:hAnsi="Consolas" w:eastAsia="Consolas" w:cs="Consolas"/>
+          <w:color w:val="000000"/>
+          <w:sz w:val="20"/>
+          <w:szCs w:val="20"/>
+          <w:shd w:val="clear" w:fill="FFFFFF"/>
+          <w:lang w:val="en-US"/>
+        </w:rPr>
+      </w:pPr>
+      <w:r>
+        <w:rPr>
+          <w:rFonts w:hint="default" w:ascii="Consolas" w:hAnsi="Consolas" w:eastAsia="Consolas" w:cs="Consolas"/>
+          <w:color w:val="000000"/>
+          <w:sz w:val="20"/>
+          <w:szCs w:val="20"/>
+          <w:shd w:val="clear" w:fill="FFFFFF"/>
+          <w:lang w:val="en-US"/>
+        </w:rPr>
+        <w:t xml:space="preserve">     -&gt;Add in program arguments</w:t>
+      </w:r>
+    </w:p>
+    <w:p>
+      <w:pPr>
+        <w:pStyle w:val="5"/>
+        <w:keepNext w:val="0"/>
+        <w:keepLines w:val="0"/>
+        <w:widowControl/>
+        <w:numPr>
+          <w:numId w:val="0"/>
+        </w:numPr>
+        <w:suppressLineNumbers w:val="0"/>
+        <w:spacing w:before="0" w:beforeAutospacing="0" w:after="0" w:afterAutospacing="0"/>
+        <w:ind w:right="0" w:rightChars="0"/>
+        <w:jc w:val="left"/>
+        <w:rPr>
+          <w:rFonts w:hint="default" w:ascii="Consolas" w:hAnsi="Consolas" w:eastAsia="Consolas" w:cs="Consolas"/>
+          <w:color w:val="000000"/>
+          <w:sz w:val="20"/>
+          <w:szCs w:val="20"/>
+          <w:shd w:val="clear" w:fill="FFFFFF"/>
+          <w:lang w:val="en-US"/>
+        </w:rPr>
+      </w:pPr>
+    </w:p>
+    <w:p>
+      <w:pPr>
+        <w:pStyle w:val="5"/>
+        <w:keepNext w:val="0"/>
+        <w:keepLines w:val="0"/>
+        <w:widowControl/>
+        <w:numPr>
+          <w:numId w:val="0"/>
+        </w:numPr>
+        <w:suppressLineNumbers w:val="0"/>
+        <w:spacing w:before="0" w:beforeAutospacing="0" w:after="0" w:afterAutospacing="0"/>
+        <w:ind w:right="0" w:rightChars="0"/>
+        <w:jc w:val="left"/>
+        <w:rPr>
+          <w:rFonts w:hint="default" w:ascii="Consolas" w:hAnsi="Consolas" w:eastAsia="Consolas" w:cs="Consolas"/>
+          <w:b/>
+          <w:bCs/>
+          <w:color w:val="548235" w:themeColor="accent6" w:themeShade="BF"/>
+          <w:sz w:val="32"/>
+          <w:szCs w:val="32"/>
+          <w:shd w:val="clear" w:fill="FFFFFF"/>
+          <w:lang w:val="en-US"/>
+        </w:rPr>
+      </w:pPr>
+      <w:r>
+        <w:rPr>
+          <w:rFonts w:hint="default" w:ascii="Consolas" w:hAnsi="Consolas" w:eastAsia="Consolas" w:cs="Consolas"/>
+          <w:b/>
+          <w:bCs/>
+          <w:color w:val="548235" w:themeColor="accent6" w:themeShade="BF"/>
+          <w:sz w:val="32"/>
+          <w:szCs w:val="32"/>
+          <w:shd w:val="clear" w:fill="FFFFFF"/>
+          <w:lang w:val="en-US"/>
+        </w:rPr>
+        <w:t>Priority:</w:t>
+      </w:r>
+    </w:p>
+    <w:p>
+      <w:pPr>
+        <w:pStyle w:val="5"/>
+        <w:keepNext w:val="0"/>
+        <w:keepLines w:val="0"/>
+        <w:widowControl/>
+        <w:numPr>
+          <w:numId w:val="0"/>
+        </w:numPr>
+        <w:suppressLineNumbers w:val="0"/>
+        <w:spacing w:before="0" w:beforeAutospacing="0" w:after="0" w:afterAutospacing="0"/>
+        <w:ind w:right="0" w:rightChars="0"/>
+        <w:jc w:val="left"/>
+        <w:rPr>
+          <w:rFonts w:hint="default" w:ascii="Consolas" w:hAnsi="Consolas" w:eastAsia="Consolas" w:cs="Consolas"/>
+          <w:b/>
+          <w:bCs/>
+          <w:color w:val="548235" w:themeColor="accent6" w:themeShade="BF"/>
+          <w:sz w:val="32"/>
+          <w:szCs w:val="32"/>
+          <w:shd w:val="clear" w:fill="FFFFFF"/>
+          <w:lang w:val="en-US"/>
+        </w:rPr>
+      </w:pPr>
+      <w:r>
+        <w:rPr>
+          <w:rFonts w:hint="default" w:ascii="Consolas" w:hAnsi="Consolas" w:eastAsia="Consolas" w:cs="Consolas"/>
+          <w:b/>
+          <w:bCs/>
+          <w:color w:val="548235" w:themeColor="accent6" w:themeShade="BF"/>
+          <w:sz w:val="32"/>
+          <w:szCs w:val="32"/>
+          <w:shd w:val="clear" w:fill="FFFFFF"/>
+          <w:lang w:val="en-US"/>
+        </w:rPr>
+        <w:t>CLA&gt;Run Configs&gt;application.properties&gt;application.yml</w:t>
+      </w:r>
     </w:p>
     <w:p>
       <w:pPr>
@@ -45617,6 +46475,23 @@
     </w:lvl>
   </w:abstractNum>
   <w:abstractNum w:abstractNumId="5">
+    <w:nsid w:val="F1075DDC"/>
+    <w:multiLevelType w:val="singleLevel"/>
+    <w:tmpl w:val="F1075DDC"/>
+    <w:lvl w:ilvl="0" w:tentative="0">
+      <w:start w:val="1"/>
+      <w:numFmt w:val="decimal"/>
+      <w:lvlText w:val="%1."/>
+      <w:lvlJc w:val="left"/>
+      <w:pPr>
+        <w:tabs>
+          <w:tab w:val="left" w:pos="732"/>
+        </w:tabs>
+        <w:ind w:left="420"/>
+      </w:pPr>
+    </w:lvl>
+  </w:abstractNum>
+  <w:abstractNum w:abstractNumId="6">
     <w:nsid w:val="29E9065B"/>
     <w:multiLevelType w:val="singleLevel"/>
     <w:tmpl w:val="29E9065B"/>
@@ -45637,7 +46512,7 @@
     </w:lvl>
   </w:abstractNum>
   <w:num w:numId="1">
-    <w:abstractNumId w:val="5"/>
+    <w:abstractNumId w:val="6"/>
   </w:num>
   <w:num w:numId="2">
     <w:abstractNumId w:val="0"/>
@@ -45653,6 +46528,9 @@
   </w:num>
   <w:num w:numId="6">
     <w:abstractNumId w:val="3"/>
+  </w:num>
+  <w:num w:numId="7">
+    <w:abstractNumId w:val="5"/>
   </w:num>
 </w:numbering>
 </file>

</xml_diff>

<commit_message>
Added details regarding Spring Profiles
</commit_message>
<xml_diff>
--- a/SpringBoot Journal Application.docx
+++ b/SpringBoot Journal Application.docx
@@ -46106,6 +46106,41 @@
         </w:numPr>
         <w:suppressLineNumbers w:val="0"/>
         <w:spacing w:before="0" w:beforeAutospacing="0" w:after="0" w:afterAutospacing="0"/>
+        <w:ind w:right="0" w:rightChars="0" w:firstLine="538" w:firstLineChars="269"/>
+        <w:jc w:val="left"/>
+        <w:rPr>
+          <w:rFonts w:hint="default" w:ascii="Consolas" w:hAnsi="Consolas" w:eastAsia="Consolas" w:cs="Consolas"/>
+          <w:color w:val="000000"/>
+          <w:sz w:val="20"/>
+          <w:szCs w:val="20"/>
+          <w:shd w:val="clear" w:fill="FFFFFF"/>
+          <w:lang w:val="en-US"/>
+        </w:rPr>
+      </w:pPr>
+      <w:r>
+        <w:rPr>
+          <w:rFonts w:hint="default" w:ascii="Consolas" w:hAnsi="Consolas" w:eastAsia="Consolas"/>
+          <w:color w:val="0000FF"/>
+          <w:sz w:val="20"/>
+          <w:szCs w:val="20"/>
+          <w:shd w:val="clear" w:fill="FFFFFF"/>
+          <w:lang w:val="en-US"/>
+        </w:rPr>
+        <w:t>java -jar my-app.jar --server.port=9090</w:t>
+      </w:r>
+    </w:p>
+    <w:p>
+      <w:pPr>
+        <w:pStyle w:val="8"/>
+        <w:keepNext w:val="0"/>
+        <w:keepLines w:val="0"/>
+        <w:widowControl/>
+        <w:numPr>
+          <w:ilvl w:val="0"/>
+          <w:numId w:val="0"/>
+        </w:numPr>
+        <w:suppressLineNumbers w:val="0"/>
+        <w:spacing w:before="0" w:beforeAutospacing="0" w:after="0" w:afterAutospacing="0"/>
         <w:ind w:right="0" w:rightChars="0"/>
         <w:jc w:val="left"/>
         <w:rPr>
@@ -53723,51 +53758,526 @@
         <w:ind w:left="0" w:right="0"/>
         <w:rPr>
           <w:rFonts w:hint="default" w:ascii="Consolas" w:hAnsi="Consolas" w:eastAsia="Consolas" w:cs="Consolas"/>
-          <w:color w:val="000000"/>
-          <w:sz w:val="20"/>
-          <w:szCs w:val="20"/>
-          <w:shd w:val="clear" w:fill="FFFFFF"/>
-        </w:rPr>
-      </w:pPr>
-    </w:p>
-    <w:p>
-      <w:pPr>
-        <w:pStyle w:val="8"/>
-        <w:keepNext w:val="0"/>
-        <w:keepLines w:val="0"/>
-        <w:widowControl/>
-        <w:suppressLineNumbers w:val="0"/>
-        <w:spacing w:before="0" w:beforeAutospacing="0" w:after="0" w:afterAutospacing="0"/>
-        <w:ind w:left="0" w:right="0"/>
-        <w:rPr>
-          <w:rFonts w:hint="default" w:ascii="Consolas" w:hAnsi="Consolas" w:eastAsia="Consolas" w:cs="Consolas"/>
-          <w:color w:val="000000"/>
-          <w:sz w:val="20"/>
-          <w:szCs w:val="20"/>
-          <w:shd w:val="clear" w:fill="FFFFFF"/>
-        </w:rPr>
-      </w:pPr>
-    </w:p>
-    <w:p>
-      <w:pPr>
-        <w:pStyle w:val="8"/>
-        <w:keepNext w:val="0"/>
-        <w:keepLines w:val="0"/>
-        <w:widowControl/>
-        <w:suppressLineNumbers w:val="0"/>
-        <w:spacing w:before="0" w:beforeAutospacing="0" w:after="0" w:afterAutospacing="0"/>
-        <w:ind w:left="0" w:right="0"/>
-        <w:rPr>
-          <w:rFonts w:hint="default" w:ascii="Consolas" w:hAnsi="Consolas" w:eastAsia="Consolas" w:cs="Consolas"/>
-          <w:color w:val="000000"/>
-          <w:sz w:val="20"/>
-          <w:szCs w:val="20"/>
-          <w:shd w:val="clear" w:fill="FFFFFF"/>
-          <w:lang w:val="en-US"/>
-        </w:rPr>
-      </w:pPr>
+          <w:color w:val="548235" w:themeColor="accent6" w:themeShade="BF"/>
+          <w:sz w:val="44"/>
+          <w:szCs w:val="44"/>
+          <w:shd w:val="clear" w:fill="FFFFFF"/>
+          <w:lang w:val="en-IN"/>
+        </w:rPr>
+      </w:pPr>
+      <w:r>
+        <w:rPr>
+          <w:rFonts w:hint="default" w:ascii="Consolas" w:hAnsi="Consolas" w:eastAsia="Consolas" w:cs="Consolas"/>
+          <w:color w:val="548235" w:themeColor="accent6" w:themeShade="BF"/>
+          <w:sz w:val="44"/>
+          <w:szCs w:val="44"/>
+          <w:shd w:val="clear" w:fill="FFFFFF"/>
+          <w:lang w:val="en-IN"/>
+        </w:rPr>
+        <w:t>Spring Profiles</w:t>
+      </w:r>
+    </w:p>
+    <w:p>
+      <w:pPr>
+        <w:pStyle w:val="8"/>
+        <w:keepNext w:val="0"/>
+        <w:keepLines w:val="0"/>
+        <w:widowControl/>
+        <w:suppressLineNumbers w:val="0"/>
+        <w:spacing w:before="0" w:beforeAutospacing="0" w:after="0" w:afterAutospacing="0"/>
+        <w:ind w:left="0" w:right="0"/>
+        <w:rPr>
+          <w:rFonts w:hint="default" w:ascii="Consolas" w:hAnsi="Consolas" w:eastAsia="Consolas" w:cs="Consolas"/>
+          <w:color w:val="000000"/>
+          <w:sz w:val="20"/>
+          <w:szCs w:val="20"/>
+          <w:shd w:val="clear" w:fill="FFFFFF"/>
+          <w:lang w:val="en-IN"/>
+        </w:rPr>
+      </w:pPr>
+      <w:r>
+        <w:rPr>
+          <w:rFonts w:hint="default" w:ascii="Consolas" w:hAnsi="Consolas" w:eastAsia="Consolas" w:cs="Consolas"/>
+          <w:color w:val="000000"/>
+          <w:sz w:val="20"/>
+          <w:szCs w:val="20"/>
+          <w:shd w:val="clear" w:fill="FFFFFF"/>
+          <w:lang w:val="en-IN"/>
+        </w:rPr>
+        <w:t xml:space="preserve">Development has multiple phases I.e </w:t>
+      </w:r>
+      <w:r>
+        <w:rPr>
+          <w:rFonts w:hint="default" w:ascii="Consolas" w:hAnsi="Consolas" w:eastAsia="Consolas" w:cs="Consolas"/>
+          <w:b/>
+          <w:bCs/>
+          <w:color w:val="2F5597" w:themeColor="accent5" w:themeShade="BF"/>
+          <w:sz w:val="20"/>
+          <w:szCs w:val="20"/>
+          <w:shd w:val="clear" w:fill="FFFFFF"/>
+          <w:lang w:val="en-IN"/>
+        </w:rPr>
+        <w:t>1</w:t>
+      </w:r>
+      <w:r>
+        <w:rPr>
+          <w:rFonts w:hint="default" w:ascii="Consolas" w:hAnsi="Consolas" w:eastAsia="Consolas" w:cs="Consolas"/>
+          <w:b/>
+          <w:bCs/>
+          <w:color w:val="2F5597" w:themeColor="accent5" w:themeShade="BF"/>
+          <w:sz w:val="20"/>
+          <w:szCs w:val="20"/>
+          <w:shd w:val="clear" w:fill="FFFFFF"/>
+          <w:vertAlign w:val="superscript"/>
+          <w:lang w:val="en-IN"/>
+        </w:rPr>
+        <w:t>st</w:t>
+      </w:r>
+      <w:r>
+        <w:rPr>
+          <w:rFonts w:hint="default" w:ascii="Consolas" w:hAnsi="Consolas" w:eastAsia="Consolas" w:cs="Consolas"/>
+          <w:b/>
+          <w:bCs/>
+          <w:color w:val="2F5597" w:themeColor="accent5" w:themeShade="BF"/>
+          <w:sz w:val="20"/>
+          <w:szCs w:val="20"/>
+          <w:shd w:val="clear" w:fill="FFFFFF"/>
+          <w:lang w:val="en-IN"/>
+        </w:rPr>
+        <w:t xml:space="preserve"> we build (development - dev)and 2</w:t>
+      </w:r>
+      <w:r>
+        <w:rPr>
+          <w:rFonts w:hint="default" w:ascii="Consolas" w:hAnsi="Consolas" w:eastAsia="Consolas" w:cs="Consolas"/>
+          <w:b/>
+          <w:bCs/>
+          <w:color w:val="2F5597" w:themeColor="accent5" w:themeShade="BF"/>
+          <w:sz w:val="20"/>
+          <w:szCs w:val="20"/>
+          <w:shd w:val="clear" w:fill="FFFFFF"/>
+          <w:vertAlign w:val="superscript"/>
+          <w:lang w:val="en-IN"/>
+        </w:rPr>
+        <w:t>nd</w:t>
+      </w:r>
+      <w:r>
+        <w:rPr>
+          <w:rFonts w:hint="default" w:ascii="Consolas" w:hAnsi="Consolas" w:eastAsia="Consolas" w:cs="Consolas"/>
+          <w:b/>
+          <w:bCs/>
+          <w:color w:val="2F5597" w:themeColor="accent5" w:themeShade="BF"/>
+          <w:sz w:val="20"/>
+          <w:szCs w:val="20"/>
+          <w:shd w:val="clear" w:fill="FFFFFF"/>
+          <w:lang w:val="en-IN"/>
+        </w:rPr>
+        <w:t xml:space="preserve"> we let the user test what we have built (prod</w:t>
+      </w:r>
       <w:bookmarkStart w:id="0" w:name="_GoBack"/>
       <w:bookmarkEnd w:id="0"/>
+      <w:r>
+        <w:rPr>
+          <w:rFonts w:hint="default" w:ascii="Consolas" w:hAnsi="Consolas" w:eastAsia="Consolas" w:cs="Consolas"/>
+          <w:b/>
+          <w:bCs/>
+          <w:color w:val="2F5597" w:themeColor="accent5" w:themeShade="BF"/>
+          <w:sz w:val="20"/>
+          <w:szCs w:val="20"/>
+          <w:shd w:val="clear" w:fill="FFFFFF"/>
+          <w:lang w:val="en-IN"/>
+        </w:rPr>
+        <w:t>uction - prod)</w:t>
+      </w:r>
+      <w:r>
+        <w:rPr>
+          <w:rFonts w:hint="default" w:ascii="Consolas" w:hAnsi="Consolas" w:eastAsia="Consolas" w:cs="Consolas"/>
+          <w:color w:val="000000"/>
+          <w:sz w:val="20"/>
+          <w:szCs w:val="20"/>
+          <w:shd w:val="clear" w:fill="FFFFFF"/>
+          <w:lang w:val="en-IN"/>
+        </w:rPr>
+        <w:t>.</w:t>
+      </w:r>
+    </w:p>
+    <w:p>
+      <w:pPr>
+        <w:pStyle w:val="8"/>
+        <w:keepNext w:val="0"/>
+        <w:keepLines w:val="0"/>
+        <w:widowControl/>
+        <w:suppressLineNumbers w:val="0"/>
+        <w:spacing w:before="0" w:beforeAutospacing="0" w:after="0" w:afterAutospacing="0"/>
+        <w:ind w:left="0" w:right="0"/>
+        <w:rPr>
+          <w:rFonts w:hint="default" w:ascii="Consolas" w:hAnsi="Consolas" w:eastAsia="Consolas" w:cs="Consolas"/>
+          <w:color w:val="000000"/>
+          <w:sz w:val="20"/>
+          <w:szCs w:val="20"/>
+          <w:shd w:val="clear" w:fill="FFFFFF"/>
+          <w:lang w:val="en-IN"/>
+        </w:rPr>
+      </w:pPr>
+      <w:r>
+        <w:rPr>
+          <w:rFonts w:hint="default" w:ascii="Consolas" w:hAnsi="Consolas" w:eastAsia="Consolas" w:cs="Consolas"/>
+          <w:color w:val="000000"/>
+          <w:sz w:val="20"/>
+          <w:szCs w:val="20"/>
+          <w:shd w:val="clear" w:fill="FFFFFF"/>
+          <w:lang w:val="en-IN"/>
+        </w:rPr>
+        <w:t>In dev, we can check detailed logs but in prod we do not need that. And also dev is flexible to change but not prod. As there can be multiple configs and properties we need to consider, we can use different profiles to manage those configs/properties.</w:t>
+      </w:r>
+    </w:p>
+    <w:p>
+      <w:pPr>
+        <w:pStyle w:val="8"/>
+        <w:keepNext w:val="0"/>
+        <w:keepLines w:val="0"/>
+        <w:widowControl/>
+        <w:suppressLineNumbers w:val="0"/>
+        <w:spacing w:before="0" w:beforeAutospacing="0" w:after="0" w:afterAutospacing="0"/>
+        <w:ind w:left="0" w:right="0"/>
+        <w:rPr>
+          <w:rFonts w:hint="default" w:ascii="Consolas" w:hAnsi="Consolas" w:eastAsia="Consolas" w:cs="Consolas"/>
+          <w:color w:val="000000"/>
+          <w:sz w:val="20"/>
+          <w:szCs w:val="20"/>
+          <w:shd w:val="clear" w:fill="FFFFFF"/>
+          <w:lang w:val="en-IN"/>
+        </w:rPr>
+      </w:pPr>
+      <w:r>
+        <w:rPr>
+          <w:rFonts w:hint="default" w:ascii="Consolas" w:hAnsi="Consolas" w:eastAsia="Consolas" w:cs="Consolas"/>
+          <w:color w:val="000000"/>
+          <w:sz w:val="20"/>
+          <w:szCs w:val="20"/>
+          <w:shd w:val="clear" w:fill="FFFFFF"/>
+          <w:lang w:val="en-IN"/>
+        </w:rPr>
+        <w:t>This can be done by creating multiple application properties/yml file as</w:t>
+      </w:r>
+    </w:p>
+    <w:p>
+      <w:pPr>
+        <w:pStyle w:val="8"/>
+        <w:keepNext w:val="0"/>
+        <w:keepLines w:val="0"/>
+        <w:widowControl/>
+        <w:suppressLineNumbers w:val="0"/>
+        <w:spacing w:before="0" w:beforeAutospacing="0" w:after="0" w:afterAutospacing="0"/>
+        <w:ind w:left="0" w:right="0"/>
+        <w:rPr>
+          <w:rFonts w:hint="default" w:ascii="Consolas" w:hAnsi="Consolas" w:eastAsia="Consolas" w:cs="Consolas"/>
+          <w:b/>
+          <w:bCs/>
+          <w:color w:val="2F5597" w:themeColor="accent5" w:themeShade="BF"/>
+          <w:sz w:val="20"/>
+          <w:szCs w:val="20"/>
+          <w:shd w:val="clear" w:fill="FFFFFF"/>
+          <w:lang w:val="en-IN"/>
+        </w:rPr>
+      </w:pPr>
+      <w:r>
+        <w:rPr>
+          <w:rFonts w:hint="default" w:ascii="Consolas" w:hAnsi="Consolas" w:eastAsia="Consolas" w:cs="Consolas"/>
+          <w:b/>
+          <w:bCs/>
+          <w:color w:val="2F5597" w:themeColor="accent5" w:themeShade="BF"/>
+          <w:sz w:val="20"/>
+          <w:szCs w:val="20"/>
+          <w:shd w:val="clear" w:fill="FFFFFF"/>
+          <w:lang w:val="en-IN"/>
+        </w:rPr>
+        <w:t>application-dev.yml application-prod.properties</w:t>
+      </w:r>
+    </w:p>
+    <w:p>
+      <w:pPr>
+        <w:pStyle w:val="8"/>
+        <w:keepNext w:val="0"/>
+        <w:keepLines w:val="0"/>
+        <w:widowControl/>
+        <w:suppressLineNumbers w:val="0"/>
+        <w:spacing w:before="0" w:beforeAutospacing="0" w:after="0" w:afterAutospacing="0"/>
+        <w:ind w:left="0" w:right="0"/>
+        <w:rPr>
+          <w:rFonts w:hint="default" w:ascii="Consolas" w:hAnsi="Consolas" w:eastAsia="Consolas" w:cs="Consolas"/>
+          <w:color w:val="000000"/>
+          <w:sz w:val="20"/>
+          <w:szCs w:val="20"/>
+          <w:shd w:val="clear" w:fill="FFFFFF"/>
+          <w:lang w:val="en-IN"/>
+        </w:rPr>
+      </w:pPr>
+      <w:r>
+        <w:rPr>
+          <w:rFonts w:hint="default" w:ascii="Consolas" w:hAnsi="Consolas" w:eastAsia="Consolas" w:cs="Consolas"/>
+          <w:color w:val="000000"/>
+          <w:sz w:val="20"/>
+          <w:szCs w:val="20"/>
+          <w:shd w:val="clear" w:fill="FFFFFF"/>
+          <w:lang w:val="en-IN"/>
+        </w:rPr>
+        <w:t>Then in the original application properties file we can set the active profile as</w:t>
+      </w:r>
+    </w:p>
+    <w:p>
+      <w:pPr>
+        <w:pStyle w:val="8"/>
+        <w:keepNext w:val="0"/>
+        <w:keepLines w:val="0"/>
+        <w:widowControl/>
+        <w:suppressLineNumbers w:val="0"/>
+        <w:spacing w:before="0" w:beforeAutospacing="0" w:after="0" w:afterAutospacing="0"/>
+        <w:ind w:left="0" w:right="0"/>
+        <w:rPr>
+          <w:rFonts w:hint="default" w:ascii="Consolas" w:hAnsi="Consolas" w:eastAsia="Consolas" w:cs="Consolas"/>
+          <w:color w:val="BF9000" w:themeColor="accent4" w:themeShade="BF"/>
+          <w:sz w:val="20"/>
+          <w:szCs w:val="20"/>
+          <w:shd w:val="clear" w:fill="FFFFFF"/>
+          <w:lang w:val="en-IN"/>
+        </w:rPr>
+      </w:pPr>
+      <w:r>
+        <w:rPr>
+          <w:rFonts w:hint="default" w:ascii="Consolas" w:hAnsi="Consolas" w:eastAsia="Consolas" w:cs="Consolas"/>
+          <w:color w:val="BF9000" w:themeColor="accent4" w:themeShade="BF"/>
+          <w:sz w:val="20"/>
+          <w:szCs w:val="20"/>
+          <w:shd w:val="clear" w:fill="FFFFFF"/>
+          <w:lang w:val="en-IN"/>
+        </w:rPr>
+        <w:t>spring.active.profile=dev</w:t>
+      </w:r>
+    </w:p>
+    <w:p>
+      <w:pPr>
+        <w:pStyle w:val="8"/>
+        <w:keepNext w:val="0"/>
+        <w:keepLines w:val="0"/>
+        <w:widowControl/>
+        <w:suppressLineNumbers w:val="0"/>
+        <w:spacing w:before="0" w:beforeAutospacing="0" w:after="0" w:afterAutospacing="0"/>
+        <w:ind w:left="0" w:right="0"/>
+        <w:rPr>
+          <w:rFonts w:hint="default" w:ascii="Consolas" w:hAnsi="Consolas" w:eastAsia="Consolas" w:cs="Consolas"/>
+          <w:b/>
+          <w:bCs/>
+          <w:color w:val="BF9000" w:themeColor="accent4" w:themeShade="BF"/>
+          <w:sz w:val="20"/>
+          <w:szCs w:val="20"/>
+          <w:shd w:val="clear" w:fill="FFFFFF"/>
+          <w:lang w:val="en-IN"/>
+        </w:rPr>
+      </w:pPr>
+      <w:r>
+        <w:rPr>
+          <w:rFonts w:hint="default" w:ascii="Consolas" w:hAnsi="Consolas" w:eastAsia="Consolas" w:cs="Consolas"/>
+          <w:b/>
+          <w:bCs/>
+          <w:color w:val="BF9000" w:themeColor="accent4" w:themeShade="BF"/>
+          <w:sz w:val="20"/>
+          <w:szCs w:val="20"/>
+          <w:shd w:val="clear" w:fill="FFFFFF"/>
+          <w:lang w:val="en-IN"/>
+        </w:rPr>
+        <w:t>or</w:t>
+      </w:r>
+    </w:p>
+    <w:p>
+      <w:pPr>
+        <w:pStyle w:val="8"/>
+        <w:keepNext w:val="0"/>
+        <w:keepLines w:val="0"/>
+        <w:widowControl/>
+        <w:suppressLineNumbers w:val="0"/>
+        <w:spacing w:before="0" w:beforeAutospacing="0" w:after="0" w:afterAutospacing="0"/>
+        <w:ind w:left="0" w:right="0"/>
+        <w:rPr>
+          <w:rFonts w:hint="default" w:ascii="Consolas" w:hAnsi="Consolas" w:eastAsia="Consolas" w:cs="Consolas"/>
+          <w:color w:val="BF9000" w:themeColor="accent4" w:themeShade="BF"/>
+          <w:sz w:val="20"/>
+          <w:szCs w:val="20"/>
+          <w:shd w:val="clear" w:fill="FFFFFF"/>
+          <w:lang w:val="en-IN"/>
+        </w:rPr>
+      </w:pPr>
+      <w:r>
+        <w:rPr>
+          <w:rFonts w:hint="default" w:ascii="Consolas" w:hAnsi="Consolas" w:eastAsia="Consolas" w:cs="Consolas"/>
+          <w:color w:val="BF9000" w:themeColor="accent4" w:themeShade="BF"/>
+          <w:sz w:val="20"/>
+          <w:szCs w:val="20"/>
+          <w:shd w:val="clear" w:fill="FFFFFF"/>
+          <w:lang w:val="en-IN"/>
+        </w:rPr>
+        <w:t>spring:</w:t>
+      </w:r>
+    </w:p>
+    <w:p>
+      <w:pPr>
+        <w:pStyle w:val="8"/>
+        <w:keepNext w:val="0"/>
+        <w:keepLines w:val="0"/>
+        <w:widowControl/>
+        <w:suppressLineNumbers w:val="0"/>
+        <w:spacing w:before="0" w:beforeAutospacing="0" w:after="0" w:afterAutospacing="0"/>
+        <w:ind w:left="0" w:right="0"/>
+        <w:rPr>
+          <w:rFonts w:hint="default" w:ascii="Consolas" w:hAnsi="Consolas" w:eastAsia="Consolas" w:cs="Consolas"/>
+          <w:color w:val="BF9000" w:themeColor="accent4" w:themeShade="BF"/>
+          <w:sz w:val="20"/>
+          <w:szCs w:val="20"/>
+          <w:shd w:val="clear" w:fill="FFFFFF"/>
+          <w:lang w:val="en-IN"/>
+        </w:rPr>
+      </w:pPr>
+      <w:r>
+        <w:rPr>
+          <w:rFonts w:hint="default" w:ascii="Consolas" w:hAnsi="Consolas" w:eastAsia="Consolas" w:cs="Consolas"/>
+          <w:color w:val="BF9000" w:themeColor="accent4" w:themeShade="BF"/>
+          <w:sz w:val="20"/>
+          <w:szCs w:val="20"/>
+          <w:shd w:val="clear" w:fill="FFFFFF"/>
+          <w:lang w:val="en-IN"/>
+        </w:rPr>
+        <w:t xml:space="preserve">  active:</w:t>
+      </w:r>
+    </w:p>
+    <w:p>
+      <w:pPr>
+        <w:pStyle w:val="8"/>
+        <w:keepNext w:val="0"/>
+        <w:keepLines w:val="0"/>
+        <w:widowControl/>
+        <w:suppressLineNumbers w:val="0"/>
+        <w:spacing w:before="0" w:beforeAutospacing="0" w:after="0" w:afterAutospacing="0"/>
+        <w:ind w:left="0" w:right="0"/>
+        <w:rPr>
+          <w:rFonts w:hint="default" w:ascii="Consolas" w:hAnsi="Consolas" w:eastAsia="Consolas" w:cs="Consolas"/>
+          <w:color w:val="BF9000" w:themeColor="accent4" w:themeShade="BF"/>
+          <w:sz w:val="20"/>
+          <w:szCs w:val="20"/>
+          <w:shd w:val="clear" w:fill="FFFFFF"/>
+          <w:lang w:val="en-IN"/>
+        </w:rPr>
+      </w:pPr>
+      <w:r>
+        <w:rPr>
+          <w:rFonts w:hint="default" w:ascii="Consolas" w:hAnsi="Consolas" w:eastAsia="Consolas" w:cs="Consolas"/>
+          <w:color w:val="BF9000" w:themeColor="accent4" w:themeShade="BF"/>
+          <w:sz w:val="20"/>
+          <w:szCs w:val="20"/>
+          <w:shd w:val="clear" w:fill="FFFFFF"/>
+          <w:lang w:val="en-IN"/>
+        </w:rPr>
+        <w:t xml:space="preserve">    profile=prod</w:t>
+      </w:r>
+    </w:p>
+    <w:p>
+      <w:pPr>
+        <w:pStyle w:val="6"/>
+        <w:keepNext w:val="0"/>
+        <w:keepLines w:val="0"/>
+        <w:widowControl/>
+        <w:suppressLineNumbers w:val="0"/>
+        <w:ind w:left="0" w:firstLine="0"/>
+        <w:rPr>
+          <w:i w:val="0"/>
+          <w:iCs w:val="0"/>
+          <w:caps w:val="0"/>
+          <w:color w:val="E6E8F0"/>
+          <w:spacing w:val="0"/>
+          <w:sz w:val="16"/>
+          <w:szCs w:val="16"/>
+        </w:rPr>
+      </w:pPr>
+      <w:r>
+        <w:rPr>
+          <w:rFonts w:hint="default" w:ascii="Consolas" w:hAnsi="Consolas" w:eastAsia="Consolas" w:cs="Consolas"/>
+          <w:color w:val="000000"/>
+          <w:sz w:val="20"/>
+          <w:szCs w:val="20"/>
+          <w:shd w:val="clear" w:fill="FFFFFF"/>
+          <w:lang w:val="en-IN"/>
+        </w:rPr>
+        <w:t xml:space="preserve">We can also mark different classes with </w:t>
+      </w:r>
+      <w:r>
+        <w:rPr>
+          <w:rFonts w:hint="default" w:ascii="Consolas" w:hAnsi="Consolas" w:cs="Consolas"/>
+          <w:b/>
+          <w:bCs/>
+          <w:i w:val="0"/>
+          <w:iCs w:val="0"/>
+          <w:caps w:val="0"/>
+          <w:color w:val="385724" w:themeColor="accent6" w:themeShade="80"/>
+          <w:spacing w:val="0"/>
+          <w:sz w:val="16"/>
+          <w:szCs w:val="16"/>
+        </w:rPr>
+        <w:t>@ActiveProfiles({"dev", "integration"})</w:t>
+      </w:r>
+    </w:p>
+    <w:p>
+      <w:pPr>
+        <w:pStyle w:val="8"/>
+        <w:keepNext w:val="0"/>
+        <w:keepLines w:val="0"/>
+        <w:widowControl/>
+        <w:suppressLineNumbers w:val="0"/>
+        <w:spacing w:before="0" w:beforeAutospacing="0" w:after="0" w:afterAutospacing="0"/>
+        <w:ind w:left="0" w:right="0"/>
+        <w:rPr>
+          <w:rFonts w:hint="default" w:ascii="Consolas" w:hAnsi="Consolas" w:eastAsia="Consolas" w:cs="Consolas"/>
+          <w:color w:val="000000"/>
+          <w:sz w:val="20"/>
+          <w:szCs w:val="20"/>
+          <w:shd w:val="clear" w:fill="FFFFFF"/>
+          <w:lang w:val="en-IN"/>
+        </w:rPr>
+      </w:pPr>
+    </w:p>
+    <w:p>
+      <w:pPr>
+        <w:pStyle w:val="8"/>
+        <w:keepNext w:val="0"/>
+        <w:keepLines w:val="0"/>
+        <w:widowControl/>
+        <w:suppressLineNumbers w:val="0"/>
+        <w:spacing w:before="0" w:beforeAutospacing="0" w:after="0" w:afterAutospacing="0"/>
+        <w:ind w:left="0" w:right="0"/>
+        <w:rPr>
+          <w:rFonts w:hint="default" w:ascii="Consolas" w:hAnsi="Consolas" w:eastAsia="Consolas" w:cs="Consolas"/>
+          <w:color w:val="000000"/>
+          <w:sz w:val="20"/>
+          <w:szCs w:val="20"/>
+          <w:shd w:val="clear" w:fill="FFFFFF"/>
+        </w:rPr>
+      </w:pPr>
+    </w:p>
+    <w:p>
+      <w:pPr>
+        <w:pStyle w:val="8"/>
+        <w:keepNext w:val="0"/>
+        <w:keepLines w:val="0"/>
+        <w:widowControl/>
+        <w:suppressLineNumbers w:val="0"/>
+        <w:spacing w:before="0" w:beforeAutospacing="0" w:after="0" w:afterAutospacing="0"/>
+        <w:ind w:left="0" w:right="0"/>
+        <w:rPr>
+          <w:rFonts w:hint="default" w:ascii="Consolas" w:hAnsi="Consolas" w:eastAsia="Consolas" w:cs="Consolas"/>
+          <w:color w:val="000000"/>
+          <w:sz w:val="20"/>
+          <w:szCs w:val="20"/>
+          <w:shd w:val="clear" w:fill="FFFFFF"/>
+          <w:lang w:val="en-US"/>
+        </w:rPr>
+      </w:pPr>
     </w:p>
     <w:p>
       <w:pPr>
@@ -54179,7 +54689,7 @@
     <w:lsdException w:unhideWhenUsed="0" w:uiPriority="0" w:semiHidden="0" w:name="HTML Code"/>
     <w:lsdException w:unhideWhenUsed="0" w:uiPriority="0" w:semiHidden="0" w:name="HTML Definition"/>
     <w:lsdException w:unhideWhenUsed="0" w:uiPriority="0" w:semiHidden="0" w:name="HTML Keyboard"/>
-    <w:lsdException w:unhideWhenUsed="0" w:uiPriority="0" w:semiHidden="0" w:name="HTML Preformatted"/>
+    <w:lsdException w:qFormat="1" w:unhideWhenUsed="0" w:uiPriority="0" w:semiHidden="0" w:name="HTML Preformatted"/>
     <w:lsdException w:unhideWhenUsed="0" w:uiPriority="0" w:semiHidden="0" w:name="HTML Sample"/>
     <w:lsdException w:unhideWhenUsed="0" w:uiPriority="0" w:semiHidden="0" w:name="HTML Typewriter"/>
     <w:lsdException w:unhideWhenUsed="0" w:uiPriority="0" w:semiHidden="0" w:name="HTML Variable"/>
@@ -54389,6 +54899,7 @@
   </w:style>
   <w:style w:type="paragraph" w:styleId="6">
     <w:name w:val="HTML Preformatted"/>
+    <w:qFormat/>
     <w:uiPriority w:val="0"/>
     <w:pPr>
       <w:tabs>

</xml_diff>